<commit_message>
docs: bao cao Bai 08 - phan bai tap trinh bay bang anh ket qua kem giai thich
Co-Authored-By: Claude Opus 5.5 <noreply@anthropic.com>
Claude-Session: https://claude.ai/code/session_01HfRSsX3kWADzWAJKnHW3nE
</commit_message>
<xml_diff>
--- a/BaiTap/Bai08_Multicast/BAI08_2380600371_PhamAnhDuy.docx
+++ b/BaiTap/Bai08_Multicast/BAI08_2380600371_PhamAnhDuy.docx
@@ -3652,71 +3652,12 @@
     <w:p>
       <w:r>
         <w:rPr>
-          <w:b/>
-          <w:i w:val="0"/>
+          <w:b w:val="0"/>
+          <w:i/>
+          <w:sz w:val="22"/>
         </w:rPr>
-        <w:t>Cấu trúc mã nguồn:</w:t>
+        <w:t>Mã nguồn: thư mục BaiTap/Bai08_Multicast/src/bai08 (bt01, bt02, bt03). Tất cả dùng nhóm multicast 224.1.1.1, cổng 4444. Biên dịch: javac -encoding UTF-8 -d out $(find src -name "*.java"); chạy: java -cp out &lt;tên lớp&gt;.</w:t>
       </w:r>
-    </w:p>
-    <w:tbl>
-      <w:tblPr>
-        <w:tblStyle w:val="TableGrid"/>
-        <w:tblW w:type="auto" w:w="0"/>
-        <w:tblLook w:firstColumn="1" w:firstRow="1" w:lastColumn="0" w:lastRow="0" w:noHBand="0" w:noVBand="1" w:val="04A0"/>
-      </w:tblPr>
-      <w:tblGrid>
-        <w:gridCol w:w="9638"/>
-      </w:tblGrid>
-      <w:tr>
-        <w:tc>
-          <w:tcPr>
-            <w:tcW w:type="dxa" w:w="9638"/>
-            <w:shd w:val="clear" w:color="auto" w:fill="F2F2F2"/>
-          </w:tcPr>
-          <w:p>
-            <w:pPr>
-              <w:spacing w:after="0" w:line="240" w:lineRule="auto"/>
-            </w:pPr>
-            <w:r/>
-            <w:r>
-              <w:rPr>
-                <w:rFonts w:ascii="Consolas" w:hAnsi="Consolas" w:eastAsia="Consolas"/>
-                <w:sz w:val="20"/>
-              </w:rPr>
-              <w:t>BaiTap/Bai08_Multicast/src/bai08/</w:t>
-              <w:br/>
-            </w:r>
-            <w:r>
-              <w:rPr>
-                <w:rFonts w:ascii="Consolas" w:hAnsi="Consolas" w:eastAsia="Consolas"/>
-                <w:sz w:val="20"/>
-              </w:rPr>
-              <w:t>├── bt01/  MulticastSender.java, MulticastReceiver.java</w:t>
-              <w:br/>
-            </w:r>
-            <w:r>
-              <w:rPr>
-                <w:rFonts w:ascii="Consolas" w:hAnsi="Consolas" w:eastAsia="Consolas"/>
-                <w:sz w:val="20"/>
-              </w:rPr>
-              <w:t>├── bt02/  MulticastChat.java</w:t>
-              <w:br/>
-            </w:r>
-            <w:r>
-              <w:rPr>
-                <w:rFonts w:ascii="Consolas" w:hAnsi="Consolas" w:eastAsia="Consolas"/>
-                <w:sz w:val="20"/>
-              </w:rPr>
-              <w:t>└── bt03/  FileProtocol.java, FileSender.java, FileReceiver.java</w:t>
-            </w:r>
-          </w:p>
-        </w:tc>
-      </w:tr>
-    </w:tbl>
-    <w:p>
-      <w:pPr>
-        <w:spacing w:after="40"/>
-      </w:pPr>
     </w:p>
     <w:p>
       <w:pPr>
@@ -3740,15 +3681,383 @@
       </w:r>
     </w:p>
     <w:p>
-      <w:pPr>
-        <w:spacing w:after="40" w:before="120"/>
-      </w:pPr>
       <w:r>
         <w:rPr>
           <w:b/>
           <w:i w:val="0"/>
         </w:rPr>
-        <w:t>Thiết kế</w:t>
+        <w:t>Cách hoạt động:</w:t>
+      </w:r>
+      <w:r>
+        <w:rPr>
+          <w:b w:val="0"/>
+          <w:i w:val="0"/>
+        </w:rPr>
+        <w:t xml:space="preserve"> MulticastReceiver tạo MulticastSocket(4444), gọi joinGroup(224.1.1.1) rồi chờ receive(). MulticastSender tạo MulticastSocket, đặt TTL = 1 (chỉ trong LAN), gửi chuỗi UTF-8 tới 224.1.1.1:4444. Khi nhận chuỗi “exit”, máy nhận gọi leaveGroup() và đóng socket.</w:t>
+      </w:r>
+    </w:p>
+    <w:p>
+      <w:r>
+        <w:rPr>
+          <w:b/>
+          <w:i w:val="0"/>
+        </w:rPr>
+        <w:t>Thử nghiệm:</w:t>
+      </w:r>
+      <w:r>
+        <w:rPr>
+          <w:b w:val="0"/>
+          <w:i w:val="0"/>
+        </w:rPr>
+        <w:t xml:space="preserve"> mở 3 cửa sổ MulticastReceiver trước, sau đó chạy MulticastSender 3 lần.</w:t>
+      </w:r>
+    </w:p>
+    <w:p>
+      <w:pPr>
+        <w:spacing w:after="0"/>
+        <w:jc w:val="center"/>
+      </w:pPr>
+      <w:r>
+        <w:drawing>
+          <wp:inline xmlns:a="http://schemas.openxmlformats.org/drawingml/2006/main" xmlns:pic="http://schemas.openxmlformats.org/drawingml/2006/picture">
+            <wp:extent cx="5760000" cy="982167"/>
+            <wp:docPr id="2" name="Picture 2"/>
+            <wp:cNvGraphicFramePr>
+              <a:graphicFrameLocks noChangeAspect="1"/>
+            </wp:cNvGraphicFramePr>
+            <a:graphic>
+              <a:graphicData uri="http://schemas.openxmlformats.org/drawingml/2006/picture">
+                <pic:pic>
+                  <pic:nvPicPr>
+                    <pic:cNvPr id="0" name="bt01_1_wait.png"/>
+                    <pic:cNvPicPr/>
+                  </pic:nvPicPr>
+                  <pic:blipFill>
+                    <a:blip r:embed="rId10"/>
+                    <a:stretch>
+                      <a:fillRect/>
+                    </a:stretch>
+                  </pic:blipFill>
+                  <pic:spPr>
+                    <a:xfrm>
+                      <a:off x="0" y="0"/>
+                      <a:ext cx="5760000" cy="982167"/>
+                    </a:xfrm>
+                    <a:prstGeom prst="rect"/>
+                  </pic:spPr>
+                </pic:pic>
+              </a:graphicData>
+            </a:graphic>
+          </wp:inline>
+        </w:drawing>
+      </w:r>
+    </w:p>
+    <w:p>
+      <w:pPr>
+        <w:spacing w:after="160"/>
+        <w:jc w:val="center"/>
+      </w:pPr>
+      <w:r>
+        <w:rPr>
+          <w:b w:val="0"/>
+          <w:i/>
+          <w:sz w:val="22"/>
+        </w:rPr>
+        <w:t>Hình 1. BT01 – Bước 1: ba máy nhận tham gia nhóm và chờ thông điệp</w:t>
+      </w:r>
+    </w:p>
+    <w:p>
+      <w:pPr>
+        <w:tabs>
+          <w:tab w:pos="454" w:val="left"/>
+        </w:tabs>
+        <w:spacing w:after="40"/>
+        <w:ind w:left="454" w:hanging="283"/>
+      </w:pPr>
+      <w:r>
+        <w:rPr>
+          <w:b w:val="0"/>
+          <w:i w:val="0"/>
+        </w:rPr>
+        <w:t>•</w:t>
+        <w:tab/>
+        <w:t>Cả 3 MulticastReceiver cùng bind cổng 4444 trên một máy mà không báo lỗi “Address already in use”, vì MulticastSocket bật SO_REUSEADDR mặc định.</w:t>
+      </w:r>
+    </w:p>
+    <w:p>
+      <w:pPr>
+        <w:tabs>
+          <w:tab w:pos="454" w:val="left"/>
+        </w:tabs>
+        <w:spacing w:after="40"/>
+        <w:ind w:left="454" w:hanging="283"/>
+      </w:pPr>
+      <w:r>
+        <w:rPr>
+          <w:b w:val="0"/>
+          <w:i w:val="0"/>
+        </w:rPr>
+        <w:t>•</w:t>
+        <w:tab/>
+        <w:t>Dòng “Da tham gia nhom 224.1.1.1:4444” cho biết joinGroup() đã thành công; chương trình dừng ở receive() để chờ gói tin.</w:t>
+      </w:r>
+    </w:p>
+    <w:p>
+      <w:pPr>
+        <w:spacing w:after="80"/>
+      </w:pPr>
+    </w:p>
+    <w:p>
+      <w:pPr>
+        <w:spacing w:after="0"/>
+        <w:jc w:val="center"/>
+      </w:pPr>
+      <w:r>
+        <w:drawing>
+          <wp:inline xmlns:a="http://schemas.openxmlformats.org/drawingml/2006/main" xmlns:pic="http://schemas.openxmlformats.org/drawingml/2006/picture">
+            <wp:extent cx="3960000" cy="1208618"/>
+            <wp:docPr id="3" name="Picture 3"/>
+            <wp:cNvGraphicFramePr>
+              <a:graphicFrameLocks noChangeAspect="1"/>
+            </wp:cNvGraphicFramePr>
+            <a:graphic>
+              <a:graphicData uri="http://schemas.openxmlformats.org/drawingml/2006/picture">
+                <pic:pic>
+                  <pic:nvPicPr>
+                    <pic:cNvPr id="0" name="bt01_2_sender.png"/>
+                    <pic:cNvPicPr/>
+                  </pic:nvPicPr>
+                  <pic:blipFill>
+                    <a:blip r:embed="rId11"/>
+                    <a:stretch>
+                      <a:fillRect/>
+                    </a:stretch>
+                  </pic:blipFill>
+                  <pic:spPr>
+                    <a:xfrm>
+                      <a:off x="0" y="0"/>
+                      <a:ext cx="3960000" cy="1208618"/>
+                    </a:xfrm>
+                    <a:prstGeom prst="rect"/>
+                  </pic:spPr>
+                </pic:pic>
+              </a:graphicData>
+            </a:graphic>
+          </wp:inline>
+        </w:drawing>
+      </w:r>
+    </w:p>
+    <w:p>
+      <w:pPr>
+        <w:spacing w:after="160"/>
+        <w:jc w:val="center"/>
+      </w:pPr>
+      <w:r>
+        <w:rPr>
+          <w:b w:val="0"/>
+          <w:i/>
+          <w:sz w:val="22"/>
+        </w:rPr>
+        <w:t>Hình 2. BT01 – Bước 2: máy gửi phát 3 thông điệp vào nhóm</w:t>
+      </w:r>
+    </w:p>
+    <w:p>
+      <w:pPr>
+        <w:tabs>
+          <w:tab w:pos="454" w:val="left"/>
+        </w:tabs>
+        <w:spacing w:after="40"/>
+        <w:ind w:left="454" w:hanging="283"/>
+      </w:pPr>
+      <w:r>
+        <w:rPr>
+          <w:b w:val="0"/>
+          <w:i w:val="0"/>
+        </w:rPr>
+        <w:t>•</w:t>
+        <w:tab/>
+        <w:t>Lần 1 không truyền tham số nên gửi nội dung mặc định “Xin chào!”.</w:t>
+      </w:r>
+    </w:p>
+    <w:p>
+      <w:pPr>
+        <w:tabs>
+          <w:tab w:pos="454" w:val="left"/>
+        </w:tabs>
+        <w:spacing w:after="40"/>
+        <w:ind w:left="454" w:hanging="283"/>
+      </w:pPr>
+      <w:r>
+        <w:rPr>
+          <w:b w:val="0"/>
+          <w:i w:val="0"/>
+        </w:rPr>
+        <w:t>•</w:t>
+        <w:tab/>
+        <w:t>Lần 2 gửi chuỗi tiếng Việt có dấu “Lập trình mạng - Bài 08” để kiểm tra mã hoá UTF-8.</w:t>
+      </w:r>
+    </w:p>
+    <w:p>
+      <w:pPr>
+        <w:tabs>
+          <w:tab w:pos="454" w:val="left"/>
+        </w:tabs>
+        <w:spacing w:after="40"/>
+        <w:ind w:left="454" w:hanging="283"/>
+      </w:pPr>
+      <w:r>
+        <w:rPr>
+          <w:b w:val="0"/>
+          <w:i w:val="0"/>
+        </w:rPr>
+        <w:t>•</w:t>
+        <w:tab/>
+        <w:t>Lần 3 gửi “exit” để yêu cầu các máy nhận rời nhóm.</w:t>
+      </w:r>
+    </w:p>
+    <w:p>
+      <w:pPr>
+        <w:tabs>
+          <w:tab w:pos="454" w:val="left"/>
+        </w:tabs>
+        <w:spacing w:after="40"/>
+        <w:ind w:left="454" w:hanging="283"/>
+      </w:pPr>
+      <w:r>
+        <w:rPr>
+          <w:b w:val="0"/>
+          <w:i w:val="0"/>
+        </w:rPr>
+        <w:t>•</w:t>
+        <w:tab/>
+        <w:t xml:space="preserve">Máy gửi chỉ gửi </w:t>
+      </w:r>
+      <w:r>
+        <w:rPr>
+          <w:b/>
+          <w:i w:val="0"/>
+        </w:rPr>
+        <w:t>một</w:t>
+      </w:r>
+      <w:r>
+        <w:rPr>
+          <w:b w:val="0"/>
+          <w:i w:val="0"/>
+        </w:rPr>
+        <w:t xml:space="preserve"> gói cho mỗi thông điệp, không cần biết có bao nhiêu máy nhận.</w:t>
+      </w:r>
+    </w:p>
+    <w:p>
+      <w:pPr>
+        <w:spacing w:after="80"/>
+      </w:pPr>
+    </w:p>
+    <w:p>
+      <w:pPr>
+        <w:spacing w:after="0"/>
+        <w:jc w:val="center"/>
+      </w:pPr>
+      <w:r>
+        <w:drawing>
+          <wp:inline xmlns:a="http://schemas.openxmlformats.org/drawingml/2006/main" xmlns:pic="http://schemas.openxmlformats.org/drawingml/2006/picture">
+            <wp:extent cx="5760000" cy="1800639"/>
+            <wp:docPr id="4" name="Picture 4"/>
+            <wp:cNvGraphicFramePr>
+              <a:graphicFrameLocks noChangeAspect="1"/>
+            </wp:cNvGraphicFramePr>
+            <a:graphic>
+              <a:graphicData uri="http://schemas.openxmlformats.org/drawingml/2006/picture">
+                <pic:pic>
+                  <pic:nvPicPr>
+                    <pic:cNvPr id="0" name="bt01_3_recv.png"/>
+                    <pic:cNvPicPr/>
+                  </pic:nvPicPr>
+                  <pic:blipFill>
+                    <a:blip r:embed="rId12"/>
+                    <a:stretch>
+                      <a:fillRect/>
+                    </a:stretch>
+                  </pic:blipFill>
+                  <pic:spPr>
+                    <a:xfrm>
+                      <a:off x="0" y="0"/>
+                      <a:ext cx="5760000" cy="1800639"/>
+                    </a:xfrm>
+                    <a:prstGeom prst="rect"/>
+                  </pic:spPr>
+                </pic:pic>
+              </a:graphicData>
+            </a:graphic>
+          </wp:inline>
+        </w:drawing>
+      </w:r>
+    </w:p>
+    <w:p>
+      <w:pPr>
+        <w:spacing w:after="160"/>
+        <w:jc w:val="center"/>
+      </w:pPr>
+      <w:r>
+        <w:rPr>
+          <w:b w:val="0"/>
+          <w:i/>
+          <w:sz w:val="22"/>
+        </w:rPr>
+        <w:t>Hình 3. BT01 – Bước 3: cả ba máy nhận đều nhận đủ thông điệp rồi rời nhóm</w:t>
+      </w:r>
+    </w:p>
+    <w:p>
+      <w:pPr>
+        <w:tabs>
+          <w:tab w:pos="454" w:val="left"/>
+        </w:tabs>
+        <w:spacing w:after="40"/>
+        <w:ind w:left="454" w:hanging="283"/>
+      </w:pPr>
+      <w:r>
+        <w:rPr>
+          <w:b w:val="0"/>
+          <w:i w:val="0"/>
+        </w:rPr>
+        <w:t>•</w:t>
+        <w:tab/>
+        <w:t>Mỗi máy nhận in đủ 3 thông điệp, đúng nội dung và thứ tự. Tiếng Việt hiển thị đúng vì cả hai bên dùng UTF-8.</w:t>
+      </w:r>
+    </w:p>
+    <w:p>
+      <w:pPr>
+        <w:tabs>
+          <w:tab w:pos="454" w:val="left"/>
+        </w:tabs>
+        <w:spacing w:after="40"/>
+        <w:ind w:left="454" w:hanging="283"/>
+      </w:pPr>
+      <w:r>
+        <w:rPr>
+          <w:b w:val="0"/>
+          <w:i w:val="0"/>
+        </w:rPr>
+        <w:t>•</w:t>
+        <w:tab/>
+        <w:t>Địa chỉ 192.0.2.2 và cổng nguồn (60285, 53829, 54026) lấy từ packet.getAddress()/getPort(). Mỗi lần chạy, Sender dùng một cổng nguồn ngẫu nhiên khác nhau.</w:t>
+      </w:r>
+    </w:p>
+    <w:p>
+      <w:pPr>
+        <w:tabs>
+          <w:tab w:pos="454" w:val="left"/>
+        </w:tabs>
+        <w:spacing w:after="40"/>
+        <w:ind w:left="454" w:hanging="283"/>
+      </w:pPr>
+      <w:r>
+        <w:rPr>
+          <w:b w:val="0"/>
+          <w:i w:val="0"/>
+        </w:rPr>
+        <w:t>•</w:t>
+        <w:tab/>
+        <w:t>Khi nhận “exit”, chương trình gọi leaveGroup() và in “Da roi nhom 224.1.1.1. Ket thuc.”.</w:t>
       </w:r>
     </w:p>
     <w:p>
@@ -3772,14 +4081,529 @@
           <w:b/>
           <w:i w:val="0"/>
         </w:rPr>
-        <w:t>MulticastSender:</w:t>
+        <w:t>Kết luận:</w:t>
       </w:r>
       <w:r>
         <w:rPr>
           <w:b w:val="0"/>
           <w:i w:val="0"/>
         </w:rPr>
-        <w:t xml:space="preserve"> tạo MulticastSocket, đặt TTL = 1 (chỉ trong LAN), mã hoá chuỗi bằng UTF-8 (gửi đúng tiếng Việt), gửi tới 224.1.1.1:4444. Nội dung mặc định “Xin chào!”, có thể truyền nội dung khác qua tham số dòng lệnh.</w:t>
+        <w:t xml:space="preserve"> một lần gửi, nhiều máy cùng nhận; đáp ứng đủ yêu cầu của bài.</w:t>
+      </w:r>
+    </w:p>
+    <w:p>
+      <w:pPr>
+        <w:spacing w:after="80"/>
+      </w:pPr>
+    </w:p>
+    <w:p>
+      <w:pPr>
+        <w:spacing w:after="80" w:before="160"/>
+      </w:pPr>
+      <w:r>
+        <w:rPr>
+          <w:b/>
+          <w:color w:val="C00000"/>
+        </w:rPr>
+        <w:t>▪  BAI08_BT02:</w:t>
+      </w:r>
+    </w:p>
+    <w:p>
+      <w:r>
+        <w:rPr>
+          <w:b w:val="0"/>
+          <w:i/>
+        </w:rPr>
+        <w:t>Xây dựng ứng dụng Chat nhóm bằng Multicast.</w:t>
+      </w:r>
+    </w:p>
+    <w:p>
+      <w:r>
+        <w:rPr>
+          <w:b/>
+          <w:i w:val="0"/>
+        </w:rPr>
+        <w:t>Cách hoạt động:</w:t>
+      </w:r>
+      <w:r>
+        <w:rPr>
+          <w:b w:val="0"/>
+          <w:i w:val="0"/>
+        </w:rPr>
+        <w:t xml:space="preserve"> mỗi cửa sổ chat là một thành viên. Mỗi cửa sổ dùng một MulticastSocket đã joinGroup() để vừa gửi vừa nhận. Một luồng riêng lặp receive() để nhận tin, một luồng riêng khác thực hiện send() để giao diện không bị treo. Giao diện được cập nhật qua SwingUtilities.invokeLater(). Mỗi tin nhắn có dạng LOẠI|mãClient|tên|nộiDung (LOẠI là JOIN, MSG hoặc LEAVE).</w:t>
+      </w:r>
+    </w:p>
+    <w:p>
+      <w:r>
+        <w:rPr>
+          <w:b/>
+          <w:i w:val="0"/>
+        </w:rPr>
+        <w:t>Thử nghiệm:</w:t>
+      </w:r>
+      <w:r>
+        <w:rPr>
+          <w:b w:val="0"/>
+          <w:i w:val="0"/>
+        </w:rPr>
+        <w:t xml:space="preserve"> mở 3 cửa sổ với tên Duy, Hùng, Đức trên cùng một máy.</w:t>
+      </w:r>
+    </w:p>
+    <w:p>
+      <w:pPr>
+        <w:spacing w:after="0"/>
+        <w:jc w:val="center"/>
+      </w:pPr>
+      <w:r>
+        <w:drawing>
+          <wp:inline xmlns:a="http://schemas.openxmlformats.org/drawingml/2006/main" xmlns:pic="http://schemas.openxmlformats.org/drawingml/2006/picture">
+            <wp:extent cx="6120000" cy="2522748"/>
+            <wp:docPr id="5" name="Picture 5"/>
+            <wp:cNvGraphicFramePr>
+              <a:graphicFrameLocks noChangeAspect="1"/>
+            </wp:cNvGraphicFramePr>
+            <a:graphic>
+              <a:graphicData uri="http://schemas.openxmlformats.org/drawingml/2006/picture">
+                <pic:pic>
+                  <pic:nvPicPr>
+                    <pic:cNvPr id="0" name="bt02_1_start.png"/>
+                    <pic:cNvPicPr/>
+                  </pic:nvPicPr>
+                  <pic:blipFill>
+                    <a:blip r:embed="rId13"/>
+                    <a:stretch>
+                      <a:fillRect/>
+                    </a:stretch>
+                  </pic:blipFill>
+                  <pic:spPr>
+                    <a:xfrm>
+                      <a:off x="0" y="0"/>
+                      <a:ext cx="6120000" cy="2522748"/>
+                    </a:xfrm>
+                    <a:prstGeom prst="rect"/>
+                  </pic:spPr>
+                </pic:pic>
+              </a:graphicData>
+            </a:graphic>
+          </wp:inline>
+        </w:drawing>
+      </w:r>
+    </w:p>
+    <w:p>
+      <w:pPr>
+        <w:spacing w:after="160"/>
+        <w:jc w:val="center"/>
+      </w:pPr>
+      <w:r>
+        <w:rPr>
+          <w:b w:val="0"/>
+          <w:i/>
+          <w:sz w:val="22"/>
+        </w:rPr>
+        <w:t>Hình 4. BT02 – Bước 1: giao diện khi khởi động</w:t>
+      </w:r>
+    </w:p>
+    <w:p>
+      <w:pPr>
+        <w:tabs>
+          <w:tab w:pos="454" w:val="left"/>
+        </w:tabs>
+        <w:spacing w:after="40"/>
+        <w:ind w:left="454" w:hanging="283"/>
+      </w:pPr>
+      <w:r>
+        <w:rPr>
+          <w:b w:val="0"/>
+          <w:i w:val="0"/>
+        </w:rPr>
+        <w:t>•</w:t>
+        <w:tab/>
+        <w:t>Giao diện theo mẫu đề bài: Group ID (224.1.1.1), Port (4444), Username, nút Send bên trái ô nhập tin, vùng hiển thị nội dung nhóm chat bên dưới.</w:t>
+      </w:r>
+    </w:p>
+    <w:p>
+      <w:pPr>
+        <w:tabs>
+          <w:tab w:pos="454" w:val="left"/>
+        </w:tabs>
+        <w:spacing w:after="40"/>
+        <w:ind w:left="454" w:hanging="283"/>
+      </w:pPr>
+      <w:r>
+        <w:rPr>
+          <w:b w:val="0"/>
+          <w:i w:val="0"/>
+        </w:rPr>
+        <w:t>•</w:t>
+        <w:tab/>
+        <w:t xml:space="preserve">Có thêm nút </w:t>
+      </w:r>
+      <w:r>
+        <w:rPr>
+          <w:b/>
+          <w:i w:val="0"/>
+        </w:rPr>
+        <w:t>Tham gia</w:t>
+      </w:r>
+      <w:r>
+        <w:rPr>
+          <w:b w:val="0"/>
+          <w:i w:val="0"/>
+        </w:rPr>
+        <w:t xml:space="preserve"> để chọn nhóm và cổng trước khi chat. Nút Send bị khoá cho đến khi tham gia nhóm.</w:t>
+      </w:r>
+    </w:p>
+    <w:p>
+      <w:pPr>
+        <w:spacing w:after="80"/>
+      </w:pPr>
+    </w:p>
+    <w:p>
+      <w:pPr>
+        <w:spacing w:after="0"/>
+        <w:jc w:val="center"/>
+      </w:pPr>
+      <w:r>
+        <w:drawing>
+          <wp:inline xmlns:a="http://schemas.openxmlformats.org/drawingml/2006/main" xmlns:pic="http://schemas.openxmlformats.org/drawingml/2006/picture">
+            <wp:extent cx="6120000" cy="2522748"/>
+            <wp:docPr id="6" name="Picture 6"/>
+            <wp:cNvGraphicFramePr>
+              <a:graphicFrameLocks noChangeAspect="1"/>
+            </wp:cNvGraphicFramePr>
+            <a:graphic>
+              <a:graphicData uri="http://schemas.openxmlformats.org/drawingml/2006/picture">
+                <pic:pic>
+                  <pic:nvPicPr>
+                    <pic:cNvPr id="0" name="bt02_2_join.png"/>
+                    <pic:cNvPicPr/>
+                  </pic:nvPicPr>
+                  <pic:blipFill>
+                    <a:blip r:embed="rId14"/>
+                    <a:stretch>
+                      <a:fillRect/>
+                    </a:stretch>
+                  </pic:blipFill>
+                  <pic:spPr>
+                    <a:xfrm>
+                      <a:off x="0" y="0"/>
+                      <a:ext cx="6120000" cy="2522748"/>
+                    </a:xfrm>
+                    <a:prstGeom prst="rect"/>
+                  </pic:spPr>
+                </pic:pic>
+              </a:graphicData>
+            </a:graphic>
+          </wp:inline>
+        </w:drawing>
+      </w:r>
+    </w:p>
+    <w:p>
+      <w:pPr>
+        <w:spacing w:after="160"/>
+        <w:jc w:val="center"/>
+      </w:pPr>
+      <w:r>
+        <w:rPr>
+          <w:b w:val="0"/>
+          <w:i/>
+          <w:sz w:val="22"/>
+        </w:rPr>
+        <w:t>Hình 5. BT02 – Bước 2: ba thành viên lần lượt tham gia nhóm</w:t>
+      </w:r>
+    </w:p>
+    <w:p>
+      <w:pPr>
+        <w:tabs>
+          <w:tab w:pos="454" w:val="left"/>
+        </w:tabs>
+        <w:spacing w:after="40"/>
+        <w:ind w:left="454" w:hanging="283"/>
+      </w:pPr>
+      <w:r>
+        <w:rPr>
+          <w:b w:val="0"/>
+          <w:i w:val="0"/>
+        </w:rPr>
+        <w:t>•</w:t>
+        <w:tab/>
+        <w:t>Khi bấm Tham gia, chương trình gọi joinGroup() và gửi gói JOIN vào nhóm. Các ô Group ID, Port, Username bị khoá, nút đổi thành “Rời nhóm”.</w:t>
+      </w:r>
+    </w:p>
+    <w:p>
+      <w:pPr>
+        <w:tabs>
+          <w:tab w:pos="454" w:val="left"/>
+        </w:tabs>
+        <w:spacing w:after="40"/>
+        <w:ind w:left="454" w:hanging="283"/>
+      </w:pPr>
+      <w:r>
+        <w:rPr>
+          <w:b w:val="0"/>
+          <w:i w:val="0"/>
+        </w:rPr>
+        <w:t>•</w:t>
+        <w:tab/>
+        <w:t>Cửa sổ của Duy (vào đầu tiên) thấy thông báo Hùng và Đức tham gia. Cửa sổ của Đức (vào cuối) chỉ thấy tin từ lúc mình tham gia: multicast không lưu tin cũ, đúng với lý thuyết.</w:t>
+      </w:r>
+    </w:p>
+    <w:p>
+      <w:pPr>
+        <w:tabs>
+          <w:tab w:pos="454" w:val="left"/>
+        </w:tabs>
+        <w:spacing w:after="40"/>
+        <w:ind w:left="454" w:hanging="283"/>
+      </w:pPr>
+      <w:r>
+        <w:rPr>
+          <w:b w:val="0"/>
+          <w:i w:val="0"/>
+        </w:rPr>
+        <w:t>•</w:t>
+        <w:tab/>
+        <w:t>Dòng có chữ “(bạn)” là tin của chính mình, nhận lại nhờ bật IP_MULTICAST_LOOP. Mã client ngẫu nhiên giúp phân biệt 3 cửa sổ dù cùng một máy.</w:t>
+      </w:r>
+    </w:p>
+    <w:p>
+      <w:pPr>
+        <w:spacing w:after="80"/>
+      </w:pPr>
+    </w:p>
+    <w:p>
+      <w:pPr>
+        <w:spacing w:after="0"/>
+        <w:jc w:val="center"/>
+      </w:pPr>
+      <w:r>
+        <w:drawing>
+          <wp:inline xmlns:a="http://schemas.openxmlformats.org/drawingml/2006/main" xmlns:pic="http://schemas.openxmlformats.org/drawingml/2006/picture">
+            <wp:extent cx="6120000" cy="2522748"/>
+            <wp:docPr id="7" name="Picture 7"/>
+            <wp:cNvGraphicFramePr>
+              <a:graphicFrameLocks noChangeAspect="1"/>
+            </wp:cNvGraphicFramePr>
+            <a:graphic>
+              <a:graphicData uri="http://schemas.openxmlformats.org/drawingml/2006/picture">
+                <pic:pic>
+                  <pic:nvPicPr>
+                    <pic:cNvPr id="0" name="bt02_3_chat.png"/>
+                    <pic:cNvPicPr/>
+                  </pic:nvPicPr>
+                  <pic:blipFill>
+                    <a:blip r:embed="rId15"/>
+                    <a:stretch>
+                      <a:fillRect/>
+                    </a:stretch>
+                  </pic:blipFill>
+                  <pic:spPr>
+                    <a:xfrm>
+                      <a:off x="0" y="0"/>
+                      <a:ext cx="6120000" cy="2522748"/>
+                    </a:xfrm>
+                    <a:prstGeom prst="rect"/>
+                  </pic:spPr>
+                </pic:pic>
+              </a:graphicData>
+            </a:graphic>
+          </wp:inline>
+        </w:drawing>
+      </w:r>
+    </w:p>
+    <w:p>
+      <w:pPr>
+        <w:spacing w:after="160"/>
+        <w:jc w:val="center"/>
+      </w:pPr>
+      <w:r>
+        <w:rPr>
+          <w:b w:val="0"/>
+          <w:i/>
+          <w:sz w:val="22"/>
+        </w:rPr>
+        <w:t>Hình 6. BT02 – Bước 3: các thành viên chat với nhau</w:t>
+      </w:r>
+    </w:p>
+    <w:p>
+      <w:pPr>
+        <w:tabs>
+          <w:tab w:pos="454" w:val="left"/>
+        </w:tabs>
+        <w:spacing w:after="40"/>
+        <w:ind w:left="454" w:hanging="283"/>
+      </w:pPr>
+      <w:r>
+        <w:rPr>
+          <w:b w:val="0"/>
+          <w:i w:val="0"/>
+        </w:rPr>
+        <w:t>•</w:t>
+        <w:tab/>
+        <w:t xml:space="preserve">Tin nhắn của Duy, Hùng, Đức hiển thị ở </w:t>
+      </w:r>
+      <w:r>
+        <w:rPr>
+          <w:b/>
+          <w:i w:val="0"/>
+        </w:rPr>
+        <w:t>cả 3 cửa sổ</w:t>
+      </w:r>
+      <w:r>
+        <w:rPr>
+          <w:b w:val="0"/>
+          <w:i w:val="0"/>
+        </w:rPr>
+        <w:t>, kèm giờ nhận và tên người gửi.</w:t>
+      </w:r>
+    </w:p>
+    <w:p>
+      <w:pPr>
+        <w:tabs>
+          <w:tab w:pos="454" w:val="left"/>
+        </w:tabs>
+        <w:spacing w:after="40"/>
+        <w:ind w:left="454" w:hanging="283"/>
+      </w:pPr>
+      <w:r>
+        <w:rPr>
+          <w:b w:val="0"/>
+          <w:i w:val="0"/>
+        </w:rPr>
+        <w:t>•</w:t>
+        <w:tab/>
+        <w:t>Tin cuối chứa ký tự “|” (trùng ký tự phân tách của giao thức) vẫn hiển thị đúng, vì chương trình chỉ tách 4 phần đầu (split("\\|", 4)).</w:t>
+      </w:r>
+    </w:p>
+    <w:p>
+      <w:pPr>
+        <w:tabs>
+          <w:tab w:pos="454" w:val="left"/>
+        </w:tabs>
+        <w:spacing w:after="40"/>
+        <w:ind w:left="454" w:hanging="283"/>
+      </w:pPr>
+      <w:r>
+        <w:rPr>
+          <w:b w:val="0"/>
+          <w:i w:val="0"/>
+        </w:rPr>
+        <w:t>•</w:t>
+        <w:tab/>
+        <w:t>Cửa sổ của Đức đang soạn “Đang soạn tin...” mà vẫn nhận tin mới: gửi và nhận chạy song song, không chặn nhau.</w:t>
+      </w:r>
+    </w:p>
+    <w:p>
+      <w:pPr>
+        <w:spacing w:after="80"/>
+      </w:pPr>
+    </w:p>
+    <w:p>
+      <w:pPr>
+        <w:spacing w:after="0"/>
+        <w:jc w:val="center"/>
+      </w:pPr>
+      <w:r>
+        <w:drawing>
+          <wp:inline xmlns:a="http://schemas.openxmlformats.org/drawingml/2006/main" xmlns:pic="http://schemas.openxmlformats.org/drawingml/2006/picture">
+            <wp:extent cx="6120000" cy="2522748"/>
+            <wp:docPr id="8" name="Picture 8"/>
+            <wp:cNvGraphicFramePr>
+              <a:graphicFrameLocks noChangeAspect="1"/>
+            </wp:cNvGraphicFramePr>
+            <a:graphic>
+              <a:graphicData uri="http://schemas.openxmlformats.org/drawingml/2006/picture">
+                <pic:pic>
+                  <pic:nvPicPr>
+                    <pic:cNvPr id="0" name="bt02_4_leave.png"/>
+                    <pic:cNvPicPr/>
+                  </pic:nvPicPr>
+                  <pic:blipFill>
+                    <a:blip r:embed="rId16"/>
+                    <a:stretch>
+                      <a:fillRect/>
+                    </a:stretch>
+                  </pic:blipFill>
+                  <pic:spPr>
+                    <a:xfrm>
+                      <a:off x="0" y="0"/>
+                      <a:ext cx="6120000" cy="2522748"/>
+                    </a:xfrm>
+                    <a:prstGeom prst="rect"/>
+                  </pic:spPr>
+                </pic:pic>
+              </a:graphicData>
+            </a:graphic>
+          </wp:inline>
+        </w:drawing>
+      </w:r>
+    </w:p>
+    <w:p>
+      <w:pPr>
+        <w:spacing w:after="160"/>
+        <w:jc w:val="center"/>
+      </w:pPr>
+      <w:r>
+        <w:rPr>
+          <w:b w:val="0"/>
+          <w:i/>
+          <w:sz w:val="22"/>
+        </w:rPr>
+        <w:t>Hình 7. BT02 – Bước 4: một thành viên rời nhóm</w:t>
+      </w:r>
+    </w:p>
+    <w:p>
+      <w:pPr>
+        <w:tabs>
+          <w:tab w:pos="454" w:val="left"/>
+        </w:tabs>
+        <w:spacing w:after="40"/>
+        <w:ind w:left="454" w:hanging="283"/>
+      </w:pPr>
+      <w:r>
+        <w:rPr>
+          <w:b w:val="0"/>
+          <w:i w:val="0"/>
+        </w:rPr>
+        <w:t>•</w:t>
+        <w:tab/>
+        <w:t>Đức bấm “Rời nhóm”: chương trình gửi gói LEAVE, gọi leaveGroup() rồi close(). Duy và Hùng nhận thông báo “Đức đã rời nhóm”.</w:t>
+      </w:r>
+    </w:p>
+    <w:p>
+      <w:pPr>
+        <w:tabs>
+          <w:tab w:pos="454" w:val="left"/>
+        </w:tabs>
+        <w:spacing w:after="40"/>
+        <w:ind w:left="454" w:hanging="283"/>
+      </w:pPr>
+      <w:r>
+        <w:rPr>
+          <w:b w:val="0"/>
+          <w:i w:val="0"/>
+        </w:rPr>
+        <w:t>•</w:t>
+        <w:tab/>
+        <w:t>Tin Duy gửi sau đó (“Đức vừa rời nhóm…”) chỉ xuất hiện ở cửa sổ Duy và Hùng; cửa sổ của Đức không nhận được nữa.</w:t>
+      </w:r>
+    </w:p>
+    <w:p>
+      <w:pPr>
+        <w:tabs>
+          <w:tab w:pos="454" w:val="left"/>
+        </w:tabs>
+        <w:spacing w:after="40"/>
+        <w:ind w:left="454" w:hanging="283"/>
+      </w:pPr>
+      <w:r>
+        <w:rPr>
+          <w:b w:val="0"/>
+          <w:i w:val="0"/>
+        </w:rPr>
+        <w:t>•</w:t>
+        <w:tab/>
+        <w:t>Cửa sổ của Đức mở lại các ô nhập và nút “Tham gia”, có thể tham gia lại nhóm khác.</w:t>
       </w:r>
     </w:p>
     <w:p>
@@ -3803,489 +4627,20 @@
           <w:b/>
           <w:i w:val="0"/>
         </w:rPr>
-        <w:t>MulticastReceiver:</w:t>
+        <w:t>Kết luận:</w:t>
       </w:r>
       <w:r>
         <w:rPr>
           <w:b w:val="0"/>
           <w:i w:val="0"/>
         </w:rPr>
-        <w:t xml:space="preserve"> tạo MulticastSocket(4444), joinGroup(), lặp receive() và in nội dung cùng địa chỉ máy gửi; khi nhận chuỗi “exit” thì leaveGroup() và đóng socket (try-with-resources).</w:t>
+        <w:t xml:space="preserve"> nhiều máy gửi và nhận đồng thời trong cùng một nhóm; tham gia và rời nhóm đều hoạt động đúng.</w:t>
       </w:r>
     </w:p>
     <w:p>
       <w:pPr>
-        <w:tabs>
-          <w:tab w:pos="454" w:val="left"/>
-        </w:tabs>
-        <w:spacing w:after="40"/>
-        <w:ind w:left="454" w:hanging="283"/>
+        <w:spacing w:after="80"/>
       </w:pPr>
-      <w:r>
-        <w:rPr>
-          <w:b w:val="0"/>
-          <w:i w:val="0"/>
-        </w:rPr>
-        <w:t>•</w:t>
-        <w:tab/>
-        <w:t>Nhiều receiver cùng máy vẫn bind được cổng 4444 vì MulticastSocket bật SO_REUSEADDR mặc định.</w:t>
-      </w:r>
-    </w:p>
-    <w:p>
-      <w:pPr>
-        <w:spacing w:after="40" w:before="120"/>
-      </w:pPr>
-      <w:r>
-        <w:rPr>
-          <w:b/>
-          <w:i w:val="0"/>
-        </w:rPr>
-        <w:t>Mã nguồn chính</w:t>
-      </w:r>
-    </w:p>
-    <w:tbl>
-      <w:tblPr>
-        <w:tblStyle w:val="TableGrid"/>
-        <w:tblW w:type="auto" w:w="0"/>
-        <w:tblLook w:firstColumn="1" w:firstRow="1" w:lastColumn="0" w:lastRow="0" w:noHBand="0" w:noVBand="1" w:val="04A0"/>
-      </w:tblPr>
-      <w:tblGrid>
-        <w:gridCol w:w="9638"/>
-      </w:tblGrid>
-      <w:tr>
-        <w:tc>
-          <w:tcPr>
-            <w:tcW w:type="dxa" w:w="9638"/>
-            <w:shd w:val="clear" w:color="auto" w:fill="F2F2F2"/>
-          </w:tcPr>
-          <w:p>
-            <w:pPr>
-              <w:spacing w:after="0" w:line="240" w:lineRule="auto"/>
-            </w:pPr>
-            <w:r/>
-            <w:r>
-              <w:rPr>
-                <w:rFonts w:ascii="Consolas" w:hAnsi="Consolas" w:eastAsia="Consolas"/>
-                <w:sz w:val="18"/>
-              </w:rPr>
-              <w:t>try (MulticastSocket socket = new MulticastSocket()) {</w:t>
-              <w:br/>
-            </w:r>
-            <w:r>
-              <w:rPr>
-                <w:rFonts w:ascii="Consolas" w:hAnsi="Consolas" w:eastAsia="Consolas"/>
-                <w:sz w:val="18"/>
-              </w:rPr>
-              <w:t xml:space="preserve">    InetAddress group = InetAddress.getByName(groupAddr);</w:t>
-              <w:br/>
-            </w:r>
-            <w:r>
-              <w:rPr>
-                <w:rFonts w:ascii="Consolas" w:hAnsi="Consolas" w:eastAsia="Consolas"/>
-                <w:sz w:val="18"/>
-              </w:rPr>
-              <w:t xml:space="preserve">    if (!group.isMulticastAddress()) {</w:t>
-              <w:br/>
-            </w:r>
-            <w:r>
-              <w:rPr>
-                <w:rFonts w:ascii="Consolas" w:hAnsi="Consolas" w:eastAsia="Consolas"/>
-                <w:sz w:val="18"/>
-              </w:rPr>
-              <w:t xml:space="preserve">        System.err.println(groupAddr + " khong phai dia chi multicast (224.0.0.0 - 239.255.255.255)");</w:t>
-              <w:br/>
-            </w:r>
-            <w:r>
-              <w:rPr>
-                <w:rFonts w:ascii="Consolas" w:hAnsi="Consolas" w:eastAsia="Consolas"/>
-                <w:sz w:val="18"/>
-              </w:rPr>
-              <w:t xml:space="preserve">        return;</w:t>
-              <w:br/>
-            </w:r>
-            <w:r>
-              <w:rPr>
-                <w:rFonts w:ascii="Consolas" w:hAnsi="Consolas" w:eastAsia="Consolas"/>
-                <w:sz w:val="18"/>
-              </w:rPr>
-              <w:t xml:space="preserve">    }</w:t>
-              <w:br/>
-            </w:r>
-            <w:r>
-              <w:rPr>
-                <w:rFonts w:ascii="Consolas" w:hAnsi="Consolas" w:eastAsia="Consolas"/>
-                <w:sz w:val="18"/>
-              </w:rPr>
-              <w:t xml:space="preserve">    // TTL = 1: goi tin chi di trong mang noi bo, khong vuot qua router</w:t>
-              <w:br/>
-            </w:r>
-            <w:r>
-              <w:rPr>
-                <w:rFonts w:ascii="Consolas" w:hAnsi="Consolas" w:eastAsia="Consolas"/>
-                <w:sz w:val="18"/>
-              </w:rPr>
-              <w:t xml:space="preserve">    socket.setTimeToLive(1);</w:t>
-              <w:br/>
-            </w:r>
-            <w:r>
-              <w:rPr>
-                <w:rFonts w:ascii="Consolas" w:hAnsi="Consolas" w:eastAsia="Consolas"/>
-                <w:sz w:val="18"/>
-              </w:rPr>
-              <w:br/>
-            </w:r>
-            <w:r>
-              <w:rPr>
-                <w:rFonts w:ascii="Consolas" w:hAnsi="Consolas" w:eastAsia="Consolas"/>
-                <w:sz w:val="18"/>
-              </w:rPr>
-              <w:t xml:space="preserve">    // Dung UTF-8 de gui dung tieng Viet co dau</w:t>
-              <w:br/>
-            </w:r>
-            <w:r>
-              <w:rPr>
-                <w:rFonts w:ascii="Consolas" w:hAnsi="Consolas" w:eastAsia="Consolas"/>
-                <w:sz w:val="18"/>
-              </w:rPr>
-              <w:t xml:space="preserve">    byte[] buffer = message.getBytes(StandardCharsets.UTF_8);</w:t>
-              <w:br/>
-            </w:r>
-            <w:r>
-              <w:rPr>
-                <w:rFonts w:ascii="Consolas" w:hAnsi="Consolas" w:eastAsia="Consolas"/>
-                <w:sz w:val="18"/>
-              </w:rPr>
-              <w:t xml:space="preserve">    DatagramPacket packet = new DatagramPacket(buffer, buffer.length, group, port);</w:t>
-              <w:br/>
-            </w:r>
-            <w:r>
-              <w:rPr>
-                <w:rFonts w:ascii="Consolas" w:hAnsi="Consolas" w:eastAsia="Consolas"/>
-                <w:sz w:val="18"/>
-              </w:rPr>
-              <w:t xml:space="preserve">    socket.send(packet);</w:t>
-              <w:br/>
-            </w:r>
-            <w:r>
-              <w:rPr>
-                <w:rFonts w:ascii="Consolas" w:hAnsi="Consolas" w:eastAsia="Consolas"/>
-                <w:sz w:val="18"/>
-              </w:rPr>
-              <w:br/>
-            </w:r>
-            <w:r>
-              <w:rPr>
-                <w:rFonts w:ascii="Consolas" w:hAnsi="Consolas" w:eastAsia="Consolas"/>
-                <w:sz w:val="18"/>
-              </w:rPr>
-              <w:t xml:space="preserve">    System.out.println("Da gui den " + groupAddr + ":" + port + " -&gt; " + message);</w:t>
-            </w:r>
-          </w:p>
-        </w:tc>
-      </w:tr>
-    </w:tbl>
-    <w:p>
-      <w:pPr>
-        <w:spacing w:after="40"/>
-      </w:pPr>
-    </w:p>
-    <w:tbl>
-      <w:tblPr>
-        <w:tblStyle w:val="TableGrid"/>
-        <w:tblW w:type="auto" w:w="0"/>
-        <w:tblLook w:firstColumn="1" w:firstRow="1" w:lastColumn="0" w:lastRow="0" w:noHBand="0" w:noVBand="1" w:val="04A0"/>
-      </w:tblPr>
-      <w:tblGrid>
-        <w:gridCol w:w="9638"/>
-      </w:tblGrid>
-      <w:tr>
-        <w:tc>
-          <w:tcPr>
-            <w:tcW w:type="dxa" w:w="9638"/>
-            <w:shd w:val="clear" w:color="auto" w:fill="F2F2F2"/>
-          </w:tcPr>
-          <w:p>
-            <w:pPr>
-              <w:spacing w:after="0" w:line="240" w:lineRule="auto"/>
-            </w:pPr>
-            <w:r/>
-            <w:r>
-              <w:rPr>
-                <w:rFonts w:ascii="Consolas" w:hAnsi="Consolas" w:eastAsia="Consolas"/>
-                <w:sz w:val="18"/>
-              </w:rPr>
-              <w:t>try (MulticastSocket socket = new MulticastSocket(port)) {</w:t>
-              <w:br/>
-            </w:r>
-            <w:r>
-              <w:rPr>
-                <w:rFonts w:ascii="Consolas" w:hAnsi="Consolas" w:eastAsia="Consolas"/>
-                <w:sz w:val="18"/>
-              </w:rPr>
-              <w:t xml:space="preserve">    InetAddress group = InetAddress.getByName(groupAddr);</w:t>
-              <w:br/>
-            </w:r>
-            <w:r>
-              <w:rPr>
-                <w:rFonts w:ascii="Consolas" w:hAnsi="Consolas" w:eastAsia="Consolas"/>
-                <w:sz w:val="18"/>
-              </w:rPr>
-              <w:t xml:space="preserve">    InetSocketAddress groupSocketAddr = new InetSocketAddress(group, port);</w:t>
-              <w:br/>
-            </w:r>
-            <w:r>
-              <w:rPr>
-                <w:rFonts w:ascii="Consolas" w:hAnsi="Consolas" w:eastAsia="Consolas"/>
-                <w:sz w:val="18"/>
-              </w:rPr>
-              <w:t xml:space="preserve">    // null = dung card mang mac dinh cua he dieu hanh</w:t>
-              <w:br/>
-            </w:r>
-            <w:r>
-              <w:rPr>
-                <w:rFonts w:ascii="Consolas" w:hAnsi="Consolas" w:eastAsia="Consolas"/>
-                <w:sz w:val="18"/>
-              </w:rPr>
-              <w:t xml:space="preserve">    NetworkInterface netIf = null;</w:t>
-              <w:br/>
-            </w:r>
-            <w:r>
-              <w:rPr>
-                <w:rFonts w:ascii="Consolas" w:hAnsi="Consolas" w:eastAsia="Consolas"/>
-                <w:sz w:val="18"/>
-              </w:rPr>
-              <w:br/>
-            </w:r>
-            <w:r>
-              <w:rPr>
-                <w:rFonts w:ascii="Consolas" w:hAnsi="Consolas" w:eastAsia="Consolas"/>
-                <w:sz w:val="18"/>
-              </w:rPr>
-              <w:t xml:space="preserve">    socket.joinGroup(groupSocketAddr, netIf);</w:t>
-              <w:br/>
-            </w:r>
-            <w:r>
-              <w:rPr>
-                <w:rFonts w:ascii="Consolas" w:hAnsi="Consolas" w:eastAsia="Consolas"/>
-                <w:sz w:val="18"/>
-              </w:rPr>
-              <w:t xml:space="preserve">    System.out.println("Da tham gia nhom " + groupAddr + ":" + port + ". Dang cho thong diep...");</w:t>
-              <w:br/>
-            </w:r>
-            <w:r>
-              <w:rPr>
-                <w:rFonts w:ascii="Consolas" w:hAnsi="Consolas" w:eastAsia="Consolas"/>
-                <w:sz w:val="18"/>
-              </w:rPr>
-              <w:br/>
-            </w:r>
-            <w:r>
-              <w:rPr>
-                <w:rFonts w:ascii="Consolas" w:hAnsi="Consolas" w:eastAsia="Consolas"/>
-                <w:sz w:val="18"/>
-              </w:rPr>
-              <w:t xml:space="preserve">    byte[] buffer = new byte[1024];</w:t>
-              <w:br/>
-            </w:r>
-            <w:r>
-              <w:rPr>
-                <w:rFonts w:ascii="Consolas" w:hAnsi="Consolas" w:eastAsia="Consolas"/>
-                <w:sz w:val="18"/>
-              </w:rPr>
-              <w:t xml:space="preserve">    while (true) {</w:t>
-              <w:br/>
-            </w:r>
-            <w:r>
-              <w:rPr>
-                <w:rFonts w:ascii="Consolas" w:hAnsi="Consolas" w:eastAsia="Consolas"/>
-                <w:sz w:val="18"/>
-              </w:rPr>
-              <w:t xml:space="preserve">        DatagramPacket packet = new DatagramPacket(buffer, buffer.length);</w:t>
-              <w:br/>
-            </w:r>
-            <w:r>
-              <w:rPr>
-                <w:rFonts w:ascii="Consolas" w:hAnsi="Consolas" w:eastAsia="Consolas"/>
-                <w:sz w:val="18"/>
-              </w:rPr>
-              <w:t xml:space="preserve">        socket.receive(packet); // block cho den khi co goi tin</w:t>
-              <w:br/>
-            </w:r>
-            <w:r>
-              <w:rPr>
-                <w:rFonts w:ascii="Consolas" w:hAnsi="Consolas" w:eastAsia="Consolas"/>
-                <w:sz w:val="18"/>
-              </w:rPr>
-              <w:br/>
-            </w:r>
-            <w:r>
-              <w:rPr>
-                <w:rFonts w:ascii="Consolas" w:hAnsi="Consolas" w:eastAsia="Consolas"/>
-                <w:sz w:val="18"/>
-              </w:rPr>
-              <w:t xml:space="preserve">        String received = new String(packet.getData(), 0, packet.getLength(), StandardCharsets.UTF_8);</w:t>
-              <w:br/>
-            </w:r>
-            <w:r>
-              <w:rPr>
-                <w:rFonts w:ascii="Consolas" w:hAnsi="Consolas" w:eastAsia="Consolas"/>
-                <w:sz w:val="18"/>
-              </w:rPr>
-              <w:t xml:space="preserve">        System.out.println("Nhan tu " + packet.getAddress().getHostAddress() + ":" + packet.getPort()</w:t>
-              <w:br/>
-            </w:r>
-            <w:r>
-              <w:rPr>
-                <w:rFonts w:ascii="Consolas" w:hAnsi="Consolas" w:eastAsia="Consolas"/>
-                <w:sz w:val="18"/>
-              </w:rPr>
-              <w:t xml:space="preserve">                + " -&gt; " + received);</w:t>
-              <w:br/>
-            </w:r>
-            <w:r>
-              <w:rPr>
-                <w:rFonts w:ascii="Consolas" w:hAnsi="Consolas" w:eastAsia="Consolas"/>
-                <w:sz w:val="18"/>
-              </w:rPr>
-              <w:br/>
-            </w:r>
-            <w:r>
-              <w:rPr>
-                <w:rFonts w:ascii="Consolas" w:hAnsi="Consolas" w:eastAsia="Consolas"/>
-                <w:sz w:val="18"/>
-              </w:rPr>
-              <w:t xml:space="preserve">        if (received.trim().equalsIgnoreCase("exit")) {</w:t>
-              <w:br/>
-            </w:r>
-            <w:r>
-              <w:rPr>
-                <w:rFonts w:ascii="Consolas" w:hAnsi="Consolas" w:eastAsia="Consolas"/>
-                <w:sz w:val="18"/>
-              </w:rPr>
-              <w:t xml:space="preserve">            break;</w:t>
-              <w:br/>
-            </w:r>
-            <w:r>
-              <w:rPr>
-                <w:rFonts w:ascii="Consolas" w:hAnsi="Consolas" w:eastAsia="Consolas"/>
-                <w:sz w:val="18"/>
-              </w:rPr>
-              <w:t xml:space="preserve">        }</w:t>
-              <w:br/>
-            </w:r>
-            <w:r>
-              <w:rPr>
-                <w:rFonts w:ascii="Consolas" w:hAnsi="Consolas" w:eastAsia="Consolas"/>
-                <w:sz w:val="18"/>
-              </w:rPr>
-              <w:t xml:space="preserve">    }</w:t>
-              <w:br/>
-            </w:r>
-            <w:r>
-              <w:rPr>
-                <w:rFonts w:ascii="Consolas" w:hAnsi="Consolas" w:eastAsia="Consolas"/>
-                <w:sz w:val="18"/>
-              </w:rPr>
-              <w:br/>
-            </w:r>
-            <w:r>
-              <w:rPr>
-                <w:rFonts w:ascii="Consolas" w:hAnsi="Consolas" w:eastAsia="Consolas"/>
-                <w:sz w:val="18"/>
-              </w:rPr>
-              <w:t xml:space="preserve">    socket.leaveGroup(groupSocketAddr, netIf); // roi khoi nhom</w:t>
-              <w:br/>
-            </w:r>
-            <w:r>
-              <w:rPr>
-                <w:rFonts w:ascii="Consolas" w:hAnsi="Consolas" w:eastAsia="Consolas"/>
-                <w:sz w:val="18"/>
-              </w:rPr>
-              <w:t xml:space="preserve">    System.out.println("Da roi nhom " + groupAddr + ". Ket thuc.");</w:t>
-            </w:r>
-          </w:p>
-        </w:tc>
-      </w:tr>
-    </w:tbl>
-    <w:p>
-      <w:pPr>
-        <w:spacing w:after="40"/>
-      </w:pPr>
-    </w:p>
-    <w:p>
-      <w:pPr>
-        <w:spacing w:after="40" w:before="120"/>
-      </w:pPr>
-      <w:r>
-        <w:rPr>
-          <w:b/>
-          <w:i w:val="0"/>
-        </w:rPr>
-        <w:t>Kết quả chạy thử</w:t>
-      </w:r>
-    </w:p>
-    <w:p>
-      <w:r>
-        <w:rPr>
-          <w:b w:val="0"/>
-          <w:i w:val="0"/>
-        </w:rPr>
-        <w:t>Chạy 3 cửa sổ MulticastReceiver trước, sau đó chạy MulticastSender 3 lần (mặc định, tiếng Việt có dấu, “exit”). Cả 3 máy nhận đều nhận đủ, đúng thứ tự, rồi rời nhóm:</w:t>
-      </w:r>
-    </w:p>
-    <w:p>
-      <w:pPr>
-        <w:spacing w:after="0"/>
-        <w:jc w:val="center"/>
-      </w:pPr>
-      <w:r>
-        <w:drawing>
-          <wp:inline xmlns:a="http://schemas.openxmlformats.org/drawingml/2006/main" xmlns:pic="http://schemas.openxmlformats.org/drawingml/2006/picture">
-            <wp:extent cx="6120000" cy="1913179"/>
-            <wp:docPr id="2" name="Picture 2"/>
-            <wp:cNvGraphicFramePr>
-              <a:graphicFrameLocks noChangeAspect="1"/>
-            </wp:cNvGraphicFramePr>
-            <a:graphic>
-              <a:graphicData uri="http://schemas.openxmlformats.org/drawingml/2006/picture">
-                <pic:pic>
-                  <pic:nvPicPr>
-                    <pic:cNvPr id="0" name="bt01_console.png"/>
-                    <pic:cNvPicPr/>
-                  </pic:nvPicPr>
-                  <pic:blipFill>
-                    <a:blip r:embed="rId10"/>
-                    <a:stretch>
-                      <a:fillRect/>
-                    </a:stretch>
-                  </pic:blipFill>
-                  <pic:spPr>
-                    <a:xfrm>
-                      <a:off x="0" y="0"/>
-                      <a:ext cx="6120000" cy="1913179"/>
-                    </a:xfrm>
-                    <a:prstGeom prst="rect"/>
-                  </pic:spPr>
-                </pic:pic>
-              </a:graphicData>
-            </a:graphic>
-          </wp:inline>
-        </w:drawing>
-      </w:r>
-    </w:p>
-    <w:p>
-      <w:pPr>
-        <w:spacing w:after="160"/>
-        <w:jc w:val="center"/>
-      </w:pPr>
-      <w:r>
-        <w:rPr>
-          <w:b w:val="0"/>
-          <w:i/>
-          <w:sz w:val="22"/>
-        </w:rPr>
-        <w:t>Hình 1. BT01 – một MulticastSender, ba MulticastReceiver cùng nhận thông điệp</w:t>
-      </w:r>
     </w:p>
     <w:p>
       <w:pPr>
@@ -4296,7 +4651,7 @@
           <w:b/>
           <w:color w:val="C00000"/>
         </w:rPr>
-        <w:t>▪  BAI08_BT02:</w:t>
+        <w:t>▪  BAI08_BT03:</w:t>
       </w:r>
     </w:p>
     <w:p>
@@ -4305,97 +4660,16 @@
           <w:b w:val="0"/>
           <w:i/>
         </w:rPr>
-        <w:t>Xây dựng ứng dụng Chat nhóm bằng Multicast.</w:t>
+        <w:t>Phân phối file đồng thời qua Multicast.</w:t>
       </w:r>
     </w:p>
     <w:p>
-      <w:pPr>
-        <w:spacing w:after="40" w:before="120"/>
-      </w:pPr>
       <w:r>
         <w:rPr>
           <w:b/>
           <w:i w:val="0"/>
         </w:rPr>
-        <w:t>Thiết kế</w:t>
-      </w:r>
-    </w:p>
-    <w:p>
-      <w:pPr>
-        <w:tabs>
-          <w:tab w:pos="454" w:val="left"/>
-        </w:tabs>
-        <w:spacing w:after="40"/>
-        <w:ind w:left="454" w:hanging="283"/>
-      </w:pPr>
-      <w:r>
-        <w:rPr>
-          <w:b w:val="0"/>
-          <w:i w:val="0"/>
-        </w:rPr>
-        <w:t>•</w:t>
-        <w:tab/>
-        <w:t xml:space="preserve">Giao diện Swing đúng mẫu đề bài: Group ID, Port, Username, nút </w:t>
-      </w:r>
-      <w:r>
-        <w:rPr>
-          <w:b/>
-          <w:i w:val="0"/>
-        </w:rPr>
-        <w:t>Send</w:t>
-      </w:r>
-      <w:r>
-        <w:rPr>
-          <w:b w:val="0"/>
-          <w:i w:val="0"/>
-        </w:rPr>
-        <w:t xml:space="preserve"> bên trái ô nhập tin, vùng hiển thị nội dung nhóm chat. Thêm nút </w:t>
-      </w:r>
-      <w:r>
-        <w:rPr>
-          <w:b/>
-          <w:i w:val="0"/>
-        </w:rPr>
-        <w:t>Tham gia / Rời nhóm</w:t>
-      </w:r>
-      <w:r>
-        <w:rPr>
-          <w:b w:val="0"/>
-          <w:i w:val="0"/>
-        </w:rPr>
-        <w:t xml:space="preserve"> để chọn nhóm, cổng trước khi chat.</w:t>
-      </w:r>
-    </w:p>
-    <w:p>
-      <w:pPr>
-        <w:tabs>
-          <w:tab w:pos="454" w:val="left"/>
-        </w:tabs>
-        <w:spacing w:after="40"/>
-        <w:ind w:left="454" w:hanging="283"/>
-      </w:pPr>
-      <w:r>
-        <w:rPr>
-          <w:b w:val="0"/>
-          <w:i w:val="0"/>
-        </w:rPr>
-        <w:t>•</w:t>
-        <w:tab/>
-        <w:t xml:space="preserve">Mỗi cửa sổ dùng </w:t>
-      </w:r>
-      <w:r>
-        <w:rPr>
-          <w:b/>
-          <w:i w:val="0"/>
-        </w:rPr>
-        <w:t>một MulticastSocket</w:t>
-      </w:r>
-      <w:r>
-        <w:rPr>
-          <w:b w:val="0"/>
-          <w:i w:val="0"/>
-        </w:rPr>
-        <w:t xml:space="preserve"> vừa gửi vừa nhận: joinGroup(), TTL = 1, bật IP_MULTICAST_LOOP để thấy cả tin của chính mình.</w:t>
+        <w:t>Cách hoạt động:</w:t>
       </w:r>
     </w:p>
     <w:p>
@@ -4419,14 +4693,14 @@
           <w:b/>
           <w:i w:val="0"/>
         </w:rPr>
-        <w:t>Xử lý song song:</w:t>
+        <w:t>Chia file:</w:t>
       </w:r>
       <w:r>
         <w:rPr>
           <w:b w:val="0"/>
           <w:i w:val="0"/>
         </w:rPr>
-        <w:t xml:space="preserve"> luồng nhận (chat-receiver) block ở receive(); luồng gửi (single-thread executor) thực hiện send() để giao diện không bị treo và tin được gửi đúng thứ tự; giao diện chỉ được cập nhật qua SwingUtilities.invokeLater().</w:t>
+        <w:t xml:space="preserve"> FileSender chia file thành các gói 1024 byte và đánh số thứ tự (seq) từ 0. Mỗi gói DATA mang seq, offset, CRC32 và dữ liệu. Trước đó gửi gói META chứa tên file, kích thước, số gói và mã SHA-256 của file; gửi xong thì phát gói END.</w:t>
       </w:r>
     </w:p>
     <w:p>
@@ -4450,1078 +4724,14 @@
           <w:b/>
           <w:i w:val="0"/>
         </w:rPr>
-        <w:t>Giao thức:</w:t>
+        <w:t>Kiểm soát thứ tự và tái cấu trúc:</w:t>
       </w:r>
       <w:r>
         <w:rPr>
           <w:b w:val="0"/>
           <w:i w:val="0"/>
         </w:rPr>
-        <w:t xml:space="preserve"> LOẠI|mãClient|tênNgườiDùng|nộiDung (UTF-8), LOẠI = JOIN / MSG / LEAVE. Mã client ngẫu nhiên giúp đánh dấu “(bạn)” khi nhiều cửa sổ chạy trên cùng máy; split("\\|", 4) nên nội dung tin nhắn chứa ký tự “|” vẫn hiển thị đúng.</w:t>
-      </w:r>
-    </w:p>
-    <w:p>
-      <w:pPr>
-        <w:tabs>
-          <w:tab w:pos="454" w:val="left"/>
-        </w:tabs>
-        <w:spacing w:after="40"/>
-        <w:ind w:left="454" w:hanging="283"/>
-      </w:pPr>
-      <w:r>
-        <w:rPr>
-          <w:b w:val="0"/>
-          <w:i w:val="0"/>
-        </w:rPr>
-        <w:t>•</w:t>
-        <w:tab/>
-        <w:t>Kiểm tra đầu vào: username rỗng, địa chỉ không phải multicast, port sai, tin nhắn quá 8 KB. Đóng cửa sổ thì gửi LEAVE, leaveGroup(), close().</w:t>
-      </w:r>
-    </w:p>
-    <w:p>
-      <w:pPr>
-        <w:spacing w:after="40" w:before="120"/>
-      </w:pPr>
-      <w:r>
-        <w:rPr>
-          <w:b/>
-          <w:i w:val="0"/>
-        </w:rPr>
-        <w:t>Mã nguồn chính</w:t>
-      </w:r>
-    </w:p>
-    <w:tbl>
-      <w:tblPr>
-        <w:tblStyle w:val="TableGrid"/>
-        <w:tblW w:type="auto" w:w="0"/>
-        <w:tblLook w:firstColumn="1" w:firstRow="1" w:lastColumn="0" w:lastRow="0" w:noHBand="0" w:noVBand="1" w:val="04A0"/>
-      </w:tblPr>
-      <w:tblGrid>
-        <w:gridCol w:w="9638"/>
-      </w:tblGrid>
-      <w:tr>
-        <w:tc>
-          <w:tcPr>
-            <w:tcW w:type="dxa" w:w="9638"/>
-            <w:shd w:val="clear" w:color="auto" w:fill="F2F2F2"/>
-          </w:tcPr>
-          <w:p>
-            <w:pPr>
-              <w:spacing w:after="0" w:line="240" w:lineRule="auto"/>
-            </w:pPr>
-            <w:r/>
-            <w:r>
-              <w:rPr>
-                <w:rFonts w:ascii="Consolas" w:hAnsi="Consolas" w:eastAsia="Consolas"/>
-                <w:sz w:val="18"/>
-              </w:rPr>
-              <w:t>MulticastSocket s = new MulticastSocket(port);</w:t>
-              <w:br/>
-            </w:r>
-            <w:r>
-              <w:rPr>
-                <w:rFonts w:ascii="Consolas" w:hAnsi="Consolas" w:eastAsia="Consolas"/>
-                <w:sz w:val="18"/>
-              </w:rPr>
-              <w:t>s.setTimeToLive(1);                                   // chi trong LAN</w:t>
-              <w:br/>
-            </w:r>
-            <w:r>
-              <w:rPr>
-                <w:rFonts w:ascii="Consolas" w:hAnsi="Consolas" w:eastAsia="Consolas"/>
-                <w:sz w:val="18"/>
-              </w:rPr>
-              <w:t>s.setOption(StandardSocketOptions.IP_MULTICAST_LOOP, true); // nhan ca tin cua chinh minh</w:t>
-              <w:br/>
-            </w:r>
-            <w:r>
-              <w:rPr>
-                <w:rFonts w:ascii="Consolas" w:hAnsi="Consolas" w:eastAsia="Consolas"/>
-                <w:sz w:val="18"/>
-              </w:rPr>
-              <w:t>groupAddress = new InetSocketAddress(group, port);</w:t>
-              <w:br/>
-            </w:r>
-            <w:r>
-              <w:rPr>
-                <w:rFonts w:ascii="Consolas" w:hAnsi="Consolas" w:eastAsia="Consolas"/>
-                <w:sz w:val="18"/>
-              </w:rPr>
-              <w:t>s.joinGroup(groupAddress, null);</w:t>
-              <w:br/>
-            </w:r>
-            <w:r>
-              <w:rPr>
-                <w:rFonts w:ascii="Consolas" w:hAnsi="Consolas" w:eastAsia="Consolas"/>
-                <w:sz w:val="18"/>
-              </w:rPr>
-              <w:br/>
-            </w:r>
-            <w:r>
-              <w:rPr>
-                <w:rFonts w:ascii="Consolas" w:hAnsi="Consolas" w:eastAsia="Consolas"/>
-                <w:sz w:val="18"/>
-              </w:rPr>
-              <w:t>socket = s;</w:t>
-              <w:br/>
-            </w:r>
-            <w:r>
-              <w:rPr>
-                <w:rFonts w:ascii="Consolas" w:hAnsi="Consolas" w:eastAsia="Consolas"/>
-                <w:sz w:val="18"/>
-              </w:rPr>
-              <w:t>username = name;</w:t>
-              <w:br/>
-            </w:r>
-            <w:r>
-              <w:rPr>
-                <w:rFonts w:ascii="Consolas" w:hAnsi="Consolas" w:eastAsia="Consolas"/>
-                <w:sz w:val="18"/>
-              </w:rPr>
-              <w:t>setConnectedState(true);</w:t>
-              <w:br/>
-            </w:r>
-            <w:r>
-              <w:rPr>
-                <w:rFonts w:ascii="Consolas" w:hAnsi="Consolas" w:eastAsia="Consolas"/>
-                <w:sz w:val="18"/>
-              </w:rPr>
-              <w:t>appendLine("[Hệ thống] Đã tham gia nhóm " + group.getHostAddress() + ":" + port);</w:t>
-              <w:br/>
-            </w:r>
-            <w:r>
-              <w:rPr>
-                <w:rFonts w:ascii="Consolas" w:hAnsi="Consolas" w:eastAsia="Consolas"/>
-                <w:sz w:val="18"/>
-              </w:rPr>
-              <w:br/>
-            </w:r>
-            <w:r>
-              <w:rPr>
-                <w:rFonts w:ascii="Consolas" w:hAnsi="Consolas" w:eastAsia="Consolas"/>
-                <w:sz w:val="18"/>
-              </w:rPr>
-              <w:t>receiverThread = new Thread(this::receiveLoop, "chat-receiver");</w:t>
-              <w:br/>
-            </w:r>
-            <w:r>
-              <w:rPr>
-                <w:rFonts w:ascii="Consolas" w:hAnsi="Consolas" w:eastAsia="Consolas"/>
-                <w:sz w:val="18"/>
-              </w:rPr>
-              <w:t>receiverThread.setDaemon(true);</w:t>
-              <w:br/>
-            </w:r>
-            <w:r>
-              <w:rPr>
-                <w:rFonts w:ascii="Consolas" w:hAnsi="Consolas" w:eastAsia="Consolas"/>
-                <w:sz w:val="18"/>
-              </w:rPr>
-              <w:t>receiverThread.start();</w:t>
-            </w:r>
-          </w:p>
-        </w:tc>
-      </w:tr>
-    </w:tbl>
-    <w:p>
-      <w:pPr>
-        <w:spacing w:after="40"/>
-      </w:pPr>
-    </w:p>
-    <w:tbl>
-      <w:tblPr>
-        <w:tblStyle w:val="TableGrid"/>
-        <w:tblW w:type="auto" w:w="0"/>
-        <w:tblLook w:firstColumn="1" w:firstRow="1" w:lastColumn="0" w:lastRow="0" w:noHBand="0" w:noVBand="1" w:val="04A0"/>
-      </w:tblPr>
-      <w:tblGrid>
-        <w:gridCol w:w="9638"/>
-      </w:tblGrid>
-      <w:tr>
-        <w:tc>
-          <w:tcPr>
-            <w:tcW w:type="dxa" w:w="9638"/>
-            <w:shd w:val="clear" w:color="auto" w:fill="F2F2F2"/>
-          </w:tcPr>
-          <w:p>
-            <w:pPr>
-              <w:spacing w:after="0" w:line="240" w:lineRule="auto"/>
-            </w:pPr>
-            <w:r/>
-            <w:r>
-              <w:rPr>
-                <w:rFonts w:ascii="Consolas" w:hAnsi="Consolas" w:eastAsia="Consolas"/>
-                <w:sz w:val="18"/>
-              </w:rPr>
-              <w:t>private void receiveLoop() {</w:t>
-              <w:br/>
-            </w:r>
-            <w:r>
-              <w:rPr>
-                <w:rFonts w:ascii="Consolas" w:hAnsi="Consolas" w:eastAsia="Consolas"/>
-                <w:sz w:val="18"/>
-              </w:rPr>
-              <w:t xml:space="preserve">    MulticastSocket s = socket;</w:t>
-              <w:br/>
-            </w:r>
-            <w:r>
-              <w:rPr>
-                <w:rFonts w:ascii="Consolas" w:hAnsi="Consolas" w:eastAsia="Consolas"/>
-                <w:sz w:val="18"/>
-              </w:rPr>
-              <w:t xml:space="preserve">    byte[] buffer = new byte[MAX_PACKET];</w:t>
-              <w:br/>
-            </w:r>
-            <w:r>
-              <w:rPr>
-                <w:rFonts w:ascii="Consolas" w:hAnsi="Consolas" w:eastAsia="Consolas"/>
-                <w:sz w:val="18"/>
-              </w:rPr>
-              <w:t xml:space="preserve">    while (!s.isClosed()) {</w:t>
-              <w:br/>
-            </w:r>
-            <w:r>
-              <w:rPr>
-                <w:rFonts w:ascii="Consolas" w:hAnsi="Consolas" w:eastAsia="Consolas"/>
-                <w:sz w:val="18"/>
-              </w:rPr>
-              <w:t xml:space="preserve">        DatagramPacket packet = new DatagramPacket(buffer, buffer.length);</w:t>
-              <w:br/>
-            </w:r>
-            <w:r>
-              <w:rPr>
-                <w:rFonts w:ascii="Consolas" w:hAnsi="Consolas" w:eastAsia="Consolas"/>
-                <w:sz w:val="18"/>
-              </w:rPr>
-              <w:t xml:space="preserve">        try {</w:t>
-              <w:br/>
-            </w:r>
-            <w:r>
-              <w:rPr>
-                <w:rFonts w:ascii="Consolas" w:hAnsi="Consolas" w:eastAsia="Consolas"/>
-                <w:sz w:val="18"/>
-              </w:rPr>
-              <w:t xml:space="preserve">            s.receive(packet);</w:t>
-              <w:br/>
-            </w:r>
-            <w:r>
-              <w:rPr>
-                <w:rFonts w:ascii="Consolas" w:hAnsi="Consolas" w:eastAsia="Consolas"/>
-                <w:sz w:val="18"/>
-              </w:rPr>
-              <w:t xml:space="preserve">        } catch (SocketException closed) {</w:t>
-              <w:br/>
-            </w:r>
-            <w:r>
-              <w:rPr>
-                <w:rFonts w:ascii="Consolas" w:hAnsi="Consolas" w:eastAsia="Consolas"/>
-                <w:sz w:val="18"/>
-              </w:rPr>
-              <w:t xml:space="preserve">            break; // socket da dong khi roi nhom</w:t>
-              <w:br/>
-            </w:r>
-            <w:r>
-              <w:rPr>
-                <w:rFonts w:ascii="Consolas" w:hAnsi="Consolas" w:eastAsia="Consolas"/>
-                <w:sz w:val="18"/>
-              </w:rPr>
-              <w:t xml:space="preserve">        } catch (IOException ex) {</w:t>
-              <w:br/>
-            </w:r>
-            <w:r>
-              <w:rPr>
-                <w:rFonts w:ascii="Consolas" w:hAnsi="Consolas" w:eastAsia="Consolas"/>
-                <w:sz w:val="18"/>
-              </w:rPr>
-              <w:t xml:space="preserve">            appendLine("[Lỗi] " + ex.getMessage());</w:t>
-              <w:br/>
-            </w:r>
-            <w:r>
-              <w:rPr>
-                <w:rFonts w:ascii="Consolas" w:hAnsi="Consolas" w:eastAsia="Consolas"/>
-                <w:sz w:val="18"/>
-              </w:rPr>
-              <w:t xml:space="preserve">            continue;</w:t>
-              <w:br/>
-            </w:r>
-            <w:r>
-              <w:rPr>
-                <w:rFonts w:ascii="Consolas" w:hAnsi="Consolas" w:eastAsia="Consolas"/>
-                <w:sz w:val="18"/>
-              </w:rPr>
-              <w:t xml:space="preserve">        }</w:t>
-              <w:br/>
-            </w:r>
-            <w:r>
-              <w:rPr>
-                <w:rFonts w:ascii="Consolas" w:hAnsi="Consolas" w:eastAsia="Consolas"/>
-                <w:sz w:val="18"/>
-              </w:rPr>
-              <w:t xml:space="preserve">        String raw = new String(packet.getData(), 0, packet.getLength(), StandardCharsets.UTF_8);</w:t>
-              <w:br/>
-            </w:r>
-            <w:r>
-              <w:rPr>
-                <w:rFonts w:ascii="Consolas" w:hAnsi="Consolas" w:eastAsia="Consolas"/>
-                <w:sz w:val="18"/>
-              </w:rPr>
-              <w:t xml:space="preserve">        // tach toi da 4 phan: noi dung tin nhan co the chua ky tu '|'</w:t>
-              <w:br/>
-            </w:r>
-            <w:r>
-              <w:rPr>
-                <w:rFonts w:ascii="Consolas" w:hAnsi="Consolas" w:eastAsia="Consolas"/>
-                <w:sz w:val="18"/>
-              </w:rPr>
-              <w:t xml:space="preserve">        String[] parts = raw.split("\\|", 4);</w:t>
-              <w:br/>
-            </w:r>
-            <w:r>
-              <w:rPr>
-                <w:rFonts w:ascii="Consolas" w:hAnsi="Consolas" w:eastAsia="Consolas"/>
-                <w:sz w:val="18"/>
-              </w:rPr>
-              <w:t xml:space="preserve">        if (parts.length &lt; 4) {</w:t>
-              <w:br/>
-            </w:r>
-            <w:r>
-              <w:rPr>
-                <w:rFonts w:ascii="Consolas" w:hAnsi="Consolas" w:eastAsia="Consolas"/>
-                <w:sz w:val="18"/>
-              </w:rPr>
-              <w:t xml:space="preserve">            continue; // goi tin khong dung dinh dang -&gt; bo qua</w:t>
-              <w:br/>
-            </w:r>
-            <w:r>
-              <w:rPr>
-                <w:rFonts w:ascii="Consolas" w:hAnsi="Consolas" w:eastAsia="Consolas"/>
-                <w:sz w:val="18"/>
-              </w:rPr>
-              <w:t xml:space="preserve">        }</w:t>
-              <w:br/>
-            </w:r>
-            <w:r>
-              <w:rPr>
-                <w:rFonts w:ascii="Consolas" w:hAnsi="Consolas" w:eastAsia="Consolas"/>
-                <w:sz w:val="18"/>
-              </w:rPr>
-              <w:t xml:space="preserve">        String type = parts[0];</w:t>
-              <w:br/>
-            </w:r>
-            <w:r>
-              <w:rPr>
-                <w:rFonts w:ascii="Consolas" w:hAnsi="Consolas" w:eastAsia="Consolas"/>
-                <w:sz w:val="18"/>
-              </w:rPr>
-              <w:t xml:space="preserve">        boolean mine = parts[1].equals(clientId);</w:t>
-              <w:br/>
-            </w:r>
-            <w:r>
-              <w:rPr>
-                <w:rFonts w:ascii="Consolas" w:hAnsi="Consolas" w:eastAsia="Consolas"/>
-                <w:sz w:val="18"/>
-              </w:rPr>
-              <w:t xml:space="preserve">        String sender = parts[2] + (mine ? " (bạn)" : "");</w:t>
-              <w:br/>
-            </w:r>
-            <w:r>
-              <w:rPr>
-                <w:rFonts w:ascii="Consolas" w:hAnsi="Consolas" w:eastAsia="Consolas"/>
-                <w:sz w:val="18"/>
-              </w:rPr>
-              <w:t xml:space="preserve">        String time = LocalTime.now().format(TIME);</w:t>
-              <w:br/>
-            </w:r>
-            <w:r>
-              <w:rPr>
-                <w:rFonts w:ascii="Consolas" w:hAnsi="Consolas" w:eastAsia="Consolas"/>
-                <w:sz w:val="18"/>
-              </w:rPr>
-              <w:t xml:space="preserve">        switch (type) {</w:t>
-              <w:br/>
-            </w:r>
-            <w:r>
-              <w:rPr>
-                <w:rFonts w:ascii="Consolas" w:hAnsi="Consolas" w:eastAsia="Consolas"/>
-                <w:sz w:val="18"/>
-              </w:rPr>
-              <w:t xml:space="preserve">            case "JOIN" -&gt; appendLine("[" + time + "] * " + sender + " đã tham gia nhóm");</w:t>
-              <w:br/>
-            </w:r>
-            <w:r>
-              <w:rPr>
-                <w:rFonts w:ascii="Consolas" w:hAnsi="Consolas" w:eastAsia="Consolas"/>
-                <w:sz w:val="18"/>
-              </w:rPr>
-              <w:t xml:space="preserve">            case "LEAVE" -&gt; appendLine("[" + time + "] * " + sender + " đã rời nhóm");</w:t>
-              <w:br/>
-            </w:r>
-            <w:r>
-              <w:rPr>
-                <w:rFonts w:ascii="Consolas" w:hAnsi="Consolas" w:eastAsia="Consolas"/>
-                <w:sz w:val="18"/>
-              </w:rPr>
-              <w:t xml:space="preserve">            case "MSG" -&gt; appendLine("[" + time + "] " + sender + ": " + parts[3]);</w:t>
-              <w:br/>
-            </w:r>
-            <w:r>
-              <w:rPr>
-                <w:rFonts w:ascii="Consolas" w:hAnsi="Consolas" w:eastAsia="Consolas"/>
-                <w:sz w:val="18"/>
-              </w:rPr>
-              <w:t xml:space="preserve">            default -&gt; { }</w:t>
-              <w:br/>
-            </w:r>
-            <w:r>
-              <w:rPr>
-                <w:rFonts w:ascii="Consolas" w:hAnsi="Consolas" w:eastAsia="Consolas"/>
-                <w:sz w:val="18"/>
-              </w:rPr>
-              <w:t xml:space="preserve">        }</w:t>
-              <w:br/>
-            </w:r>
-            <w:r>
-              <w:rPr>
-                <w:rFonts w:ascii="Consolas" w:hAnsi="Consolas" w:eastAsia="Consolas"/>
-                <w:sz w:val="18"/>
-              </w:rPr>
-              <w:t xml:space="preserve">    }</w:t>
-              <w:br/>
-            </w:r>
-            <w:r>
-              <w:rPr>
-                <w:rFonts w:ascii="Consolas" w:hAnsi="Consolas" w:eastAsia="Consolas"/>
-                <w:sz w:val="18"/>
-              </w:rPr>
-              <w:t>}</w:t>
-            </w:r>
-          </w:p>
-        </w:tc>
-      </w:tr>
-    </w:tbl>
-    <w:p>
-      <w:pPr>
-        <w:spacing w:after="40"/>
-      </w:pPr>
-    </w:p>
-    <w:p>
-      <w:pPr>
-        <w:spacing w:after="40" w:before="120"/>
-      </w:pPr>
-      <w:r>
-        <w:rPr>
-          <w:b/>
-          <w:i w:val="0"/>
-        </w:rPr>
-        <w:t>Kết quả chạy thử</w:t>
-      </w:r>
-    </w:p>
-    <w:p>
-      <w:r>
-        <w:rPr>
-          <w:b w:val="0"/>
-          <w:i w:val="0"/>
-        </w:rPr>
-        <w:t>Mở 3 cửa sổ (Duy, Hùng, Đức) cùng nhóm 224.1.1.1:4444. Tin nhắn của mỗi người hiển thị ở cả 3 cửa sổ, kèm thông báo tham gia nhóm:</w:t>
-      </w:r>
-    </w:p>
-    <w:p>
-      <w:pPr>
-        <w:spacing w:after="0"/>
-        <w:jc w:val="center"/>
-      </w:pPr>
-      <w:r>
-        <w:drawing>
-          <wp:inline xmlns:a="http://schemas.openxmlformats.org/drawingml/2006/main" xmlns:pic="http://schemas.openxmlformats.org/drawingml/2006/picture">
-            <wp:extent cx="6120000" cy="2616183"/>
-            <wp:docPr id="3" name="Picture 3"/>
-            <wp:cNvGraphicFramePr>
-              <a:graphicFrameLocks noChangeAspect="1"/>
-            </wp:cNvGraphicFramePr>
-            <a:graphic>
-              <a:graphicData uri="http://schemas.openxmlformats.org/drawingml/2006/picture">
-                <pic:pic>
-                  <pic:nvPicPr>
-                    <pic:cNvPr id="0" name="bt02_chat.png"/>
-                    <pic:cNvPicPr/>
-                  </pic:nvPicPr>
-                  <pic:blipFill>
-                    <a:blip r:embed="rId11"/>
-                    <a:stretch>
-                      <a:fillRect/>
-                    </a:stretch>
-                  </pic:blipFill>
-                  <pic:spPr>
-                    <a:xfrm>
-                      <a:off x="0" y="0"/>
-                      <a:ext cx="6120000" cy="2616183"/>
-                    </a:xfrm>
-                    <a:prstGeom prst="rect"/>
-                  </pic:spPr>
-                </pic:pic>
-              </a:graphicData>
-            </a:graphic>
-          </wp:inline>
-        </w:drawing>
-      </w:r>
-    </w:p>
-    <w:p>
-      <w:pPr>
-        <w:spacing w:after="160"/>
-        <w:jc w:val="center"/>
-      </w:pPr>
-      <w:r>
-        <w:rPr>
-          <w:b w:val="0"/>
-          <w:i/>
-          <w:sz w:val="22"/>
-        </w:rPr>
-        <w:t>Hình 2. BT02 – ba thành viên chat nhóm qua multicast</w:t>
-      </w:r>
-    </w:p>
-    <w:p>
-      <w:pPr>
-        <w:spacing w:after="80" w:before="160"/>
-      </w:pPr>
-      <w:r>
-        <w:rPr>
-          <w:b/>
-          <w:color w:val="C00000"/>
-        </w:rPr>
-        <w:t>▪  BAI08_BT03:</w:t>
-      </w:r>
-    </w:p>
-    <w:p>
-      <w:r>
-        <w:rPr>
-          <w:b w:val="0"/>
-          <w:i/>
-        </w:rPr>
-        <w:t>Phân phối file đồng thời qua Multicast.</w:t>
-      </w:r>
-    </w:p>
-    <w:p>
-      <w:pPr>
-        <w:spacing w:after="40" w:before="120"/>
-      </w:pPr>
-      <w:r>
-        <w:rPr>
-          <w:b/>
-          <w:i w:val="0"/>
-        </w:rPr>
-        <w:t>Thiết kế giao thức (FileProtocol)</w:t>
-      </w:r>
-    </w:p>
-    <w:p>
-      <w:r>
-        <w:rPr>
-          <w:b w:val="0"/>
-          <w:i w:val="0"/>
-        </w:rPr>
-        <w:t>Mỗi gói bắt đầu bằng MAGIC | TYPE | fileId. Dữ liệu được ghi/đọc bằng DataOutputStream/DataInputStream:</w:t>
-      </w:r>
-    </w:p>
-    <w:tbl>
-      <w:tblPr>
-        <w:tblStyle w:val="TableGrid"/>
-        <w:tblW w:type="auto" w:w="0"/>
-        <w:jc w:val="center"/>
-        <w:tblLook w:firstColumn="1" w:firstRow="1" w:lastColumn="0" w:lastRow="0" w:noHBand="0" w:noVBand="1" w:val="04A0"/>
-      </w:tblPr>
-      <w:tblGrid>
-        <w:gridCol w:w="2409"/>
-        <w:gridCol w:w="2409"/>
-        <w:gridCol w:w="2409"/>
-        <w:gridCol w:w="2409"/>
-      </w:tblGrid>
-      <w:tr>
-        <w:tc>
-          <w:tcPr>
-            <w:tcW w:type="dxa" w:w="907"/>
-            <w:shd w:val="clear" w:color="auto" w:fill="D9E2F3"/>
-          </w:tcPr>
-          <w:p>
-            <w:pPr>
-              <w:spacing w:after="20"/>
-            </w:pPr>
-            <w:r/>
-            <w:r>
-              <w:rPr>
-                <w:b/>
-                <w:i w:val="0"/>
-                <w:sz w:val="20"/>
-              </w:rPr>
-              <w:t>Gói</w:t>
-            </w:r>
-          </w:p>
-        </w:tc>
-        <w:tc>
-          <w:tcPr>
-            <w:tcW w:type="dxa" w:w="1871"/>
-            <w:shd w:val="clear" w:color="auto" w:fill="D9E2F3"/>
-          </w:tcPr>
-          <w:p>
-            <w:pPr>
-              <w:spacing w:after="20"/>
-            </w:pPr>
-            <w:r/>
-            <w:r>
-              <w:rPr>
-                <w:b/>
-                <w:i w:val="0"/>
-                <w:sz w:val="20"/>
-              </w:rPr>
-              <w:t>Hướng</w:t>
-            </w:r>
-          </w:p>
-        </w:tc>
-        <w:tc>
-          <w:tcPr>
-            <w:tcW w:type="dxa" w:w="3742"/>
-            <w:shd w:val="clear" w:color="auto" w:fill="D9E2F3"/>
-          </w:tcPr>
-          <w:p>
-            <w:pPr>
-              <w:spacing w:after="20"/>
-            </w:pPr>
-            <w:r/>
-            <w:r>
-              <w:rPr>
-                <w:b/>
-                <w:i w:val="0"/>
-                <w:sz w:val="20"/>
-              </w:rPr>
-              <w:t>Nội dung</w:t>
-            </w:r>
-          </w:p>
-        </w:tc>
-        <w:tc>
-          <w:tcPr>
-            <w:tcW w:type="dxa" w:w="3118"/>
-            <w:shd w:val="clear" w:color="auto" w:fill="D9E2F3"/>
-          </w:tcPr>
-          <w:p>
-            <w:pPr>
-              <w:spacing w:after="20"/>
-            </w:pPr>
-            <w:r/>
-            <w:r>
-              <w:rPr>
-                <w:b/>
-                <w:i w:val="0"/>
-                <w:sz w:val="20"/>
-              </w:rPr>
-              <w:t>Mục đích</w:t>
-            </w:r>
-          </w:p>
-        </w:tc>
-      </w:tr>
-      <w:tr>
-        <w:tc>
-          <w:tcPr>
-            <w:tcW w:type="dxa" w:w="907"/>
-          </w:tcPr>
-          <w:p>
-            <w:pPr>
-              <w:spacing w:after="20"/>
-            </w:pPr>
-            <w:r/>
-            <w:r>
-              <w:rPr>
-                <w:b w:val="0"/>
-                <w:i w:val="0"/>
-                <w:sz w:val="20"/>
-              </w:rPr>
-              <w:t>META</w:t>
-            </w:r>
-          </w:p>
-        </w:tc>
-        <w:tc>
-          <w:tcPr>
-            <w:tcW w:type="dxa" w:w="1871"/>
-          </w:tcPr>
-          <w:p>
-            <w:pPr>
-              <w:spacing w:after="20"/>
-            </w:pPr>
-            <w:r/>
-            <w:r>
-              <w:rPr>
-                <w:b w:val="0"/>
-                <w:i w:val="0"/>
-                <w:sz w:val="20"/>
-              </w:rPr>
-              <w:t>Sender → nhóm</w:t>
-            </w:r>
-          </w:p>
-        </w:tc>
-        <w:tc>
-          <w:tcPr>
-            <w:tcW w:type="dxa" w:w="3742"/>
-          </w:tcPr>
-          <w:p>
-            <w:pPr>
-              <w:spacing w:after="20"/>
-            </w:pPr>
-            <w:r/>
-            <w:r>
-              <w:rPr>
-                <w:b w:val="0"/>
-                <w:i w:val="0"/>
-                <w:sz w:val="20"/>
-              </w:rPr>
-              <w:t>tên file, kích thước, chunkSize, tổng số gói, SHA-256, cổng điều khiển</w:t>
-            </w:r>
-          </w:p>
-        </w:tc>
-        <w:tc>
-          <w:tcPr>
-            <w:tcW w:type="dxa" w:w="3118"/>
-          </w:tcPr>
-          <w:p>
-            <w:pPr>
-              <w:spacing w:after="20"/>
-            </w:pPr>
-            <w:r/>
-            <w:r>
-              <w:rPr>
-                <w:b w:val="0"/>
-                <w:i w:val="0"/>
-                <w:sz w:val="20"/>
-              </w:rPr>
-              <w:t>Máy nhận biết cần tái tạo file gì; nhắc lại định kỳ</w:t>
-            </w:r>
-          </w:p>
-        </w:tc>
-      </w:tr>
-      <w:tr>
-        <w:tc>
-          <w:tcPr>
-            <w:tcW w:type="dxa" w:w="907"/>
-          </w:tcPr>
-          <w:p>
-            <w:pPr>
-              <w:spacing w:after="20"/>
-            </w:pPr>
-            <w:r/>
-            <w:r>
-              <w:rPr>
-                <w:b w:val="0"/>
-                <w:i w:val="0"/>
-                <w:sz w:val="20"/>
-              </w:rPr>
-              <w:t>DATA</w:t>
-            </w:r>
-          </w:p>
-        </w:tc>
-        <w:tc>
-          <w:tcPr>
-            <w:tcW w:type="dxa" w:w="1871"/>
-          </w:tcPr>
-          <w:p>
-            <w:pPr>
-              <w:spacing w:after="20"/>
-            </w:pPr>
-            <w:r/>
-            <w:r>
-              <w:rPr>
-                <w:b w:val="0"/>
-                <w:i w:val="0"/>
-                <w:sz w:val="20"/>
-              </w:rPr>
-              <w:t>Sender → nhóm</w:t>
-            </w:r>
-          </w:p>
-        </w:tc>
-        <w:tc>
-          <w:tcPr>
-            <w:tcW w:type="dxa" w:w="3742"/>
-          </w:tcPr>
-          <w:p>
-            <w:pPr>
-              <w:spacing w:after="20"/>
-            </w:pPr>
-            <w:r/>
-            <w:r>
-              <w:rPr>
-                <w:b w:val="0"/>
-                <w:i w:val="0"/>
-                <w:sz w:val="20"/>
-              </w:rPr>
-              <w:t>seq, tổng số gói, offset, CRC32, độ dài, 1024 byte dữ liệu</w:t>
-            </w:r>
-          </w:p>
-        </w:tc>
-        <w:tc>
-          <w:tcPr>
-            <w:tcW w:type="dxa" w:w="3118"/>
-          </w:tcPr>
-          <w:p>
-            <w:pPr>
-              <w:spacing w:after="20"/>
-            </w:pPr>
-            <w:r/>
-            <w:r>
-              <w:rPr>
-                <w:b w:val="0"/>
-                <w:i w:val="0"/>
-                <w:sz w:val="20"/>
-              </w:rPr>
-              <w:t>Chia nhỏ file, đánh số thứ tự</w:t>
-            </w:r>
-          </w:p>
-        </w:tc>
-      </w:tr>
-      <w:tr>
-        <w:tc>
-          <w:tcPr>
-            <w:tcW w:type="dxa" w:w="907"/>
-          </w:tcPr>
-          <w:p>
-            <w:pPr>
-              <w:spacing w:after="20"/>
-            </w:pPr>
-            <w:r/>
-            <w:r>
-              <w:rPr>
-                <w:b w:val="0"/>
-                <w:i w:val="0"/>
-                <w:sz w:val="20"/>
-              </w:rPr>
-              <w:t>END</w:t>
-            </w:r>
-          </w:p>
-        </w:tc>
-        <w:tc>
-          <w:tcPr>
-            <w:tcW w:type="dxa" w:w="1871"/>
-          </w:tcPr>
-          <w:p>
-            <w:pPr>
-              <w:spacing w:after="20"/>
-            </w:pPr>
-            <w:r/>
-            <w:r>
-              <w:rPr>
-                <w:b w:val="0"/>
-                <w:i w:val="0"/>
-                <w:sz w:val="20"/>
-              </w:rPr>
-              <w:t>Sender → nhóm</w:t>
-            </w:r>
-          </w:p>
-        </w:tc>
-        <w:tc>
-          <w:tcPr>
-            <w:tcW w:type="dxa" w:w="3742"/>
-          </w:tcPr>
-          <w:p>
-            <w:pPr>
-              <w:spacing w:after="20"/>
-            </w:pPr>
-            <w:r/>
-            <w:r>
-              <w:rPr>
-                <w:b w:val="0"/>
-                <w:i w:val="0"/>
-                <w:sz w:val="20"/>
-              </w:rPr>
-              <w:t>tổng số gói, cổng điều khiển</w:t>
-            </w:r>
-          </w:p>
-        </w:tc>
-        <w:tc>
-          <w:tcPr>
-            <w:tcW w:type="dxa" w:w="3118"/>
-          </w:tcPr>
-          <w:p>
-            <w:pPr>
-              <w:spacing w:after="20"/>
-            </w:pPr>
-            <w:r/>
-            <w:r>
-              <w:rPr>
-                <w:b w:val="0"/>
-                <w:i w:val="0"/>
-                <w:sz w:val="20"/>
-              </w:rPr>
-              <w:t>Báo đã gửi xong một lượt</w:t>
-            </w:r>
-          </w:p>
-        </w:tc>
-      </w:tr>
-      <w:tr>
-        <w:tc>
-          <w:tcPr>
-            <w:tcW w:type="dxa" w:w="907"/>
-          </w:tcPr>
-          <w:p>
-            <w:pPr>
-              <w:spacing w:after="20"/>
-            </w:pPr>
-            <w:r/>
-            <w:r>
-              <w:rPr>
-                <w:b w:val="0"/>
-                <w:i w:val="0"/>
-                <w:sz w:val="20"/>
-              </w:rPr>
-              <w:t>NACK</w:t>
-            </w:r>
-          </w:p>
-        </w:tc>
-        <w:tc>
-          <w:tcPr>
-            <w:tcW w:type="dxa" w:w="1871"/>
-          </w:tcPr>
-          <w:p>
-            <w:pPr>
-              <w:spacing w:after="20"/>
-            </w:pPr>
-            <w:r/>
-            <w:r>
-              <w:rPr>
-                <w:b w:val="0"/>
-                <w:i w:val="0"/>
-                <w:sz w:val="20"/>
-              </w:rPr>
-              <w:t>Receiver → Sender (unicast)</w:t>
-            </w:r>
-          </w:p>
-        </w:tc>
-        <w:tc>
-          <w:tcPr>
-            <w:tcW w:type="dxa" w:w="3742"/>
-          </w:tcPr>
-          <w:p>
-            <w:pPr>
-              <w:spacing w:after="20"/>
-            </w:pPr>
-            <w:r/>
-            <w:r>
-              <w:rPr>
-                <w:b w:val="0"/>
-                <w:i w:val="0"/>
-                <w:sz w:val="20"/>
-              </w:rPr>
-              <w:t>mã máy nhận, danh sách seq còn thiếu (≤ 256/gói)</w:t>
-            </w:r>
-          </w:p>
-        </w:tc>
-        <w:tc>
-          <w:tcPr>
-            <w:tcW w:type="dxa" w:w="3118"/>
-          </w:tcPr>
-          <w:p>
-            <w:pPr>
-              <w:spacing w:after="20"/>
-            </w:pPr>
-            <w:r/>
-            <w:r>
-              <w:rPr>
-                <w:b w:val="0"/>
-                <w:i w:val="0"/>
-                <w:sz w:val="20"/>
-              </w:rPr>
-              <w:t>Xin gửi lại gói bị mất</w:t>
-            </w:r>
-          </w:p>
-        </w:tc>
-      </w:tr>
-      <w:tr>
-        <w:tc>
-          <w:tcPr>
-            <w:tcW w:type="dxa" w:w="907"/>
-          </w:tcPr>
-          <w:p>
-            <w:pPr>
-              <w:spacing w:after="20"/>
-            </w:pPr>
-            <w:r/>
-            <w:r>
-              <w:rPr>
-                <w:b w:val="0"/>
-                <w:i w:val="0"/>
-                <w:sz w:val="20"/>
-              </w:rPr>
-              <w:t>DONE</w:t>
-            </w:r>
-          </w:p>
-        </w:tc>
-        <w:tc>
-          <w:tcPr>
-            <w:tcW w:type="dxa" w:w="1871"/>
-          </w:tcPr>
-          <w:p>
-            <w:pPr>
-              <w:spacing w:after="20"/>
-            </w:pPr>
-            <w:r/>
-            <w:r>
-              <w:rPr>
-                <w:b w:val="0"/>
-                <w:i w:val="0"/>
-                <w:sz w:val="20"/>
-              </w:rPr>
-              <w:t>Receiver → Sender (unicast)</w:t>
-            </w:r>
-          </w:p>
-        </w:tc>
-        <w:tc>
-          <w:tcPr>
-            <w:tcW w:type="dxa" w:w="3742"/>
-          </w:tcPr>
-          <w:p>
-            <w:pPr>
-              <w:spacing w:after="20"/>
-            </w:pPr>
-            <w:r/>
-            <w:r>
-              <w:rPr>
-                <w:b w:val="0"/>
-                <w:i w:val="0"/>
-                <w:sz w:val="20"/>
-              </w:rPr>
-              <w:t>mã máy nhận</w:t>
-            </w:r>
-          </w:p>
-        </w:tc>
-        <w:tc>
-          <w:tcPr>
-            <w:tcW w:type="dxa" w:w="3118"/>
-          </w:tcPr>
-          <w:p>
-            <w:pPr>
-              <w:spacing w:after="20"/>
-            </w:pPr>
-            <w:r/>
-            <w:r>
-              <w:rPr>
-                <w:b w:val="0"/>
-                <w:i w:val="0"/>
-                <w:sz w:val="20"/>
-              </w:rPr>
-              <w:t>Đã nhận đủ, SHA-256 khớp</w:t>
-            </w:r>
-          </w:p>
-        </w:tc>
-      </w:tr>
-    </w:tbl>
-    <w:p>
-      <w:pPr>
-        <w:spacing w:after="40"/>
-      </w:pPr>
-    </w:p>
-    <w:p>
-      <w:pPr>
-        <w:spacing w:after="40" w:before="120"/>
-      </w:pPr>
-      <w:r>
-        <w:rPr>
-          <w:b/>
-          <w:i w:val="0"/>
-        </w:rPr>
-        <w:t>Cách giải quyết các vấn đề kỹ thuật</w:t>
+        <w:t xml:space="preserve"> FileReceiver ghi mỗi gói vào đúng vị trí offset bằng RandomAccessFile, nên gói đến lộn xộn vẫn vào đúng chỗ. Một BitSet đánh dấu gói đã nhận để bỏ gói trùng. Đủ gói thì kiểm tra SHA-256 rồi lưu file với tên gốc.</w:t>
       </w:r>
     </w:p>
     <w:p>
@@ -5545,654 +4755,58 @@
           <w:b/>
           <w:i w:val="0"/>
         </w:rPr>
-        <w:t>Chia file thành gói nhỏ:</w:t>
+        <w:t>Xử lý mất gói:</w:t>
       </w:r>
       <w:r>
         <w:rPr>
           <w:b w:val="0"/>
           <w:i w:val="0"/>
         </w:rPr>
-        <w:t xml:space="preserve"> mỗi gói 1024 byte dữ liệu (+ ~45 byte header) &lt; MTU nên không bị phân mảnh; bên gửi đọc bằng RandomAccessFile nên gửi lại gói bất kỳ không cần nạp cả file vào RAM.</w:t>
-      </w:r>
-    </w:p>
-    <w:p>
-      <w:pPr>
-        <w:tabs>
-          <w:tab w:pos="454" w:val="left"/>
-        </w:tabs>
-        <w:spacing w:after="40"/>
-        <w:ind w:left="454" w:hanging="283"/>
-      </w:pPr>
-      <w:r>
-        <w:rPr>
-          <w:b w:val="0"/>
-          <w:i w:val="0"/>
-        </w:rPr>
-        <w:t>•</w:t>
-        <w:tab/>
+        <w:t xml:space="preserve"> khi nhận END mà còn thiếu gói, máy nhận gửi </w:t>
       </w:r>
       <w:r>
         <w:rPr>
           <w:b/>
           <w:i w:val="0"/>
         </w:rPr>
-        <w:t>Kiểm soát thứ tự:</w:t>
+        <w:t>NACK</w:t>
       </w:r>
       <w:r>
         <w:rPr>
           <w:b w:val="0"/>
           <w:i w:val="0"/>
         </w:rPr>
-        <w:t xml:space="preserve"> mỗi gói có seq và offset; máy nhận ghi thẳng vào đúng vị trí bằng RandomAccessFile.seek(offset), vì vậy gói đến lộn xộn hay được gửi lại sau vẫn vào đúng chỗ. BitSet đánh dấu gói đã có → bỏ gói trùng.</w:t>
-      </w:r>
-    </w:p>
-    <w:p>
-      <w:pPr>
-        <w:tabs>
-          <w:tab w:pos="454" w:val="left"/>
-        </w:tabs>
-        <w:spacing w:after="40"/>
-        <w:ind w:left="454" w:hanging="283"/>
-      </w:pPr>
-      <w:r>
-        <w:rPr>
-          <w:b w:val="0"/>
-          <w:i w:val="0"/>
-        </w:rPr>
-        <w:t>•</w:t>
-        <w:tab/>
+        <w:t xml:space="preserve"> (danh sách số thứ tự còn thiếu) về cổng 4445 của máy gửi. Máy gửi phát lại các gói đó qua multicast. Lặp lại cho đến khi đủ; máy nhận xong thì gửi </w:t>
       </w:r>
       <w:r>
         <w:rPr>
           <w:b/>
           <w:i w:val="0"/>
         </w:rPr>
-        <w:t>Tái cấu trúc file:</w:t>
+        <w:t>DONE</w:t>
       </w:r>
       <w:r>
         <w:rPr>
           <w:b w:val="0"/>
           <w:i w:val="0"/>
         </w:rPr>
-        <w:t xml:space="preserve"> ghi vào file tạm &lt;fileId&gt;.part; khi đủ tất cả gói thì cắt đúng kích thước, so sánh SHA-256 với META, khớp mới đổi tên thành tên file gốc.</w:t>
+        <w:t>.</w:t>
       </w:r>
     </w:p>
     <w:p>
-      <w:pPr>
-        <w:tabs>
-          <w:tab w:pos="454" w:val="left"/>
-        </w:tabs>
-        <w:spacing w:after="40"/>
-        <w:ind w:left="454" w:hanging="283"/>
-      </w:pPr>
-      <w:r>
-        <w:rPr>
-          <w:b w:val="0"/>
-          <w:i w:val="0"/>
-        </w:rPr>
-        <w:t>•</w:t>
-        <w:tab/>
-      </w:r>
       <w:r>
         <w:rPr>
           <w:b/>
           <w:i w:val="0"/>
         </w:rPr>
-        <w:t>Xử lý mất gói (NACK – Negative ACK):</w:t>
+        <w:t>Thử nghiệm:</w:t>
       </w:r>
       <w:r>
         <w:rPr>
           <w:b w:val="0"/>
           <w:i w:val="0"/>
         </w:rPr>
-        <w:t xml:space="preserve"> sau END, hoặc 1 giây không có gói mới mà vẫn thiếu, máy nhận gửi NACK liệt kê các seq thiếu về cổng 4445 của máy gửi. Máy gửi phát lại các gói đó qua multicast (máy khác đã có sẽ tự bỏ qua), chống gửi trùng khi nhiều máy cùng xin trong 100 ms. Gói sai CRC32 được coi như mất. Dùng NACK thay vì ACK từng gói để tránh “bùng nổ ACK” khi có nhiều máy nhận.</w:t>
-      </w:r>
-    </w:p>
-    <w:p>
-      <w:pPr>
-        <w:tabs>
-          <w:tab w:pos="454" w:val="left"/>
-        </w:tabs>
-        <w:spacing w:after="40"/>
-        <w:ind w:left="454" w:hanging="283"/>
-      </w:pPr>
-      <w:r>
-        <w:rPr>
-          <w:b w:val="0"/>
-          <w:i w:val="0"/>
-        </w:rPr>
-        <w:t>•</w:t>
-        <w:tab/>
-      </w:r>
-      <w:r>
-        <w:rPr>
-          <w:b/>
-          <w:i w:val="0"/>
-        </w:rPr>
-        <w:t>Điều tiết tốc độ:</w:t>
-      </w:r>
-      <w:r>
-        <w:rPr>
-          <w:b w:val="0"/>
-          <w:i w:val="0"/>
-        </w:rPr>
-        <w:t xml:space="preserve"> cứ 32 gói nghỉ 2 ms; máy nhận tăng bộ đệm nhận lên 4 MB. META được nhắc lại mỗi 512 gói và trong giai đoạn sửa lỗi để máy vào muộn/lỡ META vẫn nhận được. Máy gửi kết thúc khi đủ số máy báo DONE hoặc 5 giây không còn NACK.</w:t>
-      </w:r>
-    </w:p>
-    <w:p>
-      <w:pPr>
-        <w:tabs>
-          <w:tab w:pos="454" w:val="left"/>
-        </w:tabs>
-        <w:spacing w:after="40"/>
-        <w:ind w:left="454" w:hanging="283"/>
-      </w:pPr>
-      <w:r>
-        <w:rPr>
-          <w:b w:val="0"/>
-          <w:i w:val="0"/>
-        </w:rPr>
-        <w:t>•</w:t>
-        <w:tab/>
-      </w:r>
-      <w:r>
-        <w:rPr>
-          <w:b/>
-          <w:i w:val="0"/>
-        </w:rPr>
-        <w:t>Giả lập mất gói để kiểm thử:</w:t>
-      </w:r>
-      <w:r>
-        <w:rPr>
-          <w:b w:val="0"/>
-          <w:i w:val="0"/>
-        </w:rPr>
-        <w:t xml:space="preserve"> tham số tiLeMatGoiGiaLap cho máy nhận chủ động bỏ một tỉ lệ gói DATA.</w:t>
-      </w:r>
-    </w:p>
-    <w:p>
-      <w:pPr>
-        <w:spacing w:after="40" w:before="120"/>
-      </w:pPr>
-      <w:r>
-        <w:rPr>
-          <w:b/>
-          <w:i w:val="0"/>
-        </w:rPr>
-        <w:t>Mã nguồn chính</w:t>
-      </w:r>
-    </w:p>
-    <w:tbl>
-      <w:tblPr>
-        <w:tblStyle w:val="TableGrid"/>
-        <w:tblW w:type="auto" w:w="0"/>
-        <w:tblLook w:firstColumn="1" w:firstRow="1" w:lastColumn="0" w:lastRow="0" w:noHBand="0" w:noVBand="1" w:val="04A0"/>
-      </w:tblPr>
-      <w:tblGrid>
-        <w:gridCol w:w="9638"/>
-      </w:tblGrid>
-      <w:tr>
-        <w:tc>
-          <w:tcPr>
-            <w:tcW w:type="dxa" w:w="9638"/>
-            <w:shd w:val="clear" w:color="auto" w:fill="F2F2F2"/>
-          </w:tcPr>
-          <w:p>
-            <w:pPr>
-              <w:spacing w:after="0" w:line="240" w:lineRule="auto"/>
-            </w:pPr>
-            <w:r/>
-            <w:r>
-              <w:rPr>
-                <w:rFonts w:ascii="Consolas" w:hAnsi="Consolas" w:eastAsia="Consolas"/>
-                <w:sz w:val="18"/>
-              </w:rPr>
-              <w:t>private void onData(FileProtocol.Packet pk) throws IOException {</w:t>
-              <w:br/>
-            </w:r>
-            <w:r>
-              <w:rPr>
-                <w:rFonts w:ascii="Consolas" w:hAnsi="Consolas" w:eastAsia="Consolas"/>
-                <w:sz w:val="18"/>
-              </w:rPr>
-              <w:t xml:space="preserve">    ensureStorage(pk.totalChunks);</w:t>
-              <w:br/>
-            </w:r>
-            <w:r>
-              <w:rPr>
-                <w:rFonts w:ascii="Consolas" w:hAnsi="Consolas" w:eastAsia="Consolas"/>
-                <w:sz w:val="18"/>
-              </w:rPr>
-              <w:t xml:space="preserve">    if (pk.seq &lt; 0 || pk.seq &gt;= totalChunks) {</w:t>
-              <w:br/>
-            </w:r>
-            <w:r>
-              <w:rPr>
-                <w:rFonts w:ascii="Consolas" w:hAnsi="Consolas" w:eastAsia="Consolas"/>
-                <w:sz w:val="18"/>
-              </w:rPr>
-              <w:t xml:space="preserve">        return;</w:t>
-              <w:br/>
-            </w:r>
-            <w:r>
-              <w:rPr>
-                <w:rFonts w:ascii="Consolas" w:hAnsi="Consolas" w:eastAsia="Consolas"/>
-                <w:sz w:val="18"/>
-              </w:rPr>
-              <w:t xml:space="preserve">    }</w:t>
-              <w:br/>
-            </w:r>
-            <w:r>
-              <w:rPr>
-                <w:rFonts w:ascii="Consolas" w:hAnsi="Consolas" w:eastAsia="Consolas"/>
-                <w:sz w:val="18"/>
-              </w:rPr>
-              <w:t xml:space="preserve">    if (received.get(pk.seq)) {</w:t>
-              <w:br/>
-            </w:r>
-            <w:r>
-              <w:rPr>
-                <w:rFonts w:ascii="Consolas" w:hAnsi="Consolas" w:eastAsia="Consolas"/>
-                <w:sz w:val="18"/>
-              </w:rPr>
-              <w:t xml:space="preserve">        duplicates++; // goi gui lai cho may khac, minh da co roi</w:t>
-              <w:br/>
-            </w:r>
-            <w:r>
-              <w:rPr>
-                <w:rFonts w:ascii="Consolas" w:hAnsi="Consolas" w:eastAsia="Consolas"/>
-                <w:sz w:val="18"/>
-              </w:rPr>
-              <w:t xml:space="preserve">        return;</w:t>
-              <w:br/>
-            </w:r>
-            <w:r>
-              <w:rPr>
-                <w:rFonts w:ascii="Consolas" w:hAnsi="Consolas" w:eastAsia="Consolas"/>
-                <w:sz w:val="18"/>
-              </w:rPr>
-              <w:t xml:space="preserve">    }</w:t>
-              <w:br/>
-            </w:r>
-            <w:r>
-              <w:rPr>
-                <w:rFonts w:ascii="Consolas" w:hAnsi="Consolas" w:eastAsia="Consolas"/>
-                <w:sz w:val="18"/>
-              </w:rPr>
-              <w:t xml:space="preserve">    if (lossRate &gt; 0 &amp;&amp; random.nextDouble() &lt; lossRate) {</w:t>
-              <w:br/>
-            </w:r>
-            <w:r>
-              <w:rPr>
-                <w:rFonts w:ascii="Consolas" w:hAnsi="Consolas" w:eastAsia="Consolas"/>
-                <w:sz w:val="18"/>
-              </w:rPr>
-              <w:t xml:space="preserve">        dropped++; // gia lap mat goi</w:t>
-              <w:br/>
-            </w:r>
-            <w:r>
-              <w:rPr>
-                <w:rFonts w:ascii="Consolas" w:hAnsi="Consolas" w:eastAsia="Consolas"/>
-                <w:sz w:val="18"/>
-              </w:rPr>
-              <w:t xml:space="preserve">        return;</w:t>
-              <w:br/>
-            </w:r>
-            <w:r>
-              <w:rPr>
-                <w:rFonts w:ascii="Consolas" w:hAnsi="Consolas" w:eastAsia="Consolas"/>
-                <w:sz w:val="18"/>
-              </w:rPr>
-              <w:t xml:space="preserve">    }</w:t>
-              <w:br/>
-            </w:r>
-            <w:r>
-              <w:rPr>
-                <w:rFonts w:ascii="Consolas" w:hAnsi="Consolas" w:eastAsia="Consolas"/>
-                <w:sz w:val="18"/>
-              </w:rPr>
-              <w:t xml:space="preserve">    crc.reset();</w:t>
-              <w:br/>
-            </w:r>
-            <w:r>
-              <w:rPr>
-                <w:rFonts w:ascii="Consolas" w:hAnsi="Consolas" w:eastAsia="Consolas"/>
-                <w:sz w:val="18"/>
-              </w:rPr>
-              <w:t xml:space="preserve">    crc.update(pk.data);</w:t>
-              <w:br/>
-            </w:r>
-            <w:r>
-              <w:rPr>
-                <w:rFonts w:ascii="Consolas" w:hAnsi="Consolas" w:eastAsia="Consolas"/>
-                <w:sz w:val="18"/>
-              </w:rPr>
-              <w:t xml:space="preserve">    if (crc.getValue() != pk.crc32) {</w:t>
-              <w:br/>
-            </w:r>
-            <w:r>
-              <w:rPr>
-                <w:rFonts w:ascii="Consolas" w:hAnsi="Consolas" w:eastAsia="Consolas"/>
-                <w:sz w:val="18"/>
-              </w:rPr>
-              <w:t xml:space="preserve">        corrupted++; // du lieu hong -&gt; coi nhu mat, se xin lai bang NACK</w:t>
-              <w:br/>
-            </w:r>
-            <w:r>
-              <w:rPr>
-                <w:rFonts w:ascii="Consolas" w:hAnsi="Consolas" w:eastAsia="Consolas"/>
-                <w:sz w:val="18"/>
-              </w:rPr>
-              <w:t xml:space="preserve">        return;</w:t>
-              <w:br/>
-            </w:r>
-            <w:r>
-              <w:rPr>
-                <w:rFonts w:ascii="Consolas" w:hAnsi="Consolas" w:eastAsia="Consolas"/>
-                <w:sz w:val="18"/>
-              </w:rPr>
-              <w:t xml:space="preserve">    }</w:t>
-              <w:br/>
-            </w:r>
-            <w:r>
-              <w:rPr>
-                <w:rFonts w:ascii="Consolas" w:hAnsi="Consolas" w:eastAsia="Consolas"/>
-                <w:sz w:val="18"/>
-              </w:rPr>
-              <w:t xml:space="preserve">    raf.seek(pk.offset); // ghi dung vi tri -&gt; dam bao thu tu du goi den lon xon</w:t>
-              <w:br/>
-            </w:r>
-            <w:r>
-              <w:rPr>
-                <w:rFonts w:ascii="Consolas" w:hAnsi="Consolas" w:eastAsia="Consolas"/>
-                <w:sz w:val="18"/>
-              </w:rPr>
-              <w:t xml:space="preserve">    raf.write(pk.data);</w:t>
-              <w:br/>
-            </w:r>
-            <w:r>
-              <w:rPr>
-                <w:rFonts w:ascii="Consolas" w:hAnsi="Consolas" w:eastAsia="Consolas"/>
-                <w:sz w:val="18"/>
-              </w:rPr>
-              <w:t xml:space="preserve">    received.set(pk.seq);</w:t>
-              <w:br/>
-            </w:r>
-            <w:r>
-              <w:rPr>
-                <w:rFonts w:ascii="Consolas" w:hAnsi="Consolas" w:eastAsia="Consolas"/>
-                <w:sz w:val="18"/>
-              </w:rPr>
-              <w:t xml:space="preserve">    receivedCount++;</w:t>
-              <w:br/>
-            </w:r>
-            <w:r>
-              <w:rPr>
-                <w:rFonts w:ascii="Consolas" w:hAnsi="Consolas" w:eastAsia="Consolas"/>
-                <w:sz w:val="18"/>
-              </w:rPr>
-              <w:t xml:space="preserve">    ...</w:t>
-              <w:br/>
-            </w:r>
-            <w:r>
-              <w:rPr>
-                <w:rFonts w:ascii="Consolas" w:hAnsi="Consolas" w:eastAsia="Consolas"/>
-                <w:sz w:val="18"/>
-              </w:rPr>
-              <w:t>}</w:t>
-            </w:r>
-          </w:p>
-        </w:tc>
-      </w:tr>
-    </w:tbl>
-    <w:p>
-      <w:pPr>
-        <w:spacing w:after="40"/>
-      </w:pPr>
-    </w:p>
-    <w:tbl>
-      <w:tblPr>
-        <w:tblStyle w:val="TableGrid"/>
-        <w:tblW w:type="auto" w:w="0"/>
-        <w:tblLook w:firstColumn="1" w:firstRow="1" w:lastColumn="0" w:lastRow="0" w:noHBand="0" w:noVBand="1" w:val="04A0"/>
-      </w:tblPr>
-      <w:tblGrid>
-        <w:gridCol w:w="9638"/>
-      </w:tblGrid>
-      <w:tr>
-        <w:tc>
-          <w:tcPr>
-            <w:tcW w:type="dxa" w:w="9638"/>
-            <w:shd w:val="clear" w:color="auto" w:fill="F2F2F2"/>
-          </w:tcPr>
-          <w:p>
-            <w:pPr>
-              <w:spacing w:after="0" w:line="240" w:lineRule="auto"/>
-            </w:pPr>
-            <w:r/>
-            <w:r>
-              <w:rPr>
-                <w:rFonts w:ascii="Consolas" w:hAnsi="Consolas" w:eastAsia="Consolas"/>
-                <w:sz w:val="18"/>
-              </w:rPr>
-              <w:t>int seq = received.nextClearBit(0);</w:t>
-              <w:br/>
-            </w:r>
-            <w:r>
-              <w:rPr>
-                <w:rFonts w:ascii="Consolas" w:hAnsi="Consolas" w:eastAsia="Consolas"/>
-                <w:sz w:val="18"/>
-              </w:rPr>
-              <w:t>for (int n = 0; n &lt; MAX_NACK_PACKETS &amp;&amp; seq &lt; totalChunks; n++) {</w:t>
-              <w:br/>
-            </w:r>
-            <w:r>
-              <w:rPr>
-                <w:rFonts w:ascii="Consolas" w:hAnsi="Consolas" w:eastAsia="Consolas"/>
-                <w:sz w:val="18"/>
-              </w:rPr>
-              <w:t xml:space="preserve">    List&lt;Integer&gt; missing = new ArrayList&lt;&gt;();</w:t>
-              <w:br/>
-            </w:r>
-            <w:r>
-              <w:rPr>
-                <w:rFonts w:ascii="Consolas" w:hAnsi="Consolas" w:eastAsia="Consolas"/>
-                <w:sz w:val="18"/>
-              </w:rPr>
-              <w:t xml:space="preserve">    while (seq &lt; totalChunks &amp;&amp; missing.size() &lt; FileProtocol.MAX_NACK_SEQS) {</w:t>
-              <w:br/>
-            </w:r>
-            <w:r>
-              <w:rPr>
-                <w:rFonts w:ascii="Consolas" w:hAnsi="Consolas" w:eastAsia="Consolas"/>
-                <w:sz w:val="18"/>
-              </w:rPr>
-              <w:t xml:space="preserve">        missing.add(seq);</w:t>
-              <w:br/>
-            </w:r>
-            <w:r>
-              <w:rPr>
-                <w:rFonts w:ascii="Consolas" w:hAnsi="Consolas" w:eastAsia="Consolas"/>
-                <w:sz w:val="18"/>
-              </w:rPr>
-              <w:t xml:space="preserve">        seq = received.nextClearBit(seq + 1);</w:t>
-              <w:br/>
-            </w:r>
-            <w:r>
-              <w:rPr>
-                <w:rFonts w:ascii="Consolas" w:hAnsi="Consolas" w:eastAsia="Consolas"/>
-                <w:sz w:val="18"/>
-              </w:rPr>
-              <w:t xml:space="preserve">    }</w:t>
-              <w:br/>
-            </w:r>
-            <w:r>
-              <w:rPr>
-                <w:rFonts w:ascii="Consolas" w:hAnsi="Consolas" w:eastAsia="Consolas"/>
-                <w:sz w:val="18"/>
-              </w:rPr>
-              <w:t xml:space="preserve">    byte[] data = FileProtocol.nack(fileId, receiverId, missing);</w:t>
-              <w:br/>
-            </w:r>
-            <w:r>
-              <w:rPr>
-                <w:rFonts w:ascii="Consolas" w:hAnsi="Consolas" w:eastAsia="Consolas"/>
-                <w:sz w:val="18"/>
-              </w:rPr>
-              <w:t xml:space="preserve">    socket.send(new DatagramPacket(data, data.length, senderAddr, controlPort));</w:t>
-              <w:br/>
-            </w:r>
-            <w:r>
-              <w:rPr>
-                <w:rFonts w:ascii="Consolas" w:hAnsi="Consolas" w:eastAsia="Consolas"/>
-                <w:sz w:val="18"/>
-              </w:rPr>
-              <w:t xml:space="preserve">    nackCount++;</w:t>
-              <w:br/>
-            </w:r>
-            <w:r>
-              <w:rPr>
-                <w:rFonts w:ascii="Consolas" w:hAnsi="Consolas" w:eastAsia="Consolas"/>
-                <w:sz w:val="18"/>
-              </w:rPr>
-              <w:t>}</w:t>
-            </w:r>
-          </w:p>
-        </w:tc>
-      </w:tr>
-    </w:tbl>
-    <w:p>
-      <w:pPr>
-        <w:spacing w:after="40"/>
-      </w:pPr>
-    </w:p>
-    <w:tbl>
-      <w:tblPr>
-        <w:tblStyle w:val="TableGrid"/>
-        <w:tblW w:type="auto" w:w="0"/>
-        <w:tblLook w:firstColumn="1" w:firstRow="1" w:lastColumn="0" w:lastRow="0" w:noHBand="0" w:noVBand="1" w:val="04A0"/>
-      </w:tblPr>
-      <w:tblGrid>
-        <w:gridCol w:w="9638"/>
-      </w:tblGrid>
-      <w:tr>
-        <w:tc>
-          <w:tcPr>
-            <w:tcW w:type="dxa" w:w="9638"/>
-            <w:shd w:val="clear" w:color="auto" w:fill="F2F2F2"/>
-          </w:tcPr>
-          <w:p>
-            <w:pPr>
-              <w:spacing w:after="0" w:line="240" w:lineRule="auto"/>
-            </w:pPr>
-            <w:r/>
-            <w:r>
-              <w:rPr>
-                <w:rFonts w:ascii="Consolas" w:hAnsi="Consolas" w:eastAsia="Consolas"/>
-                <w:sz w:val="18"/>
-              </w:rPr>
-              <w:t>if (pk.type == FileProtocol.NACK) {</w:t>
-              <w:br/>
-            </w:r>
-            <w:r>
-              <w:rPr>
-                <w:rFonts w:ascii="Consolas" w:hAnsi="Consolas" w:eastAsia="Consolas"/>
-                <w:sz w:val="18"/>
-              </w:rPr>
-              <w:t xml:space="preserve">    int count = 0;</w:t>
-              <w:br/>
-            </w:r>
-            <w:r>
-              <w:rPr>
-                <w:rFonts w:ascii="Consolas" w:hAnsi="Consolas" w:eastAsia="Consolas"/>
-                <w:sz w:val="18"/>
-              </w:rPr>
-              <w:t xml:space="preserve">    for (int seq : pk.missing) {</w:t>
-              <w:br/>
-            </w:r>
-            <w:r>
-              <w:rPr>
-                <w:rFonts w:ascii="Consolas" w:hAnsi="Consolas" w:eastAsia="Consolas"/>
-                <w:sz w:val="18"/>
-              </w:rPr>
-              <w:t xml:space="preserve">        if (seq &gt;= 0 &amp;&amp; seq &lt; totalChunks</w:t>
-              <w:br/>
-            </w:r>
-            <w:r>
-              <w:rPr>
-                <w:rFonts w:ascii="Consolas" w:hAnsi="Consolas" w:eastAsia="Consolas"/>
-                <w:sz w:val="18"/>
-              </w:rPr>
-              <w:t xml:space="preserve">                &amp;&amp; System.currentTimeMillis() - lastSent[seq] &gt;= RESEND_GUARD_MS) {</w:t>
-              <w:br/>
-            </w:r>
-            <w:r>
-              <w:rPr>
-                <w:rFonts w:ascii="Consolas" w:hAnsi="Consolas" w:eastAsia="Consolas"/>
-                <w:sz w:val="18"/>
-              </w:rPr>
-              <w:t xml:space="preserve">            sendChunk(seq);</w:t>
-              <w:br/>
-            </w:r>
-            <w:r>
-              <w:rPr>
-                <w:rFonts w:ascii="Consolas" w:hAnsi="Consolas" w:eastAsia="Consolas"/>
-                <w:sz w:val="18"/>
-              </w:rPr>
-              <w:t xml:space="preserve">            count++;</w:t>
-              <w:br/>
-            </w:r>
-            <w:r>
-              <w:rPr>
-                <w:rFonts w:ascii="Consolas" w:hAnsi="Consolas" w:eastAsia="Consolas"/>
-                <w:sz w:val="18"/>
-              </w:rPr>
-              <w:t xml:space="preserve">        }</w:t>
-              <w:br/>
-            </w:r>
-            <w:r>
-              <w:rPr>
-                <w:rFonts w:ascii="Consolas" w:hAnsi="Consolas" w:eastAsia="Consolas"/>
-                <w:sz w:val="18"/>
-              </w:rPr>
-              <w:t xml:space="preserve">    }</w:t>
-              <w:br/>
-            </w:r>
-            <w:r>
-              <w:rPr>
-                <w:rFonts w:ascii="Consolas" w:hAnsi="Consolas" w:eastAsia="Consolas"/>
-                <w:sz w:val="18"/>
-              </w:rPr>
-              <w:t xml:space="preserve">    resent += count;</w:t>
-            </w:r>
-          </w:p>
-        </w:tc>
-      </w:tr>
-    </w:tbl>
-    <w:p>
-      <w:pPr>
-        <w:spacing w:after="40"/>
-      </w:pPr>
-    </w:p>
-    <w:p>
-      <w:pPr>
-        <w:spacing w:after="40" w:before="120"/>
-      </w:pPr>
-      <w:r>
-        <w:rPr>
-          <w:b/>
-          <w:i w:val="0"/>
-        </w:rPr>
-        <w:t>Kết quả chạy thử</w:t>
-      </w:r>
-    </w:p>
-    <w:p>
-      <w:r>
-        <w:rPr>
-          <w:b w:val="0"/>
-          <w:i w:val="0"/>
-        </w:rPr>
-        <w:t>File 3.000.000 byte (2930 gói) gửi cùng lúc tới 3 máy nhận: nhan1 (không mất gói), nhan2 (giả lập mất 10%), nhan3 (giả lập mất 30%). Lệnh: java bai08.bt03.FileReceiver nhan1 0 (tương tự nhan2 0.1, nhan3 0.3), sau đó java bai08.bt03.FileSender baocao_demo.pdf 3.</w:t>
+        <w:t xml:space="preserve"> gửi file baocao_demo.pdf (3.000.000 byte, 2930 gói) cùng lúc cho 3 máy nhận. Để kiểm tra cơ chế xử lý mất gói, máy nhan2 được cho bỏ ngẫu nhiên 10% gói và máy nhan3 bỏ 30%. Lệnh chạy: java bai08.bt03.FileReceiver nhan1 0 (tương tự nhan2 0.1, nhan3 0.3), sau đó java bai08.bt03.FileSender baocao_demo.pdf 3.</w:t>
       </w:r>
     </w:p>
     <w:p>
@@ -6204,7 +4818,7 @@
         <w:drawing>
           <wp:inline xmlns:a="http://schemas.openxmlformats.org/drawingml/2006/main" xmlns:pic="http://schemas.openxmlformats.org/drawingml/2006/picture">
             <wp:extent cx="6120000" cy="2302962"/>
-            <wp:docPr id="4" name="Picture 4"/>
+            <wp:docPr id="9" name="Picture 9"/>
             <wp:cNvGraphicFramePr>
               <a:graphicFrameLocks noChangeAspect="1"/>
             </wp:cNvGraphicFramePr>
@@ -6216,7 +4830,7 @@
                     <pic:cNvPicPr/>
                   </pic:nvPicPr>
                   <pic:blipFill>
-                    <a:blip r:embed="rId12"/>
+                    <a:blip r:embed="rId17"/>
                     <a:stretch>
                       <a:fillRect/>
                     </a:stretch>
@@ -6246,8 +4860,103 @@
           <w:i/>
           <w:sz w:val="22"/>
         </w:rPr>
-        <w:t>Hình 3. BT03 – máy gửi: gửi 2930 gói, nhận NACK và gửi lại gói bị mất cho đến khi 3 máy báo DONE</w:t>
+        <w:t>Hình 8. BT03 – Máy gửi</w:t>
       </w:r>
+    </w:p>
+    <w:p>
+      <w:pPr>
+        <w:tabs>
+          <w:tab w:pos="454" w:val="left"/>
+        </w:tabs>
+        <w:spacing w:after="40"/>
+        <w:ind w:left="454" w:hanging="283"/>
+      </w:pPr>
+      <w:r>
+        <w:rPr>
+          <w:b w:val="0"/>
+          <w:i w:val="0"/>
+        </w:rPr>
+        <w:t>•</w:t>
+        <w:tab/>
+        <w:t>Dòng đầu: file được chia thành 2930 gói × 1024 byte; mã SHA-256 này được gửi kèm trong META để máy nhận kiểm tra.</w:t>
+      </w:r>
+    </w:p>
+    <w:p>
+      <w:pPr>
+        <w:tabs>
+          <w:tab w:pos="454" w:val="left"/>
+        </w:tabs>
+        <w:spacing w:after="40"/>
+        <w:ind w:left="454" w:hanging="283"/>
+      </w:pPr>
+      <w:r>
+        <w:rPr>
+          <w:b w:val="0"/>
+          <w:i w:val="0"/>
+        </w:rPr>
+        <w:t>•</w:t>
+        <w:tab/>
+        <w:t>Lượt gửi đầu hết 537 ms, sau đó chuyển sang giai đoạn xử lý mất gói.</w:t>
+      </w:r>
+    </w:p>
+    <w:p>
+      <w:pPr>
+        <w:tabs>
+          <w:tab w:pos="454" w:val="left"/>
+        </w:tabs>
+        <w:spacing w:after="40"/>
+        <w:ind w:left="454" w:hanging="283"/>
+      </w:pPr>
+      <w:r>
+        <w:rPr>
+          <w:b w:val="0"/>
+          <w:i w:val="0"/>
+        </w:rPr>
+        <w:t>•</w:t>
+        <w:tab/>
+        <w:t>Các dòng NACK màu cam: máy nhận #1643017811 (nhan2) và #791661001 (nhan3) xin gửi lại các gói bị mất. Số gói xin giảm dần qua từng vòng (256 → 52 → 3 → 1).</w:t>
+      </w:r>
+    </w:p>
+    <w:p>
+      <w:pPr>
+        <w:tabs>
+          <w:tab w:pos="454" w:val="left"/>
+        </w:tabs>
+        <w:spacing w:after="40"/>
+        <w:ind w:left="454" w:hanging="283"/>
+      </w:pPr>
+      <w:r>
+        <w:rPr>
+          <w:b w:val="0"/>
+          <w:i w:val="0"/>
+        </w:rPr>
+        <w:t>•</w:t>
+        <w:tab/>
+        <w:t>“xin 30 goi, gui lai 0 goi”: các gói này vừa được gửi lại trong vòng 100 ms trước nên không gửi trùng lần nữa.</w:t>
+      </w:r>
+    </w:p>
+    <w:p>
+      <w:pPr>
+        <w:tabs>
+          <w:tab w:pos="454" w:val="left"/>
+        </w:tabs>
+        <w:spacing w:after="40"/>
+        <w:ind w:left="454" w:hanging="283"/>
+      </w:pPr>
+      <w:r>
+        <w:rPr>
+          <w:b w:val="0"/>
+          <w:i w:val="0"/>
+        </w:rPr>
+        <w:t>•</w:t>
+        <w:tab/>
+        <w:t>Cả 3 máy lần lượt báo DONE (1/3, 2/3, 3/3). Tổng cộng gửi lại 1456 gói; máy gửi kết thúc khi đủ 3 máy nhận.</w:t>
+      </w:r>
+    </w:p>
+    <w:p>
+      <w:pPr>
+        <w:spacing w:after="80"/>
+      </w:pPr>
     </w:p>
     <w:p>
       <w:pPr>
@@ -6257,8 +4966,8 @@
       <w:r>
         <w:drawing>
           <wp:inline xmlns:a="http://schemas.openxmlformats.org/drawingml/2006/main" xmlns:pic="http://schemas.openxmlformats.org/drawingml/2006/picture">
-            <wp:extent cx="5400000" cy="4293048"/>
-            <wp:docPr id="5" name="Picture 5"/>
+            <wp:extent cx="6120000" cy="2018182"/>
+            <wp:docPr id="10" name="Picture 10"/>
             <wp:cNvGraphicFramePr>
               <a:graphicFrameLocks noChangeAspect="1"/>
             </wp:cNvGraphicFramePr>
@@ -6266,11 +4975,11 @@
               <a:graphicData uri="http://schemas.openxmlformats.org/drawingml/2006/picture">
                 <pic:pic>
                   <pic:nvPicPr>
-                    <pic:cNvPr id="0" name="bt03_receivers.png"/>
+                    <pic:cNvPr id="0" name="bt03_r1.png"/>
                     <pic:cNvPicPr/>
                   </pic:nvPicPr>
                   <pic:blipFill>
-                    <a:blip r:embed="rId13"/>
+                    <a:blip r:embed="rId18"/>
                     <a:stretch>
                       <a:fillRect/>
                     </a:stretch>
@@ -6278,7 +4987,7 @@
                   <pic:spPr>
                     <a:xfrm>
                       <a:off x="0" y="0"/>
-                      <a:ext cx="5400000" cy="4293048"/>
+                      <a:ext cx="6120000" cy="2018182"/>
                     </a:xfrm>
                     <a:prstGeom prst="rect"/>
                   </pic:spPr>
@@ -6300,8 +5009,257 @@
           <w:i/>
           <w:sz w:val="22"/>
         </w:rPr>
-        <w:t>Hình 4. BT03 – máy nhận không mất gói và máy nhận mất 30% gói đều tái tạo đủ file</w:t>
+        <w:t>Hình 9. BT03 – Máy nhận nhan1 (không mất gói)</w:t>
       </w:r>
+    </w:p>
+    <w:p>
+      <w:pPr>
+        <w:tabs>
+          <w:tab w:pos="454" w:val="left"/>
+        </w:tabs>
+        <w:spacing w:after="40"/>
+        <w:ind w:left="454" w:hanging="283"/>
+      </w:pPr>
+      <w:r>
+        <w:rPr>
+          <w:b w:val="0"/>
+          <w:i w:val="0"/>
+        </w:rPr>
+        <w:t>•</w:t>
+        <w:tab/>
+        <w:t>Máy nhận nhận META (tên file, kích thước, số gói, SHA-256), rồi hiển thị tiến độ từ 0% đến 100%.</w:t>
+      </w:r>
+    </w:p>
+    <w:p>
+      <w:pPr>
+        <w:tabs>
+          <w:tab w:pos="454" w:val="left"/>
+        </w:tabs>
+        <w:spacing w:after="40"/>
+        <w:ind w:left="454" w:hanging="283"/>
+      </w:pPr>
+      <w:r>
+        <w:rPr>
+          <w:b w:val="0"/>
+          <w:i w:val="0"/>
+        </w:rPr>
+        <w:t>•</w:t>
+        <w:tab/>
+        <w:t>Nhận đủ 2930 gói ngay trong lượt gửi đầu (585 ms), không phải gửi NACK nào. SHA-256 khớp, file được lưu tại nhan1/baocao_demo.pdf.</w:t>
+      </w:r>
+    </w:p>
+    <w:p>
+      <w:pPr>
+        <w:spacing w:after="80"/>
+      </w:pPr>
+    </w:p>
+    <w:p>
+      <w:pPr>
+        <w:spacing w:after="0"/>
+        <w:jc w:val="center"/>
+      </w:pPr>
+      <w:r>
+        <w:drawing>
+          <wp:inline xmlns:a="http://schemas.openxmlformats.org/drawingml/2006/main" xmlns:pic="http://schemas.openxmlformats.org/drawingml/2006/picture">
+            <wp:extent cx="6120000" cy="2563636"/>
+            <wp:docPr id="11" name="Picture 11"/>
+            <wp:cNvGraphicFramePr>
+              <a:graphicFrameLocks noChangeAspect="1"/>
+            </wp:cNvGraphicFramePr>
+            <a:graphic>
+              <a:graphicData uri="http://schemas.openxmlformats.org/drawingml/2006/picture">
+                <pic:pic>
+                  <pic:nvPicPr>
+                    <pic:cNvPr id="0" name="bt03_r2.png"/>
+                    <pic:cNvPicPr/>
+                  </pic:nvPicPr>
+                  <pic:blipFill>
+                    <a:blip r:embed="rId19"/>
+                    <a:stretch>
+                      <a:fillRect/>
+                    </a:stretch>
+                  </pic:blipFill>
+                  <pic:spPr>
+                    <a:xfrm>
+                      <a:off x="0" y="0"/>
+                      <a:ext cx="6120000" cy="2563636"/>
+                    </a:xfrm>
+                    <a:prstGeom prst="rect"/>
+                  </pic:spPr>
+                </pic:pic>
+              </a:graphicData>
+            </a:graphic>
+          </wp:inline>
+        </w:drawing>
+      </w:r>
+    </w:p>
+    <w:p>
+      <w:pPr>
+        <w:spacing w:after="160"/>
+        <w:jc w:val="center"/>
+      </w:pPr>
+      <w:r>
+        <w:rPr>
+          <w:b w:val="0"/>
+          <w:i/>
+          <w:sz w:val="22"/>
+        </w:rPr>
+        <w:t>Hình 10. BT03 – Máy nhận nhan2 (giả lập mất 10% gói)</w:t>
+      </w:r>
+    </w:p>
+    <w:p>
+      <w:pPr>
+        <w:tabs>
+          <w:tab w:pos="454" w:val="left"/>
+        </w:tabs>
+        <w:spacing w:after="40"/>
+        <w:ind w:left="454" w:hanging="283"/>
+      </w:pPr>
+      <w:r>
+        <w:rPr>
+          <w:b w:val="0"/>
+          <w:i w:val="0"/>
+        </w:rPr>
+        <w:t>•</w:t>
+        <w:tab/>
+        <w:t>Khi nhận END mới có 2644/2930 gói, còn thiếu 286 gói. Máy nhận gửi NACK và số gói thiếu giảm dần: 286 → 52 → 3 → 1 → đủ.</w:t>
+      </w:r>
+    </w:p>
+    <w:p>
+      <w:pPr>
+        <w:tabs>
+          <w:tab w:pos="454" w:val="left"/>
+        </w:tabs>
+        <w:spacing w:after="40"/>
+        <w:ind w:left="454" w:hanging="283"/>
+      </w:pPr>
+      <w:r>
+        <w:rPr>
+          <w:b w:val="0"/>
+          <w:i w:val="0"/>
+        </w:rPr>
+        <w:t>•</w:t>
+        <w:tab/>
+        <w:t>Thống kê: bỏ 323 gói (giả lập mất), 1127 gói trùng (gói gửi lại cho máy khác mà mình đã có) đã bị bỏ qua. Hoàn tất sau 2,3 giây, SHA-256 khớp.</w:t>
+      </w:r>
+    </w:p>
+    <w:p>
+      <w:pPr>
+        <w:spacing w:after="80"/>
+      </w:pPr>
+    </w:p>
+    <w:p>
+      <w:pPr>
+        <w:spacing w:after="0"/>
+        <w:jc w:val="center"/>
+      </w:pPr>
+      <w:r>
+        <w:drawing>
+          <wp:inline xmlns:a="http://schemas.openxmlformats.org/drawingml/2006/main" xmlns:pic="http://schemas.openxmlformats.org/drawingml/2006/picture">
+            <wp:extent cx="6120000" cy="2781818"/>
+            <wp:docPr id="12" name="Picture 12"/>
+            <wp:cNvGraphicFramePr>
+              <a:graphicFrameLocks noChangeAspect="1"/>
+            </wp:cNvGraphicFramePr>
+            <a:graphic>
+              <a:graphicData uri="http://schemas.openxmlformats.org/drawingml/2006/picture">
+                <pic:pic>
+                  <pic:nvPicPr>
+                    <pic:cNvPr id="0" name="bt03_r3.png"/>
+                    <pic:cNvPicPr/>
+                  </pic:nvPicPr>
+                  <pic:blipFill>
+                    <a:blip r:embed="rId20"/>
+                    <a:stretch>
+                      <a:fillRect/>
+                    </a:stretch>
+                  </pic:blipFill>
+                  <pic:spPr>
+                    <a:xfrm>
+                      <a:off x="0" y="0"/>
+                      <a:ext cx="6120000" cy="2781818"/>
+                    </a:xfrm>
+                    <a:prstGeom prst="rect"/>
+                  </pic:spPr>
+                </pic:pic>
+              </a:graphicData>
+            </a:graphic>
+          </wp:inline>
+        </w:drawing>
+      </w:r>
+    </w:p>
+    <w:p>
+      <w:pPr>
+        <w:spacing w:after="160"/>
+        <w:jc w:val="center"/>
+      </w:pPr>
+      <w:r>
+        <w:rPr>
+          <w:b w:val="0"/>
+          <w:i/>
+          <w:sz w:val="22"/>
+        </w:rPr>
+        <w:t>Hình 11. BT03 – Máy nhận nhan3 (giả lập mất 30% gói)</w:t>
+      </w:r>
+    </w:p>
+    <w:p>
+      <w:pPr>
+        <w:tabs>
+          <w:tab w:pos="454" w:val="left"/>
+        </w:tabs>
+        <w:spacing w:after="40"/>
+        <w:ind w:left="454" w:hanging="283"/>
+      </w:pPr>
+      <w:r>
+        <w:rPr>
+          <w:b w:val="0"/>
+          <w:i w:val="0"/>
+        </w:rPr>
+        <w:t>•</w:t>
+        <w:tab/>
+        <w:t>Khi nhận END chỉ có 2063/2930 gói, thiếu 867 gói. Sau 6 vòng NACK (867 → 252 → 67 → 19 → 4 → 2) thì nhận đủ.</w:t>
+      </w:r>
+    </w:p>
+    <w:p>
+      <w:pPr>
+        <w:tabs>
+          <w:tab w:pos="454" w:val="left"/>
+        </w:tabs>
+        <w:spacing w:after="40"/>
+        <w:ind w:left="454" w:hanging="283"/>
+      </w:pPr>
+      <w:r>
+        <w:rPr>
+          <w:b w:val="0"/>
+          <w:i w:val="0"/>
+        </w:rPr>
+        <w:t>•</w:t>
+        <w:tab/>
+        <w:t>Dù mất 1216 gói, file vẫn được tái tạo hoàn chỉnh trong 3,5 giây và SHA-256 khớp.</w:t>
+      </w:r>
+    </w:p>
+    <w:p>
+      <w:pPr>
+        <w:tabs>
+          <w:tab w:pos="454" w:val="left"/>
+        </w:tabs>
+        <w:spacing w:after="40"/>
+        <w:ind w:left="454" w:hanging="283"/>
+      </w:pPr>
+      <w:r>
+        <w:rPr>
+          <w:b w:val="0"/>
+          <w:i w:val="0"/>
+        </w:rPr>
+        <w:t>•</w:t>
+        <w:tab/>
+        <w:t>Gói gửi lại đến sau, không theo thứ tự, nhưng vẫn được ghi đúng vị trí nhờ offset, nên file không bị sai lệch.</w:t>
+      </w:r>
+    </w:p>
+    <w:p>
+      <w:pPr>
+        <w:spacing w:after="80"/>
+      </w:pPr>
     </w:p>
     <w:p>
       <w:pPr>
@@ -6312,7 +5270,7 @@
         <w:drawing>
           <wp:inline xmlns:a="http://schemas.openxmlformats.org/drawingml/2006/main" xmlns:pic="http://schemas.openxmlformats.org/drawingml/2006/picture">
             <wp:extent cx="6120000" cy="1118149"/>
-            <wp:docPr id="6" name="Picture 6"/>
+            <wp:docPr id="13" name="Picture 13"/>
             <wp:cNvGraphicFramePr>
               <a:graphicFrameLocks noChangeAspect="1"/>
             </wp:cNvGraphicFramePr>
@@ -6324,7 +5282,7 @@
                     <pic:cNvPicPr/>
                   </pic:nvPicPr>
                   <pic:blipFill>
-                    <a:blip r:embed="rId14"/>
+                    <a:blip r:embed="rId21"/>
                     <a:stretch>
                       <a:fillRect/>
                     </a:stretch>
@@ -6354,17 +5312,62 @@
           <w:i/>
           <w:sz w:val="22"/>
         </w:rPr>
-        <w:t>Hình 5. BT03 – SHA-256 của 3 file nhận được trùng với file gốc</w:t>
+        <w:t>Hình 12. BT03 – Kiểm tra file nhận được</w:t>
       </w:r>
     </w:p>
     <w:p>
+      <w:pPr>
+        <w:tabs>
+          <w:tab w:pos="454" w:val="left"/>
+        </w:tabs>
+        <w:spacing w:after="40"/>
+        <w:ind w:left="454" w:hanging="283"/>
+      </w:pPr>
       <w:r>
         <w:rPr>
           <w:b w:val="0"/>
           <w:i w:val="0"/>
         </w:rPr>
-        <w:t>Kết quả: cả 3 máy nhận đều tái tạo đúng file (SHA-256 trùng khớp). Máy mất 30% gói (1216 gói) cần 6 vòng NACK, hoàn tất sau khoảng 3,5 giây; máy không mất gói hoàn tất ngay sau lượt gửi đầu (~0,6 giây). Đã thử thêm trường hợp file rỗng (0 byte) và file 5 MB – đều nhận đúng.</w:t>
+        <w:t>•</w:t>
+        <w:tab/>
+        <w:t>Dùng lệnh sha256sum để so file gốc với 3 file nhận được: cả 4 mã băm giống hệt nhau, tức 3 máy nhận được file chính xác từng byte.</w:t>
       </w:r>
+    </w:p>
+    <w:p>
+      <w:pPr>
+        <w:tabs>
+          <w:tab w:pos="454" w:val="left"/>
+        </w:tabs>
+        <w:spacing w:after="40"/>
+        <w:ind w:left="454" w:hanging="283"/>
+      </w:pPr>
+      <w:r>
+        <w:rPr>
+          <w:b w:val="0"/>
+          <w:i w:val="0"/>
+        </w:rPr>
+        <w:t>•</w:t>
+        <w:tab/>
+      </w:r>
+      <w:r>
+        <w:rPr>
+          <w:b/>
+          <w:i w:val="0"/>
+        </w:rPr>
+        <w:t>Kết luận:</w:t>
+      </w:r>
+      <w:r>
+        <w:rPr>
+          <w:b w:val="0"/>
+          <w:i w:val="0"/>
+        </w:rPr>
+        <w:t xml:space="preserve"> một máy gửi phân phối file cho nhiều máy cùng lúc. Gói tin được chia nhỏ, đánh số thứ tự, ghép lại đúng và bù đủ khi bị mất. Đã thử thêm file 0 byte và file 5 MB, đều nhận đúng.</w:t>
+      </w:r>
+    </w:p>
+    <w:p>
+      <w:pPr>
+        <w:spacing w:after="80"/>
+      </w:pPr>
     </w:p>
     <w:p>
       <w:pPr>

</xml_diff>

<commit_message>
docs: rut gon giai thich trong bao cao Bai 08
Co-Authored-By: Claude Opus 5.5 <noreply@anthropic.com>
Claude-Session: https://claude.ai/code/session_01HfRSsX3kWADzWAJKnHW3nE
</commit_message>
<xml_diff>
--- a/BaiTap/Bai08_Multicast/BAI08_2380600371_PhamAnhDuy.docx
+++ b/BaiTap/Bai08_Multicast/BAI08_2380600371_PhamAnhDuy.docx
@@ -278,16 +278,6 @@
       </w:r>
     </w:p>
     <w:p>
-      <w:r>
-        <w:rPr>
-          <w:b w:val="0"/>
-          <w:i/>
-          <w:sz w:val="22"/>
-        </w:rPr>
-        <w:t>Mã nguồn đầy đủ: thư mục BaiTap/Bai08_Multicast (repo github.com/duystts/KeyNet). Biên dịch: javac -encoding UTF-8 -d out $(find src -name "*.java"), chạy: java -cp out &lt;tên lớp&gt;. Yêu cầu Java 17 trở lên.</w:t>
-      </w:r>
-    </w:p>
-    <w:p>
       <w:pPr>
         <w:spacing w:after="120" w:before="200"/>
       </w:pPr>
@@ -313,12 +303,34 @@
       </w:r>
     </w:p>
     <w:p>
+      <w:pPr>
+        <w:tabs>
+          <w:tab w:pos="454" w:val="left"/>
+        </w:tabs>
+        <w:spacing w:after="40"/>
+        <w:ind w:left="454" w:hanging="283"/>
+      </w:pPr>
       <w:r>
         <w:rPr>
           <w:b w:val="0"/>
-          <w:i/>
+          <w:i w:val="0"/>
         </w:rPr>
-        <w:t>Giải thích sự khác biệt giữa kiểu truyền unicast, broadcast và multicast. Liệt kê một số ứng dụng mạng tương ứng.</w:t>
+        <w:t>•</w:t>
+        <w:tab/>
+      </w:r>
+      <w:r>
+        <w:rPr>
+          <w:b/>
+          <w:i w:val="0"/>
+        </w:rPr>
+        <w:t>Unicast:</w:t>
+      </w:r>
+      <w:r>
+        <w:rPr>
+          <w:b w:val="0"/>
+          <w:i w:val="0"/>
+        </w:rPr>
+        <w:t xml:space="preserve"> gửi từ 1 máy tới 1 máy. Gửi cho N máy thì phải gửi N lần. Ví dụ: web (HTTP), email, SSH, FTP.</w:t>
       </w:r>
     </w:p>
     <w:p>
@@ -342,14 +354,14 @@
           <w:b/>
           <w:i w:val="0"/>
         </w:rPr>
-        <w:t>Unicast (một – một):</w:t>
+        <w:t>Broadcast:</w:t>
       </w:r>
       <w:r>
         <w:rPr>
           <w:b w:val="0"/>
           <w:i w:val="0"/>
         </w:rPr>
-        <w:t xml:space="preserve"> gói tin có địa chỉ đích là IP của đúng một máy. Muốn gửi cho N máy thì nguồn phải gửi N bản sao, tốn băng thông và tải tại nguồn tăng tuyến tính theo N. Dùng được cả TCP và UDP, đi được qua Internet.</w:t>
+        <w:t xml:space="preserve"> gửi tới tất cả máy trong cùng mạng con (vd 192.168.0.255), router chặn lại. Ví dụ: DHCP, ARP, Wake-on-LAN.</w:t>
       </w:r>
     </w:p>
     <w:p>
@@ -373,14 +385,26 @@
           <w:b/>
           <w:i w:val="0"/>
         </w:rPr>
-        <w:t>Broadcast (một – tất cả):</w:t>
+        <w:t>Multicast:</w:t>
       </w:r>
       <w:r>
         <w:rPr>
           <w:b w:val="0"/>
           <w:i w:val="0"/>
         </w:rPr>
-        <w:t xml:space="preserve"> gói tin gửi tới địa chỉ quảng bá (ví dụ 192.168.0.255/24 hoặc 255.255.255.255), mọi máy trong cùng mạng con đều nhận và phải xử lý, kể cả máy không quan tâm. Router chặn broadcast nên chỉ dùng trong LAN/subnet; chỉ dùng UDP.</w:t>
+        <w:t xml:space="preserve"> gửi 1 lần tới địa chỉ nhóm (224.0.0.0 – 239.255.255.255), chỉ máy đã tham gia nhóm mới nhận. Ví dụ: IPTV, hội nghị truyền hình, phát file cho phòng máy, game LAN.</w:t>
+      </w:r>
+    </w:p>
+    <w:p>
+      <w:pPr>
+        <w:spacing w:after="80" w:before="160"/>
+      </w:pPr>
+      <w:r>
+        <w:rPr>
+          <w:b/>
+          <w:color w:val="C00000"/>
+        </w:rPr>
+        <w:t>▪  BAI08_LT02:</w:t>
       </w:r>
     </w:p>
     <w:p>
@@ -404,644 +428,14 @@
           <w:b/>
           <w:i w:val="0"/>
         </w:rPr>
-        <w:t>Multicast (một – nhóm):</w:t>
+        <w:t>Ưu điểm:</w:t>
       </w:r>
       <w:r>
         <w:rPr>
           <w:b w:val="0"/>
           <w:i w:val="0"/>
         </w:rPr>
-        <w:t xml:space="preserve"> gói tin gửi tới một địa chỉ nhóm lớp D (224.0.0.0 – 239.255.255.255). Chỉ những máy đã </w:t>
-      </w:r>
-      <w:r>
-        <w:rPr>
-          <w:b/>
-          <w:i w:val="0"/>
-        </w:rPr>
-        <w:t>tham gia nhóm</w:t>
-      </w:r>
-      <w:r>
-        <w:rPr>
-          <w:b w:val="0"/>
-          <w:i w:val="0"/>
-        </w:rPr>
-        <w:t xml:space="preserve"> (thông báo bằng IGMP với IPv4, MLD với IPv6) mới nhận. Nguồn chỉ gửi </w:t>
-      </w:r>
-      <w:r>
-        <w:rPr>
-          <w:b/>
-          <w:i w:val="0"/>
-        </w:rPr>
-        <w:t>một</w:t>
-      </w:r>
-      <w:r>
-        <w:rPr>
-          <w:b w:val="0"/>
-          <w:i w:val="0"/>
-        </w:rPr>
-        <w:t xml:space="preserve"> bản, switch/router (IGMP snooping, PIM) nhân bản gói tin tại điểm rẽ nhánh. Chỉ dùng UDP; có thể vượt router nếu router hỗ trợ định tuyến multicast và TTL cho phép.</w:t>
-      </w:r>
-    </w:p>
-    <w:tbl>
-      <w:tblPr>
-        <w:tblStyle w:val="TableGrid"/>
-        <w:tblW w:type="auto" w:w="0"/>
-        <w:jc w:val="center"/>
-        <w:tblLook w:firstColumn="1" w:firstRow="1" w:lastColumn="0" w:lastRow="0" w:noHBand="0" w:noVBand="1" w:val="04A0"/>
-      </w:tblPr>
-      <w:tblGrid>
-        <w:gridCol w:w="2409"/>
-        <w:gridCol w:w="2409"/>
-        <w:gridCol w:w="2409"/>
-        <w:gridCol w:w="2409"/>
-      </w:tblGrid>
-      <w:tr>
-        <w:tc>
-          <w:tcPr>
-            <w:tcW w:type="dxa" w:w="1928"/>
-            <w:shd w:val="clear" w:color="auto" w:fill="D9E2F3"/>
-          </w:tcPr>
-          <w:p>
-            <w:pPr>
-              <w:spacing w:after="20"/>
-            </w:pPr>
-            <w:r/>
-            <w:r>
-              <w:rPr>
-                <w:b/>
-                <w:i w:val="0"/>
-                <w:sz w:val="22"/>
-              </w:rPr>
-              <w:t>Tiêu chí</w:t>
-            </w:r>
-          </w:p>
-        </w:tc>
-        <w:tc>
-          <w:tcPr>
-            <w:tcW w:type="dxa" w:w="2381"/>
-            <w:shd w:val="clear" w:color="auto" w:fill="D9E2F3"/>
-          </w:tcPr>
-          <w:p>
-            <w:pPr>
-              <w:spacing w:after="20"/>
-            </w:pPr>
-            <w:r/>
-            <w:r>
-              <w:rPr>
-                <w:b/>
-                <w:i w:val="0"/>
-                <w:sz w:val="22"/>
-              </w:rPr>
-              <w:t>Unicast</w:t>
-            </w:r>
-          </w:p>
-        </w:tc>
-        <w:tc>
-          <w:tcPr>
-            <w:tcW w:type="dxa" w:w="2381"/>
-            <w:shd w:val="clear" w:color="auto" w:fill="D9E2F3"/>
-          </w:tcPr>
-          <w:p>
-            <w:pPr>
-              <w:spacing w:after="20"/>
-            </w:pPr>
-            <w:r/>
-            <w:r>
-              <w:rPr>
-                <w:b/>
-                <w:i w:val="0"/>
-                <w:sz w:val="22"/>
-              </w:rPr>
-              <w:t>Broadcast</w:t>
-            </w:r>
-          </w:p>
-        </w:tc>
-        <w:tc>
-          <w:tcPr>
-            <w:tcW w:type="dxa" w:w="2948"/>
-            <w:shd w:val="clear" w:color="auto" w:fill="D9E2F3"/>
-          </w:tcPr>
-          <w:p>
-            <w:pPr>
-              <w:spacing w:after="20"/>
-            </w:pPr>
-            <w:r/>
-            <w:r>
-              <w:rPr>
-                <w:b/>
-                <w:i w:val="0"/>
-                <w:sz w:val="22"/>
-              </w:rPr>
-              <w:t>Multicast</w:t>
-            </w:r>
-          </w:p>
-        </w:tc>
-      </w:tr>
-      <w:tr>
-        <w:tc>
-          <w:tcPr>
-            <w:tcW w:type="dxa" w:w="1928"/>
-          </w:tcPr>
-          <w:p>
-            <w:pPr>
-              <w:spacing w:after="20"/>
-            </w:pPr>
-            <w:r/>
-            <w:r>
-              <w:rPr>
-                <w:b w:val="0"/>
-                <w:i w:val="0"/>
-                <w:sz w:val="22"/>
-              </w:rPr>
-              <w:t>Số máy nhận</w:t>
-            </w:r>
-          </w:p>
-        </w:tc>
-        <w:tc>
-          <w:tcPr>
-            <w:tcW w:type="dxa" w:w="2381"/>
-          </w:tcPr>
-          <w:p>
-            <w:pPr>
-              <w:spacing w:after="20"/>
-            </w:pPr>
-            <w:r/>
-            <w:r>
-              <w:rPr>
-                <w:b w:val="0"/>
-                <w:i w:val="0"/>
-                <w:sz w:val="22"/>
-              </w:rPr>
-              <w:t>1</w:t>
-            </w:r>
-          </w:p>
-        </w:tc>
-        <w:tc>
-          <w:tcPr>
-            <w:tcW w:type="dxa" w:w="2381"/>
-          </w:tcPr>
-          <w:p>
-            <w:pPr>
-              <w:spacing w:after="20"/>
-            </w:pPr>
-            <w:r/>
-            <w:r>
-              <w:rPr>
-                <w:b w:val="0"/>
-                <w:i w:val="0"/>
-                <w:sz w:val="22"/>
-              </w:rPr>
-              <w:t>Toàn bộ subnet</w:t>
-            </w:r>
-          </w:p>
-        </w:tc>
-        <w:tc>
-          <w:tcPr>
-            <w:tcW w:type="dxa" w:w="2948"/>
-          </w:tcPr>
-          <w:p>
-            <w:pPr>
-              <w:spacing w:after="20"/>
-            </w:pPr>
-            <w:r/>
-            <w:r>
-              <w:rPr>
-                <w:b w:val="0"/>
-                <w:i w:val="0"/>
-                <w:sz w:val="22"/>
-              </w:rPr>
-              <w:t>Các máy đã join nhóm</w:t>
-            </w:r>
-          </w:p>
-        </w:tc>
-      </w:tr>
-      <w:tr>
-        <w:tc>
-          <w:tcPr>
-            <w:tcW w:type="dxa" w:w="1928"/>
-          </w:tcPr>
-          <w:p>
-            <w:pPr>
-              <w:spacing w:after="20"/>
-            </w:pPr>
-            <w:r/>
-            <w:r>
-              <w:rPr>
-                <w:b w:val="0"/>
-                <w:i w:val="0"/>
-                <w:sz w:val="22"/>
-              </w:rPr>
-              <w:t>Địa chỉ đích</w:t>
-            </w:r>
-          </w:p>
-        </w:tc>
-        <w:tc>
-          <w:tcPr>
-            <w:tcW w:type="dxa" w:w="2381"/>
-          </w:tcPr>
-          <w:p>
-            <w:pPr>
-              <w:spacing w:after="20"/>
-            </w:pPr>
-            <w:r/>
-            <w:r>
-              <w:rPr>
-                <w:b w:val="0"/>
-                <w:i w:val="0"/>
-                <w:sz w:val="22"/>
-              </w:rPr>
-              <w:t>IP của 1 máy</w:t>
-            </w:r>
-          </w:p>
-        </w:tc>
-        <w:tc>
-          <w:tcPr>
-            <w:tcW w:type="dxa" w:w="2381"/>
-          </w:tcPr>
-          <w:p>
-            <w:pPr>
-              <w:spacing w:after="20"/>
-            </w:pPr>
-            <w:r/>
-            <w:r>
-              <w:rPr>
-                <w:b w:val="0"/>
-                <w:i w:val="0"/>
-                <w:sz w:val="22"/>
-              </w:rPr>
-              <w:t>x.x.x.255, 255.255.255.255</w:t>
-            </w:r>
-          </w:p>
-        </w:tc>
-        <w:tc>
-          <w:tcPr>
-            <w:tcW w:type="dxa" w:w="2948"/>
-          </w:tcPr>
-          <w:p>
-            <w:pPr>
-              <w:spacing w:after="20"/>
-            </w:pPr>
-            <w:r/>
-            <w:r>
-              <w:rPr>
-                <w:b w:val="0"/>
-                <w:i w:val="0"/>
-                <w:sz w:val="22"/>
-              </w:rPr>
-              <w:t>224.0.0.0 – 239.255.255.255</w:t>
-            </w:r>
-          </w:p>
-        </w:tc>
-      </w:tr>
-      <w:tr>
-        <w:tc>
-          <w:tcPr>
-            <w:tcW w:type="dxa" w:w="1928"/>
-          </w:tcPr>
-          <w:p>
-            <w:pPr>
-              <w:spacing w:after="20"/>
-            </w:pPr>
-            <w:r/>
-            <w:r>
-              <w:rPr>
-                <w:b w:val="0"/>
-                <w:i w:val="0"/>
-                <w:sz w:val="22"/>
-              </w:rPr>
-              <w:t>Số bản sao nguồn gửi cho N máy</w:t>
-            </w:r>
-          </w:p>
-        </w:tc>
-        <w:tc>
-          <w:tcPr>
-            <w:tcW w:type="dxa" w:w="2381"/>
-          </w:tcPr>
-          <w:p>
-            <w:pPr>
-              <w:spacing w:after="20"/>
-            </w:pPr>
-            <w:r/>
-            <w:r>
-              <w:rPr>
-                <w:b w:val="0"/>
-                <w:i w:val="0"/>
-                <w:sz w:val="22"/>
-              </w:rPr>
-              <w:t>N</w:t>
-            </w:r>
-          </w:p>
-        </w:tc>
-        <w:tc>
-          <w:tcPr>
-            <w:tcW w:type="dxa" w:w="2381"/>
-          </w:tcPr>
-          <w:p>
-            <w:pPr>
-              <w:spacing w:after="20"/>
-            </w:pPr>
-            <w:r/>
-            <w:r>
-              <w:rPr>
-                <w:b w:val="0"/>
-                <w:i w:val="0"/>
-                <w:sz w:val="22"/>
-              </w:rPr>
-              <w:t>1</w:t>
-            </w:r>
-          </w:p>
-        </w:tc>
-        <w:tc>
-          <w:tcPr>
-            <w:tcW w:type="dxa" w:w="2948"/>
-          </w:tcPr>
-          <w:p>
-            <w:pPr>
-              <w:spacing w:after="20"/>
-            </w:pPr>
-            <w:r/>
-            <w:r>
-              <w:rPr>
-                <w:b w:val="0"/>
-                <w:i w:val="0"/>
-                <w:sz w:val="22"/>
-              </w:rPr>
-              <w:t>1</w:t>
-            </w:r>
-          </w:p>
-        </w:tc>
-      </w:tr>
-      <w:tr>
-        <w:tc>
-          <w:tcPr>
-            <w:tcW w:type="dxa" w:w="1928"/>
-          </w:tcPr>
-          <w:p>
-            <w:pPr>
-              <w:spacing w:after="20"/>
-            </w:pPr>
-            <w:r/>
-            <w:r>
-              <w:rPr>
-                <w:b w:val="0"/>
-                <w:i w:val="0"/>
-                <w:sz w:val="22"/>
-              </w:rPr>
-              <w:t>Phạm vi</w:t>
-            </w:r>
-          </w:p>
-        </w:tc>
-        <w:tc>
-          <w:tcPr>
-            <w:tcW w:type="dxa" w:w="2381"/>
-          </w:tcPr>
-          <w:p>
-            <w:pPr>
-              <w:spacing w:after="20"/>
-            </w:pPr>
-            <w:r/>
-            <w:r>
-              <w:rPr>
-                <w:b w:val="0"/>
-                <w:i w:val="0"/>
-                <w:sz w:val="22"/>
-              </w:rPr>
-              <w:t>LAN, WAN, Internet</w:t>
-            </w:r>
-          </w:p>
-        </w:tc>
-        <w:tc>
-          <w:tcPr>
-            <w:tcW w:type="dxa" w:w="2381"/>
-          </w:tcPr>
-          <w:p>
-            <w:pPr>
-              <w:spacing w:after="20"/>
-            </w:pPr>
-            <w:r/>
-            <w:r>
-              <w:rPr>
-                <w:b w:val="0"/>
-                <w:i w:val="0"/>
-                <w:sz w:val="22"/>
-              </w:rPr>
-              <w:t>Chỉ trong subnet</w:t>
-            </w:r>
-          </w:p>
-        </w:tc>
-        <w:tc>
-          <w:tcPr>
-            <w:tcW w:type="dxa" w:w="2948"/>
-          </w:tcPr>
-          <w:p>
-            <w:pPr>
-              <w:spacing w:after="20"/>
-            </w:pPr>
-            <w:r/>
-            <w:r>
-              <w:rPr>
-                <w:b w:val="0"/>
-                <w:i w:val="0"/>
-                <w:sz w:val="22"/>
-              </w:rPr>
-              <w:t>LAN / WAN có hỗ trợ (giới hạn bằng TTL)</w:t>
-            </w:r>
-          </w:p>
-        </w:tc>
-      </w:tr>
-      <w:tr>
-        <w:tc>
-          <w:tcPr>
-            <w:tcW w:type="dxa" w:w="1928"/>
-          </w:tcPr>
-          <w:p>
-            <w:pPr>
-              <w:spacing w:after="20"/>
-            </w:pPr>
-            <w:r/>
-            <w:r>
-              <w:rPr>
-                <w:b w:val="0"/>
-                <w:i w:val="0"/>
-                <w:sz w:val="22"/>
-              </w:rPr>
-              <w:t>Giao thức tầng giao vận</w:t>
-            </w:r>
-          </w:p>
-        </w:tc>
-        <w:tc>
-          <w:tcPr>
-            <w:tcW w:type="dxa" w:w="2381"/>
-          </w:tcPr>
-          <w:p>
-            <w:pPr>
-              <w:spacing w:after="20"/>
-            </w:pPr>
-            <w:r/>
-            <w:r>
-              <w:rPr>
-                <w:b w:val="0"/>
-                <w:i w:val="0"/>
-                <w:sz w:val="22"/>
-              </w:rPr>
-              <w:t>TCP, UDP</w:t>
-            </w:r>
-          </w:p>
-        </w:tc>
-        <w:tc>
-          <w:tcPr>
-            <w:tcW w:type="dxa" w:w="2381"/>
-          </w:tcPr>
-          <w:p>
-            <w:pPr>
-              <w:spacing w:after="20"/>
-            </w:pPr>
-            <w:r/>
-            <w:r>
-              <w:rPr>
-                <w:b w:val="0"/>
-                <w:i w:val="0"/>
-                <w:sz w:val="22"/>
-              </w:rPr>
-              <w:t>UDP</w:t>
-            </w:r>
-          </w:p>
-        </w:tc>
-        <w:tc>
-          <w:tcPr>
-            <w:tcW w:type="dxa" w:w="2948"/>
-          </w:tcPr>
-          <w:p>
-            <w:pPr>
-              <w:spacing w:after="20"/>
-            </w:pPr>
-            <w:r/>
-            <w:r>
-              <w:rPr>
-                <w:b w:val="0"/>
-                <w:i w:val="0"/>
-                <w:sz w:val="22"/>
-              </w:rPr>
-              <w:t>UDP</w:t>
-            </w:r>
-          </w:p>
-        </w:tc>
-      </w:tr>
-      <w:tr>
-        <w:tc>
-          <w:tcPr>
-            <w:tcW w:type="dxa" w:w="1928"/>
-          </w:tcPr>
-          <w:p>
-            <w:pPr>
-              <w:spacing w:after="20"/>
-            </w:pPr>
-            <w:r/>
-            <w:r>
-              <w:rPr>
-                <w:b w:val="0"/>
-                <w:i w:val="0"/>
-                <w:sz w:val="22"/>
-              </w:rPr>
-              <w:t>Ứng dụng tiêu biểu</w:t>
-            </w:r>
-          </w:p>
-        </w:tc>
-        <w:tc>
-          <w:tcPr>
-            <w:tcW w:type="dxa" w:w="2381"/>
-          </w:tcPr>
-          <w:p>
-            <w:pPr>
-              <w:spacing w:after="20"/>
-            </w:pPr>
-            <w:r/>
-            <w:r>
-              <w:rPr>
-                <w:b w:val="0"/>
-                <w:i w:val="0"/>
-                <w:sz w:val="22"/>
-              </w:rPr>
-              <w:t>Web (HTTP), email (SMTP), SSH, FTP, chat 1-1, gọi API</w:t>
-            </w:r>
-          </w:p>
-        </w:tc>
-        <w:tc>
-          <w:tcPr>
-            <w:tcW w:type="dxa" w:w="2381"/>
-          </w:tcPr>
-          <w:p>
-            <w:pPr>
-              <w:spacing w:after="20"/>
-            </w:pPr>
-            <w:r/>
-            <w:r>
-              <w:rPr>
-                <w:b w:val="0"/>
-                <w:i w:val="0"/>
-                <w:sz w:val="22"/>
-              </w:rPr>
-              <w:t>DHCP Discover, ARP request, Wake-on-LAN, NetBIOS, tìm máy in/thiết bị trong LAN</w:t>
-            </w:r>
-          </w:p>
-        </w:tc>
-        <w:tc>
-          <w:tcPr>
-            <w:tcW w:type="dxa" w:w="2948"/>
-          </w:tcPr>
-          <w:p>
-            <w:pPr>
-              <w:spacing w:after="20"/>
-            </w:pPr>
-            <w:r/>
-            <w:r>
-              <w:rPr>
-                <w:b w:val="0"/>
-                <w:i w:val="0"/>
-                <w:sz w:val="22"/>
-              </w:rPr>
-              <w:t>IPTV, truyền hình/radio nội bộ, hội nghị truyền hình, phân phối bản cập nhật/ảnh đĩa (Ghost, WDS), dữ liệu chứng khoán, mDNS/SSDP, OSPF (224.0.0.5), game LAN</w:t>
-            </w:r>
-          </w:p>
-        </w:tc>
-      </w:tr>
-    </w:tbl>
-    <w:p>
-      <w:pPr>
-        <w:spacing w:after="40"/>
-      </w:pPr>
-    </w:p>
-    <w:p>
-      <w:pPr>
-        <w:spacing w:after="80" w:before="160"/>
-      </w:pPr>
-      <w:r>
-        <w:rPr>
-          <w:b/>
-          <w:color w:val="C00000"/>
-        </w:rPr>
-        <w:t>▪  BAI08_LT02:</w:t>
-      </w:r>
-    </w:p>
-    <w:p>
-      <w:r>
-        <w:rPr>
-          <w:b w:val="0"/>
-          <w:i/>
-        </w:rPr>
-        <w:t>Ưu, nhược điểm của lập trình Multicast trong Java. Khi nào nên / không nên dùng?</w:t>
-      </w:r>
-    </w:p>
-    <w:p>
-      <w:pPr>
-        <w:spacing w:after="40" w:before="120"/>
-      </w:pPr>
-      <w:r>
-        <w:rPr>
-          <w:b/>
-          <w:i w:val="0"/>
-        </w:rPr>
-        <w:t>Ưu điểm</w:t>
+        <w:t xml:space="preserve"> tiết kiệm băng thông (gửi 1 lần nhiều máy nhận), dễ mở rộng, API Java đơn giản (MulticastSocket), độ trễ thấp.</w:t>
       </w:r>
     </w:p>
     <w:p>
@@ -1065,14 +459,14 @@
           <w:b/>
           <w:i w:val="0"/>
         </w:rPr>
-        <w:t>Tiết kiệm băng thông và tải máy chủ:</w:t>
+        <w:t>Nhược điểm:</w:t>
       </w:r>
       <w:r>
         <w:rPr>
           <w:b w:val="0"/>
           <w:i w:val="0"/>
         </w:rPr>
-        <w:t xml:space="preserve"> gửi một lần, mọi thành viên cùng nhận; số người nhận tăng không làm tăng lưu lượng tại nguồn.</w:t>
+        <w:t xml:space="preserve"> dùng UDP nên có thể mất gói, sai thứ tự; không có bảo mật; hầu như không dùng được trên Internet; cần thiết bị mạng hỗ trợ.</w:t>
       </w:r>
     </w:p>
     <w:p>
@@ -1096,14 +490,14 @@
           <w:b/>
           <w:i w:val="0"/>
         </w:rPr>
-        <w:t>Khả năng mở rộng tốt</w:t>
+        <w:t>Nên dùng:</w:t>
       </w:r>
       <w:r>
         <w:rPr>
           <w:b w:val="0"/>
           <w:i w:val="0"/>
         </w:rPr>
-        <w:t xml:space="preserve"> cho ứng dụng một-nhiều/nhiều-nhiều: thêm người nhận chỉ cần joinGroup(), bên gửi không cần biết danh sách người nhận.</w:t>
+        <w:t xml:space="preserve"> gửi cùng dữ liệu cho nhiều máy trong mạng LAN (phát video, chat nhóm, phân phối file).</w:t>
       </w:r>
     </w:p>
     <w:p>
@@ -1127,14 +521,26 @@
           <w:b/>
           <w:i w:val="0"/>
         </w:rPr>
-        <w:t>API đơn giản, có sẵn trong JDK:</w:t>
+        <w:t>Không nên dùng:</w:t>
       </w:r>
       <w:r>
         <w:rPr>
           <w:b w:val="0"/>
           <w:i w:val="0"/>
         </w:rPr>
-        <w:t xml:space="preserve"> MulticastSocket kế thừa DatagramSocket, chỉ thêm joinGroup/leaveGroup/setTimeToLive; không cần thư viện ngoài, chạy được trên mọi hệ điều hành có JVM.</w:t>
+        <w:t xml:space="preserve"> truyền qua Internet, dữ liệu cần chính xác tuyệt đối (giao dịch, đăng nhập), giao tiếp một-một.</w:t>
+      </w:r>
+    </w:p>
+    <w:p>
+      <w:pPr>
+        <w:spacing w:after="80" w:before="160"/>
+      </w:pPr>
+      <w:r>
+        <w:rPr>
+          <w:b/>
+          <w:color w:val="C00000"/>
+        </w:rPr>
+        <w:t>▪  BAI08_LT03:</w:t>
       </w:r>
     </w:p>
     <w:p>
@@ -1158,14 +564,14 @@
           <w:b/>
           <w:i w:val="0"/>
         </w:rPr>
-        <w:t>Độ trễ thấp, thời gian thực:</w:t>
+        <w:t>MulticastSocket:</w:t>
       </w:r>
       <w:r>
         <w:rPr>
           <w:b w:val="0"/>
           <w:i w:val="0"/>
         </w:rPr>
-        <w:t xml:space="preserve"> dựa trên UDP, không bắt tay, không chờ ACK, phù hợp audio/video, game, dữ liệu giá.</w:t>
+        <w:t xml:space="preserve"> socket UDP có thêm joinGroup() (vào nhóm), leaveGroup() (rời nhóm), setTimeToLive() (giới hạn số router đi qua).</w:t>
       </w:r>
     </w:p>
     <w:p>
@@ -1189,26 +595,14 @@
           <w:b/>
           <w:i w:val="0"/>
         </w:rPr>
-        <w:t>Tự khám phá dịch vụ:</w:t>
+        <w:t>DatagramPacket:</w:t>
       </w:r>
       <w:r>
         <w:rPr>
           <w:b w:val="0"/>
           <w:i w:val="0"/>
         </w:rPr>
-        <w:t xml:space="preserve"> các máy có thể tìm nhau qua một địa chỉ nhóm mà không cần máy chủ trung tâm (mDNS, SSDP).</w:t>
-      </w:r>
-    </w:p>
-    <w:p>
-      <w:pPr>
-        <w:spacing w:after="40" w:before="120"/>
-      </w:pPr>
-      <w:r>
-        <w:rPr>
-          <w:b/>
-          <w:i w:val="0"/>
-        </w:rPr>
-        <w:t>Nhược điểm</w:t>
+        <w:t xml:space="preserve"> chứa dữ liệu của một gói tin cùng địa chỉ, cổng gửi/nhận.</w:t>
       </w:r>
     </w:p>
     <w:p>
@@ -1232,14 +626,14 @@
           <w:b/>
           <w:i w:val="0"/>
         </w:rPr>
-        <w:t>Không tin cậy:</w:t>
+        <w:t>Gửi:</w:t>
       </w:r>
       <w:r>
         <w:rPr>
           <w:b w:val="0"/>
           <w:i w:val="0"/>
         </w:rPr>
-        <w:t xml:space="preserve"> kế thừa UDP nên gói có thể mất, trùng, đến sai thứ tự; lập trình viên phải tự đánh số thứ tự, kiểm tra lỗi, gửi lại (như BT03).</w:t>
+        <w:t xml:space="preserve"> tạo MulticastSocket → tạo DatagramPacket với địa chỉ nhóm và cổng → send().</w:t>
       </w:r>
     </w:p>
     <w:p>
@@ -1263,14 +657,146 @@
           <w:b/>
           <w:i w:val="0"/>
         </w:rPr>
-        <w:t>Không có điều khiển luồng/tắc nghẽn:</w:t>
+        <w:t>Nhận:</w:t>
       </w:r>
       <w:r>
         <w:rPr>
           <w:b w:val="0"/>
           <w:i w:val="0"/>
         </w:rPr>
-        <w:t xml:space="preserve"> gửi quá nhanh làm tràn bộ đệm máy nhận chậm; phải tự điều tiết tốc độ.</w:t>
+        <w:t xml:space="preserve"> tạo MulticastSocket(cổng) → joinGroup(địa chỉ nhóm) → receive() → leaveGroup() → close().</w:t>
+      </w:r>
+    </w:p>
+    <w:p>
+      <w:pPr>
+        <w:spacing w:after="80" w:before="160"/>
+      </w:pPr>
+      <w:r>
+        <w:rPr>
+          <w:b/>
+          <w:color w:val="C00000"/>
+        </w:rPr>
+        <w:t>▪  BAI08_LT04:</w:t>
+      </w:r>
+    </w:p>
+    <w:p>
+      <w:pPr>
+        <w:tabs>
+          <w:tab w:pos="454" w:val="left"/>
+        </w:tabs>
+        <w:spacing w:after="40"/>
+        <w:ind w:left="454" w:hanging="283"/>
+      </w:pPr>
+      <w:r>
+        <w:rPr>
+          <w:b w:val="0"/>
+          <w:i w:val="0"/>
+        </w:rPr>
+        <w:t>•</w:t>
+        <w:tab/>
+        <w:t>Các máy dùng chung địa chỉ nhóm và cổng; máy nhận phải join trước khi máy gửi gửi.</w:t>
+      </w:r>
+    </w:p>
+    <w:p>
+      <w:pPr>
+        <w:tabs>
+          <w:tab w:pos="454" w:val="left"/>
+        </w:tabs>
+        <w:spacing w:after="40"/>
+        <w:ind w:left="454" w:hanging="283"/>
+      </w:pPr>
+      <w:r>
+        <w:rPr>
+          <w:b w:val="0"/>
+          <w:i w:val="0"/>
+        </w:rPr>
+        <w:t>•</w:t>
+        <w:tab/>
+        <w:t>Đặt TTL phù hợp (TTL = 1 cho mạng LAN); chọn đúng card mạng nếu máy có nhiều card.</w:t>
+      </w:r>
+    </w:p>
+    <w:p>
+      <w:pPr>
+        <w:tabs>
+          <w:tab w:pos="454" w:val="left"/>
+        </w:tabs>
+        <w:spacing w:after="40"/>
+        <w:ind w:left="454" w:hanging="283"/>
+      </w:pPr>
+      <w:r>
+        <w:rPr>
+          <w:b w:val="0"/>
+          <w:i w:val="0"/>
+        </w:rPr>
+        <w:t>•</w:t>
+        <w:tab/>
+        <w:t>Đánh số thứ tự gói tin để xử lý mất gói, trùng gói, sai thứ tự.</w:t>
+      </w:r>
+    </w:p>
+    <w:p>
+      <w:pPr>
+        <w:tabs>
+          <w:tab w:pos="454" w:val="left"/>
+        </w:tabs>
+        <w:spacing w:after="40"/>
+        <w:ind w:left="454" w:hanging="283"/>
+      </w:pPr>
+      <w:r>
+        <w:rPr>
+          <w:b w:val="0"/>
+          <w:i w:val="0"/>
+        </w:rPr>
+        <w:t>•</w:t>
+        <w:tab/>
+        <w:t>Không gửi gói quá lớn (khoảng ≤ 1400 byte) và không gửi quá nhanh.</w:t>
+      </w:r>
+    </w:p>
+    <w:p>
+      <w:pPr>
+        <w:tabs>
+          <w:tab w:pos="454" w:val="left"/>
+        </w:tabs>
+        <w:spacing w:after="40"/>
+        <w:ind w:left="454" w:hanging="283"/>
+      </w:pPr>
+      <w:r>
+        <w:rPr>
+          <w:b w:val="0"/>
+          <w:i w:val="0"/>
+        </w:rPr>
+        <w:t>•</w:t>
+        <w:tab/>
+        <w:t>Dùng luồng riêng để nhận, mã hoá ký tự UTF-8, gọi leaveGroup() và close() khi thoát.</w:t>
+      </w:r>
+    </w:p>
+    <w:p>
+      <w:pPr>
+        <w:spacing w:after="80" w:before="160"/>
+      </w:pPr>
+      <w:r>
+        <w:rPr>
+          <w:b/>
+          <w:color w:val="C00000"/>
+        </w:rPr>
+        <w:t>▪  BAI08_LT05:</w:t>
+      </w:r>
+    </w:p>
+    <w:p>
+      <w:pPr>
+        <w:tabs>
+          <w:tab w:pos="454" w:val="left"/>
+        </w:tabs>
+        <w:spacing w:after="40"/>
+        <w:ind w:left="454" w:hanging="283"/>
+      </w:pPr>
+      <w:r>
+        <w:rPr>
+          <w:b w:val="0"/>
+          <w:i w:val="0"/>
+        </w:rPr>
+        <w:t>•</w:t>
+        <w:tab/>
+        <w:t>Multicast trên Internet gần như không dùng được vì nhà mạng không hỗ trợ; gửi unicast từ 1 máy chủ thì quá tải băng thông.</w:t>
       </w:r>
     </w:p>
     <w:p>
@@ -1294,28 +820,42 @@
           <w:b/>
           <w:i w:val="0"/>
         </w:rPr>
-        <w:t>Phụ thuộc hạ tầng:</w:t>
+        <w:t>Giải pháp đề xuất:</w:t>
       </w:r>
       <w:r>
         <w:rPr>
           <w:b w:val="0"/>
           <w:i w:val="0"/>
         </w:rPr>
-        <w:t xml:space="preserve"> cần switch/router hỗ trợ IGMP/PIM; hầu như </w:t>
+        <w:t xml:space="preserve"> phát video theo chuẩn </w:t>
       </w:r>
       <w:r>
         <w:rPr>
           <w:b/>
           <w:i w:val="0"/>
         </w:rPr>
-        <w:t>không dùng được trên Internet công cộng</w:t>
+        <w:t>HLS/DASH qua HTTP</w:t>
       </w:r>
       <w:r>
         <w:rPr>
           <w:b w:val="0"/>
           <w:i w:val="0"/>
         </w:rPr>
-        <w:t>, nhiều mạng Wi-Fi, VPN, cloud và tường lửa chặn hoặc hạn chế multicast.</w:t>
+        <w:t xml:space="preserve"> và dùng </w:t>
+      </w:r>
+      <w:r>
+        <w:rPr>
+          <w:b/>
+          <w:i w:val="0"/>
+        </w:rPr>
+        <w:t>CDN</w:t>
+      </w:r>
+      <w:r>
+        <w:rPr>
+          <w:b w:val="0"/>
+          <w:i w:val="0"/>
+        </w:rPr>
+        <w:t>. Video được cắt thành nhiều đoạn nhỏ, CDN lưu bản sao ở nhiều máy chủ gần người xem, trình phát tự chọn chất lượng theo tốc độ mạng.</w:t>
       </w:r>
     </w:p>
     <w:p>
@@ -1339,2293 +879,6 @@
           <w:b/>
           <w:i w:val="0"/>
         </w:rPr>
-        <w:t>Bảo mật yếu:</w:t>
-      </w:r>
-      <w:r>
-        <w:rPr>
-          <w:b w:val="0"/>
-          <w:i w:val="0"/>
-        </w:rPr>
-        <w:t xml:space="preserve"> ai biết địa chỉ nhóm và cổng đều join và nghe/gửi được; không có xác thực, mã hoá sẵn → phải tự mã hoá/ký dữ liệu.</w:t>
-      </w:r>
-    </w:p>
-    <w:p>
-      <w:pPr>
-        <w:tabs>
-          <w:tab w:pos="454" w:val="left"/>
-        </w:tabs>
-        <w:spacing w:after="40"/>
-        <w:ind w:left="454" w:hanging="283"/>
-      </w:pPr>
-      <w:r>
-        <w:rPr>
-          <w:b w:val="0"/>
-          <w:i w:val="0"/>
-        </w:rPr>
-        <w:t>•</w:t>
-        <w:tab/>
-      </w:r>
-      <w:r>
-        <w:rPr>
-          <w:b/>
-          <w:i w:val="0"/>
-        </w:rPr>
-        <w:t>Khó gỡ lỗi và kiểm soát thành viên:</w:t>
-      </w:r>
-      <w:r>
-        <w:rPr>
-          <w:b w:val="0"/>
-          <w:i w:val="0"/>
-        </w:rPr>
-        <w:t xml:space="preserve"> bên gửi không biết ai đang nghe; phụ thuộc chọn card mạng (NetworkInterface), TTL, loopback, IPv4/IPv6.</w:t>
-      </w:r>
-    </w:p>
-    <w:p>
-      <w:pPr>
-        <w:tabs>
-          <w:tab w:pos="454" w:val="left"/>
-        </w:tabs>
-        <w:spacing w:after="40"/>
-        <w:ind w:left="454" w:hanging="283"/>
-      </w:pPr>
-      <w:r>
-        <w:rPr>
-          <w:b w:val="0"/>
-          <w:i w:val="0"/>
-        </w:rPr>
-        <w:t>•</w:t>
-        <w:tab/>
-      </w:r>
-      <w:r>
-        <w:rPr>
-          <w:b/>
-          <w:i w:val="0"/>
-        </w:rPr>
-        <w:t>Giới hạn kích thước gói:</w:t>
-      </w:r>
-      <w:r>
-        <w:rPr>
-          <w:b w:val="0"/>
-          <w:i w:val="0"/>
-        </w:rPr>
-        <w:t xml:space="preserve"> một datagram tối đa ~64KB, thực tế nên &lt; MTU (~1400 byte) để tránh phân mảnh.</w:t>
-      </w:r>
-    </w:p>
-    <w:p>
-      <w:pPr>
-        <w:spacing w:after="40" w:before="120"/>
-      </w:pPr>
-      <w:r>
-        <w:rPr>
-          <w:b/>
-          <w:i w:val="0"/>
-        </w:rPr>
-        <w:t>Khi nào nên dùng</w:t>
-      </w:r>
-    </w:p>
-    <w:p>
-      <w:pPr>
-        <w:tabs>
-          <w:tab w:pos="454" w:val="left"/>
-        </w:tabs>
-        <w:spacing w:after="40"/>
-        <w:ind w:left="454" w:hanging="283"/>
-      </w:pPr>
-      <w:r>
-        <w:rPr>
-          <w:b w:val="0"/>
-          <w:i w:val="0"/>
-        </w:rPr>
-        <w:t>•</w:t>
-        <w:tab/>
-        <w:t>Một nguồn gửi cùng dữ liệu cho nhiều máy cùng lúc trong mạng nội bộ/mạng được kiểm soát: IPTV, camera, phát thanh nội bộ, phân phối file/cài đặt hàng loạt cho phòng máy, bảng giá chứng khoán, game LAN, chat nhóm LAN, khám phá dịch vụ.</w:t>
-      </w:r>
-    </w:p>
-    <w:p>
-      <w:pPr>
-        <w:tabs>
-          <w:tab w:pos="454" w:val="left"/>
-        </w:tabs>
-        <w:spacing w:after="40"/>
-        <w:ind w:left="454" w:hanging="283"/>
-      </w:pPr>
-      <w:r>
-        <w:rPr>
-          <w:b w:val="0"/>
-          <w:i w:val="0"/>
-        </w:rPr>
-        <w:t>•</w:t>
-        <w:tab/>
-        <w:t>Ứng dụng chấp nhận mất một ít dữ liệu hoặc tự xử lý được mất gói, ưu tiên độ trễ thấp.</w:t>
-      </w:r>
-    </w:p>
-    <w:p>
-      <w:pPr>
-        <w:spacing w:after="40" w:before="120"/>
-      </w:pPr>
-      <w:r>
-        <w:rPr>
-          <w:b/>
-          <w:i w:val="0"/>
-        </w:rPr>
-        <w:t>Khi nào không nên dùng</w:t>
-      </w:r>
-    </w:p>
-    <w:p>
-      <w:pPr>
-        <w:tabs>
-          <w:tab w:pos="454" w:val="left"/>
-        </w:tabs>
-        <w:spacing w:after="40"/>
-        <w:ind w:left="454" w:hanging="283"/>
-      </w:pPr>
-      <w:r>
-        <w:rPr>
-          <w:b w:val="0"/>
-          <w:i w:val="0"/>
-        </w:rPr>
-        <w:t>•</w:t>
-        <w:tab/>
-        <w:t>Truyền trên Internet công cộng hoặc qua hạ tầng không hỗ trợ multicast → dùng unicast/CDN/HTTP streaming/WebRTC.</w:t>
-      </w:r>
-    </w:p>
-    <w:p>
-      <w:pPr>
-        <w:tabs>
-          <w:tab w:pos="454" w:val="left"/>
-        </w:tabs>
-        <w:spacing w:after="40"/>
-        <w:ind w:left="454" w:hanging="283"/>
-      </w:pPr>
-      <w:r>
-        <w:rPr>
-          <w:b w:val="0"/>
-          <w:i w:val="0"/>
-        </w:rPr>
-        <w:t>•</w:t>
-        <w:tab/>
-        <w:t>Dữ liệu yêu cầu tin cậy tuyệt đối, đúng thứ tự (giao dịch ngân hàng, đăng nhập, truyền file quan trọng không có cơ chế bù) → dùng TCP.</w:t>
-      </w:r>
-    </w:p>
-    <w:p>
-      <w:pPr>
-        <w:tabs>
-          <w:tab w:pos="454" w:val="left"/>
-        </w:tabs>
-        <w:spacing w:after="40"/>
-        <w:ind w:left="454" w:hanging="283"/>
-      </w:pPr>
-      <w:r>
-        <w:rPr>
-          <w:b w:val="0"/>
-          <w:i w:val="0"/>
-        </w:rPr>
-        <w:t>•</w:t>
-        <w:tab/>
-        <w:t>Giao tiếp một-một, nội dung riêng cho từng người, hoặc cần bảo mật/xác thực cao mà không có lớp mã hoá bổ sung.</w:t>
-      </w:r>
-    </w:p>
-    <w:p>
-      <w:pPr>
-        <w:spacing w:after="80" w:before="160"/>
-      </w:pPr>
-      <w:r>
-        <w:rPr>
-          <w:b/>
-          <w:color w:val="C00000"/>
-        </w:rPr>
-        <w:t>▪  BAI08_LT03:</w:t>
-      </w:r>
-    </w:p>
-    <w:p>
-      <w:r>
-        <w:rPr>
-          <w:b w:val="0"/>
-          <w:i/>
-        </w:rPr>
-        <w:t>Chức năng của MulticastSocket và DatagramPacket. Làm thế nào để gửi/nhận dữ liệu vào/từ một nhóm máy?</w:t>
-      </w:r>
-    </w:p>
-    <w:p>
-      <w:pPr>
-        <w:spacing w:after="40" w:before="120"/>
-      </w:pPr>
-      <w:r>
-        <w:rPr>
-          <w:b/>
-          <w:i w:val="0"/>
-        </w:rPr>
-        <w:t>Lớp MulticastSocket (java.net)</w:t>
-      </w:r>
-    </w:p>
-    <w:p>
-      <w:pPr>
-        <w:tabs>
-          <w:tab w:pos="454" w:val="left"/>
-        </w:tabs>
-        <w:spacing w:after="40"/>
-        <w:ind w:left="454" w:hanging="283"/>
-      </w:pPr>
-      <w:r>
-        <w:rPr>
-          <w:b w:val="0"/>
-          <w:i w:val="0"/>
-        </w:rPr>
-        <w:t>•</w:t>
-        <w:tab/>
-        <w:t xml:space="preserve">Là lớp con của DatagramSocket: một socket UDP có thêm khả năng </w:t>
-      </w:r>
-      <w:r>
-        <w:rPr>
-          <w:b/>
-          <w:i w:val="0"/>
-        </w:rPr>
-        <w:t>tham gia/rời nhóm multicast</w:t>
-      </w:r>
-      <w:r>
-        <w:rPr>
-          <w:b w:val="0"/>
-          <w:i w:val="0"/>
-        </w:rPr>
-        <w:t>. Khi tạo với cổng (new MulticastSocket(4444)) socket được bind cổng đó và mặc định bật SO_REUSEADDR, nên nhiều chương trình trên cùng một máy có thể nghe chung cổng.</w:t>
-      </w:r>
-    </w:p>
-    <w:p>
-      <w:pPr>
-        <w:tabs>
-          <w:tab w:pos="454" w:val="left"/>
-        </w:tabs>
-        <w:spacing w:after="40"/>
-        <w:ind w:left="454" w:hanging="283"/>
-      </w:pPr>
-      <w:r>
-        <w:rPr>
-          <w:b w:val="0"/>
-          <w:i w:val="0"/>
-        </w:rPr>
-        <w:t>•</w:t>
-        <w:tab/>
-      </w:r>
-      <w:r>
-        <w:rPr>
-          <w:b/>
-          <w:i w:val="0"/>
-        </w:rPr>
-        <w:t>joinGroup(group)</w:t>
-      </w:r>
-      <w:r>
-        <w:rPr>
-          <w:b w:val="0"/>
-          <w:i w:val="0"/>
-        </w:rPr>
-        <w:t xml:space="preserve"> / </w:t>
-      </w:r>
-      <w:r>
-        <w:rPr>
-          <w:b/>
-          <w:i w:val="0"/>
-        </w:rPr>
-        <w:t>joinGroup(SocketAddress, NetworkInterface)</w:t>
-      </w:r>
-      <w:r>
-        <w:rPr>
-          <w:b w:val="0"/>
-          <w:i w:val="0"/>
-        </w:rPr>
-        <w:t>: gửi IGMP Membership Report để tham gia nhóm, từ đó nhận gói tin gửi tới địa chỉ nhóm.</w:t>
-      </w:r>
-    </w:p>
-    <w:p>
-      <w:pPr>
-        <w:tabs>
-          <w:tab w:pos="454" w:val="left"/>
-        </w:tabs>
-        <w:spacing w:after="40"/>
-        <w:ind w:left="454" w:hanging="283"/>
-      </w:pPr>
-      <w:r>
-        <w:rPr>
-          <w:b w:val="0"/>
-          <w:i w:val="0"/>
-        </w:rPr>
-        <w:t>•</w:t>
-        <w:tab/>
-      </w:r>
-      <w:r>
-        <w:rPr>
-          <w:b/>
-          <w:i w:val="0"/>
-        </w:rPr>
-        <w:t>leaveGroup(...)</w:t>
-      </w:r>
-      <w:r>
-        <w:rPr>
-          <w:b w:val="0"/>
-          <w:i w:val="0"/>
-        </w:rPr>
-        <w:t xml:space="preserve">: rời nhóm (IGMP Leave). </w:t>
-      </w:r>
-      <w:r>
-        <w:rPr>
-          <w:b/>
-          <w:i w:val="0"/>
-        </w:rPr>
-        <w:t>setTimeToLive(ttl)</w:t>
-      </w:r>
-      <w:r>
-        <w:rPr>
-          <w:b w:val="0"/>
-          <w:i w:val="0"/>
-        </w:rPr>
-        <w:t xml:space="preserve"> / </w:t>
-      </w:r>
-      <w:r>
-        <w:rPr>
-          <w:b/>
-          <w:i w:val="0"/>
-        </w:rPr>
-        <w:t>getTimeToLive()</w:t>
-      </w:r>
-      <w:r>
-        <w:rPr>
-          <w:b w:val="0"/>
-          <w:i w:val="0"/>
-        </w:rPr>
-        <w:t xml:space="preserve">: số router tối đa gói được đi qua (TTL=1: chỉ trong LAN). </w:t>
-      </w:r>
-      <w:r>
-        <w:rPr>
-          <w:b/>
-          <w:i w:val="0"/>
-        </w:rPr>
-        <w:t>setNetworkInterface(...)</w:t>
-      </w:r>
-      <w:r>
-        <w:rPr>
-          <w:b w:val="0"/>
-          <w:i w:val="0"/>
-        </w:rPr>
-        <w:t xml:space="preserve">: chọn card mạng; </w:t>
-      </w:r>
-      <w:r>
-        <w:rPr>
-          <w:b/>
-          <w:i w:val="0"/>
-        </w:rPr>
-        <w:t>IP_MULTICAST_LOOP</w:t>
-      </w:r>
-      <w:r>
-        <w:rPr>
-          <w:b w:val="0"/>
-          <w:i w:val="0"/>
-        </w:rPr>
-        <w:t>: có nhận lại gói của chính mình hay không.</w:t>
-      </w:r>
-    </w:p>
-    <w:p>
-      <w:pPr>
-        <w:tabs>
-          <w:tab w:pos="454" w:val="left"/>
-        </w:tabs>
-        <w:spacing w:after="40"/>
-        <w:ind w:left="454" w:hanging="283"/>
-      </w:pPr>
-      <w:r>
-        <w:rPr>
-          <w:b w:val="0"/>
-          <w:i w:val="0"/>
-        </w:rPr>
-        <w:t>•</w:t>
-        <w:tab/>
-        <w:t xml:space="preserve">Kế thừa </w:t>
-      </w:r>
-      <w:r>
-        <w:rPr>
-          <w:b/>
-          <w:i w:val="0"/>
-        </w:rPr>
-        <w:t>send(DatagramPacket)</w:t>
-      </w:r>
-      <w:r>
-        <w:rPr>
-          <w:b w:val="0"/>
-          <w:i w:val="0"/>
-        </w:rPr>
-        <w:t xml:space="preserve">, </w:t>
-      </w:r>
-      <w:r>
-        <w:rPr>
-          <w:b/>
-          <w:i w:val="0"/>
-        </w:rPr>
-        <w:t>receive(DatagramPacket)</w:t>
-      </w:r>
-      <w:r>
-        <w:rPr>
-          <w:b w:val="0"/>
-          <w:i w:val="0"/>
-        </w:rPr>
-        <w:t xml:space="preserve">, </w:t>
-      </w:r>
-      <w:r>
-        <w:rPr>
-          <w:b/>
-          <w:i w:val="0"/>
-        </w:rPr>
-        <w:t>setSoTimeout()</w:t>
-      </w:r>
-      <w:r>
-        <w:rPr>
-          <w:b w:val="0"/>
-          <w:i w:val="0"/>
-        </w:rPr>
-        <w:t xml:space="preserve">, </w:t>
-      </w:r>
-      <w:r>
-        <w:rPr>
-          <w:b/>
-          <w:i w:val="0"/>
-        </w:rPr>
-        <w:t>close()</w:t>
-      </w:r>
-      <w:r>
-        <w:rPr>
-          <w:b w:val="0"/>
-          <w:i w:val="0"/>
-        </w:rPr>
-        <w:t xml:space="preserve"> từ DatagramSocket. Bên chỉ gửi không cần joinGroup.</w:t>
-      </w:r>
-    </w:p>
-    <w:p>
-      <w:pPr>
-        <w:spacing w:after="40" w:before="120"/>
-      </w:pPr>
-      <w:r>
-        <w:rPr>
-          <w:b/>
-          <w:i w:val="0"/>
-        </w:rPr>
-        <w:t>Lớp DatagramPacket</w:t>
-      </w:r>
-    </w:p>
-    <w:p>
-      <w:pPr>
-        <w:tabs>
-          <w:tab w:pos="454" w:val="left"/>
-        </w:tabs>
-        <w:spacing w:after="40"/>
-        <w:ind w:left="454" w:hanging="283"/>
-      </w:pPr>
-      <w:r>
-        <w:rPr>
-          <w:b w:val="0"/>
-          <w:i w:val="0"/>
-        </w:rPr>
-        <w:t>•</w:t>
-        <w:tab/>
-        <w:t xml:space="preserve">Đại diện cho </w:t>
-      </w:r>
-      <w:r>
-        <w:rPr>
-          <w:b/>
-          <w:i w:val="0"/>
-        </w:rPr>
-        <w:t>một gói tin UDP</w:t>
-      </w:r>
-      <w:r>
-        <w:rPr>
-          <w:b w:val="0"/>
-          <w:i w:val="0"/>
-        </w:rPr>
-        <w:t>: mảng byte dữ liệu, độ dài, và địa chỉ/cổng.</w:t>
-      </w:r>
-    </w:p>
-    <w:p>
-      <w:pPr>
-        <w:tabs>
-          <w:tab w:pos="454" w:val="left"/>
-        </w:tabs>
-        <w:spacing w:after="40"/>
-        <w:ind w:left="454" w:hanging="283"/>
-      </w:pPr>
-      <w:r>
-        <w:rPr>
-          <w:b w:val="0"/>
-          <w:i w:val="0"/>
-        </w:rPr>
-        <w:t>•</w:t>
-        <w:tab/>
-        <w:t xml:space="preserve">Gói để </w:t>
-      </w:r>
-      <w:r>
-        <w:rPr>
-          <w:b/>
-          <w:i w:val="0"/>
-        </w:rPr>
-        <w:t>gửi</w:t>
-      </w:r>
-      <w:r>
-        <w:rPr>
-          <w:b w:val="0"/>
-          <w:i w:val="0"/>
-        </w:rPr>
-        <w:t>: new DatagramPacket(buf, len, groupAddress, port) – địa chỉ đích là địa chỉ nhóm.</w:t>
-      </w:r>
-    </w:p>
-    <w:p>
-      <w:pPr>
-        <w:tabs>
-          <w:tab w:pos="454" w:val="left"/>
-        </w:tabs>
-        <w:spacing w:after="40"/>
-        <w:ind w:left="454" w:hanging="283"/>
-      </w:pPr>
-      <w:r>
-        <w:rPr>
-          <w:b w:val="0"/>
-          <w:i w:val="0"/>
-        </w:rPr>
-        <w:t>•</w:t>
-        <w:tab/>
-        <w:t xml:space="preserve">Gói để </w:t>
-      </w:r>
-      <w:r>
-        <w:rPr>
-          <w:b/>
-          <w:i w:val="0"/>
-        </w:rPr>
-        <w:t>nhận</w:t>
-      </w:r>
-      <w:r>
-        <w:rPr>
-          <w:b w:val="0"/>
-          <w:i w:val="0"/>
-        </w:rPr>
-        <w:t>: new DatagramPacket(buf, buf.length) – sau receive(), getData()/getLength() cho dữ liệu, getAddress()/getPort() cho biết máy gửi (dùng để phản hồi unicast, như NACK trong BT03).</w:t>
-      </w:r>
-    </w:p>
-    <w:p>
-      <w:pPr>
-        <w:spacing w:after="40" w:before="120"/>
-      </w:pPr>
-      <w:r>
-        <w:rPr>
-          <w:b/>
-          <w:i w:val="0"/>
-        </w:rPr>
-        <w:t>Các bước gửi/nhận dữ liệu với một nhóm máy</w:t>
-      </w:r>
-    </w:p>
-    <w:tbl>
-      <w:tblPr>
-        <w:tblStyle w:val="TableGrid"/>
-        <w:tblW w:type="auto" w:w="0"/>
-        <w:jc w:val="center"/>
-        <w:tblLook w:firstColumn="1" w:firstRow="1" w:lastColumn="0" w:lastRow="0" w:noHBand="0" w:noVBand="1" w:val="04A0"/>
-      </w:tblPr>
-      <w:tblGrid>
-        <w:gridCol w:w="3213"/>
-        <w:gridCol w:w="3213"/>
-        <w:gridCol w:w="3213"/>
-      </w:tblGrid>
-      <w:tr>
-        <w:tc>
-          <w:tcPr>
-            <w:tcW w:type="dxa" w:w="794"/>
-            <w:shd w:val="clear" w:color="auto" w:fill="D9E2F3"/>
-          </w:tcPr>
-          <w:p>
-            <w:pPr>
-              <w:spacing w:after="20"/>
-            </w:pPr>
-            <w:r/>
-            <w:r>
-              <w:rPr>
-                <w:b/>
-                <w:i w:val="0"/>
-                <w:sz w:val="20"/>
-              </w:rPr>
-              <w:t>Bước</w:t>
-            </w:r>
-          </w:p>
-        </w:tc>
-        <w:tc>
-          <w:tcPr>
-            <w:tcW w:type="dxa" w:w="4422"/>
-            <w:shd w:val="clear" w:color="auto" w:fill="D9E2F3"/>
-          </w:tcPr>
-          <w:p>
-            <w:pPr>
-              <w:spacing w:after="20"/>
-            </w:pPr>
-            <w:r/>
-            <w:r>
-              <w:rPr>
-                <w:b/>
-                <w:i w:val="0"/>
-                <w:sz w:val="20"/>
-              </w:rPr>
-              <w:t>Máy gửi</w:t>
-            </w:r>
-          </w:p>
-        </w:tc>
-        <w:tc>
-          <w:tcPr>
-            <w:tcW w:type="dxa" w:w="4422"/>
-            <w:shd w:val="clear" w:color="auto" w:fill="D9E2F3"/>
-          </w:tcPr>
-          <w:p>
-            <w:pPr>
-              <w:spacing w:after="20"/>
-            </w:pPr>
-            <w:r/>
-            <w:r>
-              <w:rPr>
-                <w:b/>
-                <w:i w:val="0"/>
-                <w:sz w:val="20"/>
-              </w:rPr>
-              <w:t>Máy nhận</w:t>
-            </w:r>
-          </w:p>
-        </w:tc>
-      </w:tr>
-      <w:tr>
-        <w:tc>
-          <w:tcPr>
-            <w:tcW w:type="dxa" w:w="794"/>
-          </w:tcPr>
-          <w:p>
-            <w:pPr>
-              <w:spacing w:after="20"/>
-            </w:pPr>
-            <w:r/>
-            <w:r>
-              <w:rPr>
-                <w:b w:val="0"/>
-                <w:i w:val="0"/>
-                <w:sz w:val="20"/>
-              </w:rPr>
-              <w:t>1</w:t>
-            </w:r>
-          </w:p>
-        </w:tc>
-        <w:tc>
-          <w:tcPr>
-            <w:tcW w:type="dxa" w:w="4422"/>
-          </w:tcPr>
-          <w:p>
-            <w:pPr>
-              <w:spacing w:after="20"/>
-            </w:pPr>
-            <w:r/>
-            <w:r>
-              <w:rPr>
-                <w:b w:val="0"/>
-                <w:i w:val="0"/>
-                <w:sz w:val="20"/>
-              </w:rPr>
-              <w:t>MulticastSocket s = new MulticastSocket();</w:t>
-            </w:r>
-          </w:p>
-        </w:tc>
-        <w:tc>
-          <w:tcPr>
-            <w:tcW w:type="dxa" w:w="4422"/>
-          </w:tcPr>
-          <w:p>
-            <w:pPr>
-              <w:spacing w:after="20"/>
-            </w:pPr>
-            <w:r/>
-            <w:r>
-              <w:rPr>
-                <w:b w:val="0"/>
-                <w:i w:val="0"/>
-                <w:sz w:val="20"/>
-              </w:rPr>
-              <w:t>MulticastSocket s = new MulticastSocket(4444);</w:t>
-            </w:r>
-          </w:p>
-        </w:tc>
-      </w:tr>
-      <w:tr>
-        <w:tc>
-          <w:tcPr>
-            <w:tcW w:type="dxa" w:w="794"/>
-          </w:tcPr>
-          <w:p>
-            <w:pPr>
-              <w:spacing w:after="20"/>
-            </w:pPr>
-            <w:r/>
-            <w:r>
-              <w:rPr>
-                <w:b w:val="0"/>
-                <w:i w:val="0"/>
-                <w:sz w:val="20"/>
-              </w:rPr>
-              <w:t>2</w:t>
-            </w:r>
-          </w:p>
-        </w:tc>
-        <w:tc>
-          <w:tcPr>
-            <w:tcW w:type="dxa" w:w="4422"/>
-          </w:tcPr>
-          <w:p>
-            <w:pPr>
-              <w:spacing w:after="20"/>
-            </w:pPr>
-            <w:r/>
-            <w:r>
-              <w:rPr>
-                <w:b w:val="0"/>
-                <w:i w:val="0"/>
-                <w:sz w:val="20"/>
-              </w:rPr>
-              <w:t>InetAddress g = InetAddress.getByName("224.1.1.1");</w:t>
-              <w:br/>
-              <w:t>s.setTimeToLive(1);</w:t>
-            </w:r>
-          </w:p>
-        </w:tc>
-        <w:tc>
-          <w:tcPr>
-            <w:tcW w:type="dxa" w:w="4422"/>
-          </w:tcPr>
-          <w:p>
-            <w:pPr>
-              <w:spacing w:after="20"/>
-            </w:pPr>
-            <w:r/>
-            <w:r>
-              <w:rPr>
-                <w:b w:val="0"/>
-                <w:i w:val="0"/>
-                <w:sz w:val="20"/>
-              </w:rPr>
-              <w:t>s.joinGroup(new InetSocketAddress(g, 4444), null);</w:t>
-            </w:r>
-          </w:p>
-        </w:tc>
-      </w:tr>
-      <w:tr>
-        <w:tc>
-          <w:tcPr>
-            <w:tcW w:type="dxa" w:w="794"/>
-          </w:tcPr>
-          <w:p>
-            <w:pPr>
-              <w:spacing w:after="20"/>
-            </w:pPr>
-            <w:r/>
-            <w:r>
-              <w:rPr>
-                <w:b w:val="0"/>
-                <w:i w:val="0"/>
-                <w:sz w:val="20"/>
-              </w:rPr>
-              <w:t>3</w:t>
-            </w:r>
-          </w:p>
-        </w:tc>
-        <w:tc>
-          <w:tcPr>
-            <w:tcW w:type="dxa" w:w="4422"/>
-          </w:tcPr>
-          <w:p>
-            <w:pPr>
-              <w:spacing w:after="20"/>
-            </w:pPr>
-            <w:r/>
-            <w:r>
-              <w:rPr>
-                <w:b w:val="0"/>
-                <w:i w:val="0"/>
-                <w:sz w:val="20"/>
-              </w:rPr>
-              <w:t>byte[] b = msg.getBytes(UTF_8);</w:t>
-              <w:br/>
-              <w:t>s.send(new DatagramPacket(b, b.length, g, 4444));</w:t>
-            </w:r>
-          </w:p>
-        </w:tc>
-        <w:tc>
-          <w:tcPr>
-            <w:tcW w:type="dxa" w:w="4422"/>
-          </w:tcPr>
-          <w:p>
-            <w:pPr>
-              <w:spacing w:after="20"/>
-            </w:pPr>
-            <w:r/>
-            <w:r>
-              <w:rPr>
-                <w:b w:val="0"/>
-                <w:i w:val="0"/>
-                <w:sz w:val="20"/>
-              </w:rPr>
-              <w:t>DatagramPacket p = new DatagramPacket(buf, buf.length);</w:t>
-              <w:br/>
-              <w:t>s.receive(p);  // xử lý p.getData(), p.getLength()</w:t>
-            </w:r>
-          </w:p>
-        </w:tc>
-      </w:tr>
-      <w:tr>
-        <w:tc>
-          <w:tcPr>
-            <w:tcW w:type="dxa" w:w="794"/>
-          </w:tcPr>
-          <w:p>
-            <w:pPr>
-              <w:spacing w:after="20"/>
-            </w:pPr>
-            <w:r/>
-            <w:r>
-              <w:rPr>
-                <w:b w:val="0"/>
-                <w:i w:val="0"/>
-                <w:sz w:val="20"/>
-              </w:rPr>
-              <w:t>4</w:t>
-            </w:r>
-          </w:p>
-        </w:tc>
-        <w:tc>
-          <w:tcPr>
-            <w:tcW w:type="dxa" w:w="4422"/>
-          </w:tcPr>
-          <w:p>
-            <w:pPr>
-              <w:spacing w:after="20"/>
-            </w:pPr>
-            <w:r/>
-            <w:r>
-              <w:rPr>
-                <w:b w:val="0"/>
-                <w:i w:val="0"/>
-                <w:sz w:val="20"/>
-              </w:rPr>
-              <w:t>s.close();</w:t>
-            </w:r>
-          </w:p>
-        </w:tc>
-        <w:tc>
-          <w:tcPr>
-            <w:tcW w:type="dxa" w:w="4422"/>
-          </w:tcPr>
-          <w:p>
-            <w:pPr>
-              <w:spacing w:after="20"/>
-            </w:pPr>
-            <w:r/>
-            <w:r>
-              <w:rPr>
-                <w:b w:val="0"/>
-                <w:i w:val="0"/>
-                <w:sz w:val="20"/>
-              </w:rPr>
-              <w:t>s.leaveGroup(...); s.close();</w:t>
-            </w:r>
-          </w:p>
-        </w:tc>
-      </w:tr>
-    </w:tbl>
-    <w:p>
-      <w:pPr>
-        <w:spacing w:after="40"/>
-      </w:pPr>
-    </w:p>
-    <w:p>
-      <w:r>
-        <w:rPr>
-          <w:b w:val="0"/>
-          <w:i w:val="0"/>
-        </w:rPr>
-        <w:t xml:space="preserve">Tất cả máy dùng chung một </w:t>
-      </w:r>
-      <w:r>
-        <w:rPr>
-          <w:b/>
-          <w:i w:val="0"/>
-        </w:rPr>
-        <w:t>địa chỉ nhóm</w:t>
-      </w:r>
-      <w:r>
-        <w:rPr>
-          <w:b w:val="0"/>
-          <w:i w:val="0"/>
-        </w:rPr>
-        <w:t xml:space="preserve"> và </w:t>
-      </w:r>
-      <w:r>
-        <w:rPr>
-          <w:b/>
-          <w:i w:val="0"/>
-        </w:rPr>
-        <w:t>cổng</w:t>
-      </w:r>
-      <w:r>
-        <w:rPr>
-          <w:b w:val="0"/>
-          <w:i w:val="0"/>
-        </w:rPr>
-        <w:t>. Máy nhận phải join trước khi máy gửi gửi dữ liệu (multicast không lưu trữ gói). Một máy vừa gửi vừa nhận (chat) chỉ cần một MulticastSocket đã join, gửi tới địa chỉ nhóm và receive() trên luồng riêng.</w:t>
-      </w:r>
-    </w:p>
-    <w:p>
-      <w:pPr>
-        <w:spacing w:after="80" w:before="160"/>
-      </w:pPr>
-      <w:r>
-        <w:rPr>
-          <w:b/>
-          <w:color w:val="C00000"/>
-        </w:rPr>
-        <w:t>▪  BAI08_LT04:</w:t>
-      </w:r>
-    </w:p>
-    <w:p>
-      <w:r>
-        <w:rPr>
-          <w:b w:val="0"/>
-          <w:i/>
-        </w:rPr>
-        <w:t>Những vấn đề cần lưu ý khi phát triển ứng dụng multicast bằng Java để dữ liệu đến đúng mọi thành viên và ứng dụng ổn định.</w:t>
-      </w:r>
-    </w:p>
-    <w:tbl>
-      <w:tblPr>
-        <w:tblStyle w:val="TableGrid"/>
-        <w:tblW w:type="auto" w:w="0"/>
-        <w:jc w:val="center"/>
-        <w:tblLook w:firstColumn="1" w:firstRow="1" w:lastColumn="0" w:lastRow="0" w:noHBand="0" w:noVBand="1" w:val="04A0"/>
-      </w:tblPr>
-      <w:tblGrid>
-        <w:gridCol w:w="4819"/>
-        <w:gridCol w:w="4819"/>
-      </w:tblGrid>
-      <w:tr>
-        <w:tc>
-          <w:tcPr>
-            <w:tcW w:type="dxa" w:w="2438"/>
-            <w:shd w:val="clear" w:color="auto" w:fill="D9E2F3"/>
-          </w:tcPr>
-          <w:p>
-            <w:pPr>
-              <w:spacing w:after="20"/>
-            </w:pPr>
-            <w:r/>
-            <w:r>
-              <w:rPr>
-                <w:b/>
-                <w:i w:val="0"/>
-                <w:sz w:val="22"/>
-              </w:rPr>
-              <w:t>Vấn đề</w:t>
-            </w:r>
-          </w:p>
-        </w:tc>
-        <w:tc>
-          <w:tcPr>
-            <w:tcW w:type="dxa" w:w="7200"/>
-            <w:shd w:val="clear" w:color="auto" w:fill="D9E2F3"/>
-          </w:tcPr>
-          <w:p>
-            <w:pPr>
-              <w:spacing w:after="20"/>
-            </w:pPr>
-            <w:r/>
-            <w:r>
-              <w:rPr>
-                <w:b/>
-                <w:i w:val="0"/>
-                <w:sz w:val="22"/>
-              </w:rPr>
-              <w:t>Cách xử lý</w:t>
-            </w:r>
-          </w:p>
-        </w:tc>
-      </w:tr>
-      <w:tr>
-        <w:tc>
-          <w:tcPr>
-            <w:tcW w:type="dxa" w:w="2438"/>
-          </w:tcPr>
-          <w:p>
-            <w:pPr>
-              <w:spacing w:after="20"/>
-            </w:pPr>
-            <w:r/>
-            <w:r>
-              <w:rPr>
-                <w:b w:val="0"/>
-                <w:i w:val="0"/>
-                <w:sz w:val="22"/>
-              </w:rPr>
-              <w:t>Chọn địa chỉ nhóm và cổng</w:t>
-            </w:r>
-          </w:p>
-        </w:tc>
-        <w:tc>
-          <w:tcPr>
-            <w:tcW w:type="dxa" w:w="7200"/>
-          </w:tcPr>
-          <w:p>
-            <w:pPr>
-              <w:spacing w:after="20"/>
-            </w:pPr>
-            <w:r/>
-            <w:r>
-              <w:rPr>
-                <w:b w:val="0"/>
-                <w:i w:val="0"/>
-                <w:sz w:val="22"/>
-              </w:rPr>
-              <w:t>Dùng dải 239.0.0.0/8 (administratively scoped) hoặc dải được phép cho ứng dụng nội bộ; tránh 224.0.0.x (dành cho giao thức định tuyến); kiểm tra isMulticastAddress(); mọi thành viên dùng chung địa chỉ + cổng.</w:t>
-            </w:r>
-          </w:p>
-        </w:tc>
-      </w:tr>
-      <w:tr>
-        <w:tc>
-          <w:tcPr>
-            <w:tcW w:type="dxa" w:w="2438"/>
-          </w:tcPr>
-          <w:p>
-            <w:pPr>
-              <w:spacing w:after="20"/>
-            </w:pPr>
-            <w:r/>
-            <w:r>
-              <w:rPr>
-                <w:b w:val="0"/>
-                <w:i w:val="0"/>
-                <w:sz w:val="22"/>
-              </w:rPr>
-              <w:t>TTL và phạm vi</w:t>
-            </w:r>
-          </w:p>
-        </w:tc>
-        <w:tc>
-          <w:tcPr>
-            <w:tcW w:type="dxa" w:w="7200"/>
-          </w:tcPr>
-          <w:p>
-            <w:pPr>
-              <w:spacing w:after="20"/>
-            </w:pPr>
-            <w:r/>
-            <w:r>
-              <w:rPr>
-                <w:b w:val="0"/>
-                <w:i w:val="0"/>
-                <w:sz w:val="22"/>
-              </w:rPr>
-              <w:t>setTimeToLive(1) cho LAN; tăng TTL khi cần qua router có hỗ trợ multicast; TTL quá lớn có thể làm rò rỉ dữ liệu ra ngoài.</w:t>
-            </w:r>
-          </w:p>
-        </w:tc>
-      </w:tr>
-      <w:tr>
-        <w:tc>
-          <w:tcPr>
-            <w:tcW w:type="dxa" w:w="2438"/>
-          </w:tcPr>
-          <w:p>
-            <w:pPr>
-              <w:spacing w:after="20"/>
-            </w:pPr>
-            <w:r/>
-            <w:r>
-              <w:rPr>
-                <w:b w:val="0"/>
-                <w:i w:val="0"/>
-                <w:sz w:val="22"/>
-              </w:rPr>
-              <w:t>Card mạng (NetworkInterface)</w:t>
-            </w:r>
-          </w:p>
-        </w:tc>
-        <w:tc>
-          <w:tcPr>
-            <w:tcW w:type="dxa" w:w="7200"/>
-          </w:tcPr>
-          <w:p>
-            <w:pPr>
-              <w:spacing w:after="20"/>
-            </w:pPr>
-            <w:r/>
-            <w:r>
-              <w:rPr>
-                <w:b w:val="0"/>
-                <w:i w:val="0"/>
-                <w:sz w:val="22"/>
-              </w:rPr>
-              <w:t>Máy nhiều card (Wi-Fi, LAN, VPN, VirtualBox) có thể join/gửi nhầm card → chỉ định rõ bằng joinGroup(addr, netIf) / setNetworkInterface(); có thể dùng -Djava.net.preferIPv4Stack=true.</w:t>
-            </w:r>
-          </w:p>
-        </w:tc>
-      </w:tr>
-      <w:tr>
-        <w:tc>
-          <w:tcPr>
-            <w:tcW w:type="dxa" w:w="2438"/>
-          </w:tcPr>
-          <w:p>
-            <w:pPr>
-              <w:spacing w:after="20"/>
-            </w:pPr>
-            <w:r/>
-            <w:r>
-              <w:rPr>
-                <w:b w:val="0"/>
-                <w:i w:val="0"/>
-                <w:sz w:val="22"/>
-              </w:rPr>
-              <w:t>Thứ tự join</w:t>
-            </w:r>
-          </w:p>
-        </w:tc>
-        <w:tc>
-          <w:tcPr>
-            <w:tcW w:type="dxa" w:w="7200"/>
-          </w:tcPr>
-          <w:p>
-            <w:pPr>
-              <w:spacing w:after="20"/>
-            </w:pPr>
-            <w:r/>
-            <w:r>
-              <w:rPr>
-                <w:b w:val="0"/>
-                <w:i w:val="0"/>
-                <w:sz w:val="22"/>
-              </w:rPr>
-              <w:t>Máy nhận phải joinGroup() trước khi bên gửi phát; gói đến lúc chưa join sẽ mất. Nhắc lại thông tin quan trọng định kỳ (META trong BT03).</w:t>
-            </w:r>
-          </w:p>
-        </w:tc>
-      </w:tr>
-      <w:tr>
-        <w:tc>
-          <w:tcPr>
-            <w:tcW w:type="dxa" w:w="2438"/>
-          </w:tcPr>
-          <w:p>
-            <w:pPr>
-              <w:spacing w:after="20"/>
-            </w:pPr>
-            <w:r/>
-            <w:r>
-              <w:rPr>
-                <w:b w:val="0"/>
-                <w:i w:val="0"/>
-                <w:sz w:val="22"/>
-              </w:rPr>
-              <w:t>Mất gói, trùng gói, sai thứ tự</w:t>
-            </w:r>
-          </w:p>
-        </w:tc>
-        <w:tc>
-          <w:tcPr>
-            <w:tcW w:type="dxa" w:w="7200"/>
-          </w:tcPr>
-          <w:p>
-            <w:pPr>
-              <w:spacing w:after="20"/>
-            </w:pPr>
-            <w:r/>
-            <w:r>
-              <w:rPr>
-                <w:b w:val="0"/>
-                <w:i w:val="0"/>
-                <w:sz w:val="22"/>
-              </w:rPr>
-              <w:t>Đánh số thứ tự (sequence number), lưu trạng thái đã nhận (BitSet), bỏ gói trùng, sắp xếp lại theo seq/offset; cơ chế NACK/ACK để gửi lại hoặc FEC (mã sửa lỗi) khi cần tin cậy.</w:t>
-            </w:r>
-          </w:p>
-        </w:tc>
-      </w:tr>
-      <w:tr>
-        <w:tc>
-          <w:tcPr>
-            <w:tcW w:type="dxa" w:w="2438"/>
-          </w:tcPr>
-          <w:p>
-            <w:pPr>
-              <w:spacing w:after="20"/>
-            </w:pPr>
-            <w:r/>
-            <w:r>
-              <w:rPr>
-                <w:b w:val="0"/>
-                <w:i w:val="0"/>
-                <w:sz w:val="22"/>
-              </w:rPr>
-              <w:t>Toàn vẹn dữ liệu</w:t>
-            </w:r>
-          </w:p>
-        </w:tc>
-        <w:tc>
-          <w:tcPr>
-            <w:tcW w:type="dxa" w:w="7200"/>
-          </w:tcPr>
-          <w:p>
-            <w:pPr>
-              <w:spacing w:after="20"/>
-            </w:pPr>
-            <w:r/>
-            <w:r>
-              <w:rPr>
-                <w:b w:val="0"/>
-                <w:i w:val="0"/>
-                <w:sz w:val="22"/>
-              </w:rPr>
-              <w:t>Checksum từng gói (CRC32) và băm toàn bộ (SHA-256/MD5) để kiểm tra kết quả cuối.</w:t>
-            </w:r>
-          </w:p>
-        </w:tc>
-      </w:tr>
-      <w:tr>
-        <w:tc>
-          <w:tcPr>
-            <w:tcW w:type="dxa" w:w="2438"/>
-          </w:tcPr>
-          <w:p>
-            <w:pPr>
-              <w:spacing w:after="20"/>
-            </w:pPr>
-            <w:r/>
-            <w:r>
-              <w:rPr>
-                <w:b w:val="0"/>
-                <w:i w:val="0"/>
-                <w:sz w:val="22"/>
-              </w:rPr>
-              <w:t>Kích thước gói</w:t>
-            </w:r>
-          </w:p>
-        </w:tc>
-        <w:tc>
-          <w:tcPr>
-            <w:tcW w:type="dxa" w:w="7200"/>
-          </w:tcPr>
-          <w:p>
-            <w:pPr>
-              <w:spacing w:after="20"/>
-            </w:pPr>
-            <w:r/>
-            <w:r>
-              <w:rPr>
-                <w:b w:val="0"/>
-                <w:i w:val="0"/>
-                <w:sz w:val="22"/>
-              </w:rPr>
-              <w:t>Giữ dữ liệu mỗi gói ≤ ~1400 byte (dưới MTU) để không bị phân mảnh IP; bộ đệm nhận đủ lớn, kiểm tra getLength() thay vì dùng cả mảng buffer.</w:t>
-            </w:r>
-          </w:p>
-        </w:tc>
-      </w:tr>
-      <w:tr>
-        <w:tc>
-          <w:tcPr>
-            <w:tcW w:type="dxa" w:w="2438"/>
-          </w:tcPr>
-          <w:p>
-            <w:pPr>
-              <w:spacing w:after="20"/>
-            </w:pPr>
-            <w:r/>
-            <w:r>
-              <w:rPr>
-                <w:b w:val="0"/>
-                <w:i w:val="0"/>
-                <w:sz w:val="22"/>
-              </w:rPr>
-              <w:t>Tốc độ gửi / tràn bộ đệm</w:t>
-            </w:r>
-          </w:p>
-        </w:tc>
-        <w:tc>
-          <w:tcPr>
-            <w:tcW w:type="dxa" w:w="7200"/>
-          </w:tcPr>
-          <w:p>
-            <w:pPr>
-              <w:spacing w:after="20"/>
-            </w:pPr>
-            <w:r/>
-            <w:r>
-              <w:rPr>
-                <w:b w:val="0"/>
-                <w:i w:val="0"/>
-                <w:sz w:val="22"/>
-              </w:rPr>
-              <w:t>Điều tiết tốc độ (Thread.sleep, token bucket), tăng setReceiveBufferSize() ở máy nhận; máy nhận xử lý nhanh, không làm việc nặng trong luồng receive().</w:t>
-            </w:r>
-          </w:p>
-        </w:tc>
-      </w:tr>
-      <w:tr>
-        <w:tc>
-          <w:tcPr>
-            <w:tcW w:type="dxa" w:w="2438"/>
-          </w:tcPr>
-          <w:p>
-            <w:pPr>
-              <w:spacing w:after="20"/>
-            </w:pPr>
-            <w:r/>
-            <w:r>
-              <w:rPr>
-                <w:b w:val="0"/>
-                <w:i w:val="0"/>
-                <w:sz w:val="22"/>
-              </w:rPr>
-              <w:t>Đa luồng và giao diện</w:t>
-            </w:r>
-          </w:p>
-        </w:tc>
-        <w:tc>
-          <w:tcPr>
-            <w:tcW w:type="dxa" w:w="7200"/>
-          </w:tcPr>
-          <w:p>
-            <w:pPr>
-              <w:spacing w:after="20"/>
-            </w:pPr>
-            <w:r/>
-            <w:r>
-              <w:rPr>
-                <w:b w:val="0"/>
-                <w:i w:val="0"/>
-                <w:sz w:val="22"/>
-              </w:rPr>
-              <w:t>Luồng nhận riêng (receive() block), luồng gửi riêng; cập nhật Swing qua SwingUtilities.invokeLater; dùng biến volatile/đồng bộ khi chia sẻ socket.</w:t>
-            </w:r>
-          </w:p>
-        </w:tc>
-      </w:tr>
-      <w:tr>
-        <w:tc>
-          <w:tcPr>
-            <w:tcW w:type="dxa" w:w="2438"/>
-          </w:tcPr>
-          <w:p>
-            <w:pPr>
-              <w:spacing w:after="20"/>
-            </w:pPr>
-            <w:r/>
-            <w:r>
-              <w:rPr>
-                <w:b w:val="0"/>
-                <w:i w:val="0"/>
-                <w:sz w:val="22"/>
-              </w:rPr>
-              <w:t>Mã hoá ký tự và định dạng</w:t>
-            </w:r>
-          </w:p>
-        </w:tc>
-        <w:tc>
-          <w:tcPr>
-            <w:tcW w:type="dxa" w:w="7200"/>
-          </w:tcPr>
-          <w:p>
-            <w:pPr>
-              <w:spacing w:after="20"/>
-            </w:pPr>
-            <w:r/>
-            <w:r>
-              <w:rPr>
-                <w:b w:val="0"/>
-                <w:i w:val="0"/>
-                <w:sz w:val="22"/>
-              </w:rPr>
-              <w:t>Thống nhất UTF-8 khi getBytes()/new String(); định nghĩa giao thức rõ ràng (header, loại gói, phân tách trường), bỏ qua gói sai định dạng thay vì để chương trình lỗi.</w:t>
-            </w:r>
-          </w:p>
-        </w:tc>
-      </w:tr>
-      <w:tr>
-        <w:tc>
-          <w:tcPr>
-            <w:tcW w:type="dxa" w:w="2438"/>
-          </w:tcPr>
-          <w:p>
-            <w:pPr>
-              <w:spacing w:after="20"/>
-            </w:pPr>
-            <w:r/>
-            <w:r>
-              <w:rPr>
-                <w:b w:val="0"/>
-                <w:i w:val="0"/>
-                <w:sz w:val="22"/>
-              </w:rPr>
-              <w:t>Giải phóng tài nguyên</w:t>
-            </w:r>
-          </w:p>
-        </w:tc>
-        <w:tc>
-          <w:tcPr>
-            <w:tcW w:type="dxa" w:w="7200"/>
-          </w:tcPr>
-          <w:p>
-            <w:pPr>
-              <w:spacing w:after="20"/>
-            </w:pPr>
-            <w:r/>
-            <w:r>
-              <w:rPr>
-                <w:b w:val="0"/>
-                <w:i w:val="0"/>
-                <w:sz w:val="22"/>
-              </w:rPr>
-              <w:t>leaveGroup() và close() khi thoát (try-with-resources, xử lý sự kiện đóng cửa sổ); setSoTimeout() để vòng lặp không treo mãi.</w:t>
-            </w:r>
-          </w:p>
-        </w:tc>
-      </w:tr>
-      <w:tr>
-        <w:tc>
-          <w:tcPr>
-            <w:tcW w:type="dxa" w:w="2438"/>
-          </w:tcPr>
-          <w:p>
-            <w:pPr>
-              <w:spacing w:after="20"/>
-            </w:pPr>
-            <w:r/>
-            <w:r>
-              <w:rPr>
-                <w:b w:val="0"/>
-                <w:i w:val="0"/>
-                <w:sz w:val="22"/>
-              </w:rPr>
-              <w:t>Bảo mật</w:t>
-            </w:r>
-          </w:p>
-        </w:tc>
-        <w:tc>
-          <w:tcPr>
-            <w:tcW w:type="dxa" w:w="7200"/>
-          </w:tcPr>
-          <w:p>
-            <w:pPr>
-              <w:spacing w:after="20"/>
-            </w:pPr>
-            <w:r/>
-            <w:r>
-              <w:rPr>
-                <w:b w:val="0"/>
-                <w:i w:val="0"/>
-                <w:sz w:val="22"/>
-              </w:rPr>
-              <w:t>Bất kỳ ai trong mạng cũng có thể nghe/gửi → mã hoá (AES), ký/xác thực (HMAC) nếu dữ liệu nhạy cảm; kiểm tra nguồn gửi.</w:t>
-            </w:r>
-          </w:p>
-        </w:tc>
-      </w:tr>
-      <w:tr>
-        <w:tc>
-          <w:tcPr>
-            <w:tcW w:type="dxa" w:w="2438"/>
-          </w:tcPr>
-          <w:p>
-            <w:pPr>
-              <w:spacing w:after="20"/>
-            </w:pPr>
-            <w:r/>
-            <w:r>
-              <w:rPr>
-                <w:b w:val="0"/>
-                <w:i w:val="0"/>
-                <w:sz w:val="22"/>
-              </w:rPr>
-              <w:t>Hạ tầng và kiểm thử</w:t>
-            </w:r>
-          </w:p>
-        </w:tc>
-        <w:tc>
-          <w:tcPr>
-            <w:tcW w:type="dxa" w:w="7200"/>
-          </w:tcPr>
-          <w:p>
-            <w:pPr>
-              <w:spacing w:after="20"/>
-            </w:pPr>
-            <w:r/>
-            <w:r>
-              <w:rPr>
-                <w:b w:val="0"/>
-                <w:i w:val="0"/>
-                <w:sz w:val="22"/>
-              </w:rPr>
-              <w:t>Kiểm tra switch có IGMP snooping, router có PIM, tường lửa mở cổng UDP; thử nhiều máy nhận, nhiều máy/cùng máy, giả lập mất gói để kiểm tra độ ổn định.</w:t>
-            </w:r>
-          </w:p>
-        </w:tc>
-      </w:tr>
-    </w:tbl>
-    <w:p>
-      <w:pPr>
-        <w:spacing w:after="40"/>
-      </w:pPr>
-    </w:p>
-    <w:p>
-      <w:pPr>
-        <w:spacing w:after="80" w:before="160"/>
-      </w:pPr>
-      <w:r>
-        <w:rPr>
-          <w:b/>
-          <w:color w:val="C00000"/>
-        </w:rPr>
-        <w:t>▪  BAI08_LT05:</w:t>
-      </w:r>
-    </w:p>
-    <w:p>
-      <w:r>
-        <w:rPr>
-          <w:b w:val="0"/>
-          <w:i/>
-        </w:rPr>
-        <w:t>Đề xuất giải pháp phân phối video cho hàng nghìn người dùng trên Internet mà ít can thiệp nhất vào hạ tầng.</w:t>
-      </w:r>
-    </w:p>
-    <w:p>
-      <w:pPr>
-        <w:spacing w:after="40" w:before="120"/>
-      </w:pPr>
-      <w:r>
-        <w:rPr>
-          <w:b/>
-          <w:i w:val="0"/>
-        </w:rPr>
-        <w:t>Phân tích bài toán</w:t>
-      </w:r>
-    </w:p>
-    <w:p>
-      <w:pPr>
-        <w:tabs>
-          <w:tab w:pos="454" w:val="left"/>
-        </w:tabs>
-        <w:spacing w:after="40"/>
-        <w:ind w:left="454" w:hanging="283"/>
-      </w:pPr>
-      <w:r>
-        <w:rPr>
-          <w:b w:val="0"/>
-          <w:i w:val="0"/>
-        </w:rPr>
-        <w:t>•</w:t>
-        <w:tab/>
-        <w:t>IP multicast tiết kiệm băng thông nhất nhưng các ISP hầu như không định tuyến multicast giữa các mạng; muốn dùng phải cấu hình PIM/IGMP trên router của nhiều bên – trái với yêu cầu “ít thay đổi hạ tầng”.</w:t>
-      </w:r>
-    </w:p>
-    <w:p>
-      <w:pPr>
-        <w:tabs>
-          <w:tab w:pos="454" w:val="left"/>
-        </w:tabs>
-        <w:spacing w:after="40"/>
-        <w:ind w:left="454" w:hanging="283"/>
-      </w:pPr>
-      <w:r>
-        <w:rPr>
-          <w:b w:val="0"/>
-          <w:i w:val="0"/>
-        </w:rPr>
-        <w:t>•</w:t>
-        <w:tab/>
-        <w:t xml:space="preserve">Unicast trực tiếp từ một máy chủ thì không khả thi về băng thông: 5.000 người xem × 3 Mbps = </w:t>
-      </w:r>
-      <w:r>
-        <w:rPr>
-          <w:b/>
-          <w:i w:val="0"/>
-        </w:rPr>
-        <w:t>15 Gbps</w:t>
-      </w:r>
-      <w:r>
-        <w:rPr>
-          <w:b w:val="0"/>
-          <w:i w:val="0"/>
-        </w:rPr>
-        <w:t xml:space="preserve"> tại một điểm.</w:t>
-      </w:r>
-    </w:p>
-    <w:p>
-      <w:pPr>
-        <w:spacing w:after="40" w:before="120"/>
-      </w:pPr>
-      <w:r>
-        <w:rPr>
-          <w:b/>
-          <w:i w:val="0"/>
-        </w:rPr>
-        <w:t>Các phương án có thể dùng</w:t>
-      </w:r>
-    </w:p>
-    <w:tbl>
-      <w:tblPr>
-        <w:tblStyle w:val="TableGrid"/>
-        <w:tblW w:type="auto" w:w="0"/>
-        <w:jc w:val="center"/>
-        <w:tblLook w:firstColumn="1" w:firstRow="1" w:lastColumn="0" w:lastRow="0" w:noHBand="0" w:noVBand="1" w:val="04A0"/>
-      </w:tblPr>
-      <w:tblGrid>
-        <w:gridCol w:w="2409"/>
-        <w:gridCol w:w="2409"/>
-        <w:gridCol w:w="2409"/>
-        <w:gridCol w:w="2409"/>
-      </w:tblGrid>
-      <w:tr>
-        <w:tc>
-          <w:tcPr>
-            <w:tcW w:type="dxa" w:w="2041"/>
-            <w:shd w:val="clear" w:color="auto" w:fill="D9E2F3"/>
-          </w:tcPr>
-          <w:p>
-            <w:pPr>
-              <w:spacing w:after="20"/>
-            </w:pPr>
-            <w:r/>
-            <w:r>
-              <w:rPr>
-                <w:b/>
-                <w:i w:val="0"/>
-                <w:sz w:val="20"/>
-              </w:rPr>
-              <w:t>Phương án</w:t>
-            </w:r>
-          </w:p>
-        </w:tc>
-        <w:tc>
-          <w:tcPr>
-            <w:tcW w:type="dxa" w:w="2608"/>
-            <w:shd w:val="clear" w:color="auto" w:fill="D9E2F3"/>
-          </w:tcPr>
-          <w:p>
-            <w:pPr>
-              <w:spacing w:after="20"/>
-            </w:pPr>
-            <w:r/>
-            <w:r>
-              <w:rPr>
-                <w:b/>
-                <w:i w:val="0"/>
-                <w:sz w:val="20"/>
-              </w:rPr>
-              <w:t>Ưu điểm</w:t>
-            </w:r>
-          </w:p>
-        </w:tc>
-        <w:tc>
-          <w:tcPr>
-            <w:tcW w:type="dxa" w:w="2835"/>
-            <w:shd w:val="clear" w:color="auto" w:fill="D9E2F3"/>
-          </w:tcPr>
-          <w:p>
-            <w:pPr>
-              <w:spacing w:after="20"/>
-            </w:pPr>
-            <w:r/>
-            <w:r>
-              <w:rPr>
-                <w:b/>
-                <w:i w:val="0"/>
-                <w:sz w:val="20"/>
-              </w:rPr>
-              <w:t>Nhược điểm</w:t>
-            </w:r>
-          </w:p>
-        </w:tc>
-        <w:tc>
-          <w:tcPr>
-            <w:tcW w:type="dxa" w:w="1701"/>
-            <w:shd w:val="clear" w:color="auto" w:fill="D9E2F3"/>
-          </w:tcPr>
-          <w:p>
-            <w:pPr>
-              <w:spacing w:after="20"/>
-            </w:pPr>
-            <w:r/>
-            <w:r>
-              <w:rPr>
-                <w:b/>
-                <w:i w:val="0"/>
-                <w:sz w:val="20"/>
-              </w:rPr>
-              <w:t>Can thiệp hạ tầng</w:t>
-            </w:r>
-          </w:p>
-        </w:tc>
-      </w:tr>
-      <w:tr>
-        <w:tc>
-          <w:tcPr>
-            <w:tcW w:type="dxa" w:w="2041"/>
-          </w:tcPr>
-          <w:p>
-            <w:pPr>
-              <w:spacing w:after="20"/>
-            </w:pPr>
-            <w:r/>
-            <w:r>
-              <w:rPr>
-                <w:b w:val="0"/>
-                <w:i w:val="0"/>
-                <w:sz w:val="20"/>
-              </w:rPr>
-              <w:t>IP Multicast trên Internet / AMT tunnel</w:t>
-            </w:r>
-          </w:p>
-        </w:tc>
-        <w:tc>
-          <w:tcPr>
-            <w:tcW w:type="dxa" w:w="2608"/>
-          </w:tcPr>
-          <w:p>
-            <w:pPr>
-              <w:spacing w:after="20"/>
-            </w:pPr>
-            <w:r/>
-            <w:r>
-              <w:rPr>
-                <w:b w:val="0"/>
-                <w:i w:val="0"/>
-                <w:sz w:val="20"/>
-              </w:rPr>
-              <w:t>Tiết kiệm băng thông nhất</w:t>
-            </w:r>
-          </w:p>
-        </w:tc>
-        <w:tc>
-          <w:tcPr>
-            <w:tcW w:type="dxa" w:w="2835"/>
-          </w:tcPr>
-          <w:p>
-            <w:pPr>
-              <w:spacing w:after="20"/>
-            </w:pPr>
-            <w:r/>
-            <w:r>
-              <w:rPr>
-                <w:b w:val="0"/>
-                <w:i w:val="0"/>
-                <w:sz w:val="20"/>
-              </w:rPr>
-              <w:t>ISP không hỗ trợ; AMT cần relay, ít trình duyệt/thiết bị hỗ trợ</w:t>
-            </w:r>
-          </w:p>
-        </w:tc>
-        <w:tc>
-          <w:tcPr>
-            <w:tcW w:type="dxa" w:w="1701"/>
-          </w:tcPr>
-          <w:p>
-            <w:pPr>
-              <w:spacing w:after="20"/>
-            </w:pPr>
-            <w:r/>
-            <w:r>
-              <w:rPr>
-                <w:b w:val="0"/>
-                <w:i w:val="0"/>
-                <w:sz w:val="20"/>
-              </w:rPr>
-              <w:t>Rất lớn</w:t>
-            </w:r>
-          </w:p>
-        </w:tc>
-      </w:tr>
-      <w:tr>
-        <w:tc>
-          <w:tcPr>
-            <w:tcW w:type="dxa" w:w="2041"/>
-          </w:tcPr>
-          <w:p>
-            <w:pPr>
-              <w:spacing w:after="20"/>
-            </w:pPr>
-            <w:r/>
-            <w:r>
-              <w:rPr>
-                <w:b w:val="0"/>
-                <w:i w:val="0"/>
-                <w:sz w:val="20"/>
-              </w:rPr>
-              <w:t>Unicast từ 1 server</w:t>
-            </w:r>
-          </w:p>
-        </w:tc>
-        <w:tc>
-          <w:tcPr>
-            <w:tcW w:type="dxa" w:w="2608"/>
-          </w:tcPr>
-          <w:p>
-            <w:pPr>
-              <w:spacing w:after="20"/>
-            </w:pPr>
-            <w:r/>
-            <w:r>
-              <w:rPr>
-                <w:b w:val="0"/>
-                <w:i w:val="0"/>
-                <w:sz w:val="20"/>
-              </w:rPr>
-              <w:t>Đơn giản</w:t>
-            </w:r>
-          </w:p>
-        </w:tc>
-        <w:tc>
-          <w:tcPr>
-            <w:tcW w:type="dxa" w:w="2835"/>
-          </w:tcPr>
-          <w:p>
-            <w:pPr>
-              <w:spacing w:after="20"/>
-            </w:pPr>
-            <w:r/>
-            <w:r>
-              <w:rPr>
-                <w:b w:val="0"/>
-                <w:i w:val="0"/>
-                <w:sz w:val="20"/>
-              </w:rPr>
-              <w:t>Không mở rộng, nghẽn tại nguồn, đắt</w:t>
-            </w:r>
-          </w:p>
-        </w:tc>
-        <w:tc>
-          <w:tcPr>
-            <w:tcW w:type="dxa" w:w="1701"/>
-          </w:tcPr>
-          <w:p>
-            <w:pPr>
-              <w:spacing w:after="20"/>
-            </w:pPr>
-            <w:r/>
-            <w:r>
-              <w:rPr>
-                <w:b w:val="0"/>
-                <w:i w:val="0"/>
-                <w:sz w:val="20"/>
-              </w:rPr>
-              <w:t>Phải nâng cấp máy chủ, đường truyền</w:t>
-            </w:r>
-          </w:p>
-        </w:tc>
-      </w:tr>
-      <w:tr>
-        <w:tc>
-          <w:tcPr>
-            <w:tcW w:type="dxa" w:w="2041"/>
-          </w:tcPr>
-          <w:p>
-            <w:pPr>
-              <w:spacing w:after="20"/>
-            </w:pPr>
-            <w:r/>
-            <w:r>
-              <w:rPr>
-                <w:b w:val="0"/>
-                <w:i w:val="0"/>
-                <w:sz w:val="20"/>
-              </w:rPr>
-              <w:t>HTTP Adaptive Streaming (HLS/MPEG-DASH) + CDN</w:t>
-            </w:r>
-          </w:p>
-        </w:tc>
-        <w:tc>
-          <w:tcPr>
-            <w:tcW w:type="dxa" w:w="2608"/>
-          </w:tcPr>
-          <w:p>
-            <w:pPr>
-              <w:spacing w:after="20"/>
-            </w:pPr>
-            <w:r/>
-            <w:r>
-              <w:rPr>
-                <w:b w:val="0"/>
-                <w:i w:val="0"/>
-                <w:sz w:val="20"/>
-              </w:rPr>
-              <w:t>Chạy trên HTTP/TCP sẵn có, qua mọi NAT/firewall; CDN có cache gần người dùng; bitrate thích ứng theo mạng; trình duyệt, điện thoại, Smart TV đều hỗ trợ</w:t>
-            </w:r>
-          </w:p>
-        </w:tc>
-        <w:tc>
-          <w:tcPr>
-            <w:tcW w:type="dxa" w:w="2835"/>
-          </w:tcPr>
-          <w:p>
-            <w:pPr>
-              <w:spacing w:after="20"/>
-            </w:pPr>
-            <w:r/>
-            <w:r>
-              <w:rPr>
-                <w:b w:val="0"/>
-                <w:i w:val="0"/>
-                <w:sz w:val="20"/>
-              </w:rPr>
-              <w:t>Độ trễ 3–30 s (LL-HLS giảm còn 2–5 s); trả phí CDN</w:t>
-            </w:r>
-          </w:p>
-        </w:tc>
-        <w:tc>
-          <w:tcPr>
-            <w:tcW w:type="dxa" w:w="1701"/>
-          </w:tcPr>
-          <w:p>
-            <w:pPr>
-              <w:spacing w:after="20"/>
-            </w:pPr>
-            <w:r/>
-            <w:r>
-              <w:rPr>
-                <w:b w:val="0"/>
-                <w:i w:val="0"/>
-                <w:sz w:val="20"/>
-              </w:rPr>
-              <w:t>Gần như không</w:t>
-            </w:r>
-          </w:p>
-        </w:tc>
-      </w:tr>
-      <w:tr>
-        <w:tc>
-          <w:tcPr>
-            <w:tcW w:type="dxa" w:w="2041"/>
-          </w:tcPr>
-          <w:p>
-            <w:pPr>
-              <w:spacing w:after="20"/>
-            </w:pPr>
-            <w:r/>
-            <w:r>
-              <w:rPr>
-                <w:b w:val="0"/>
-                <w:i w:val="0"/>
-                <w:sz w:val="20"/>
-              </w:rPr>
-              <w:t>WebRTC + SFU</w:t>
-            </w:r>
-          </w:p>
-        </w:tc>
-        <w:tc>
-          <w:tcPr>
-            <w:tcW w:type="dxa" w:w="2608"/>
-          </w:tcPr>
-          <w:p>
-            <w:pPr>
-              <w:spacing w:after="20"/>
-            </w:pPr>
-            <w:r/>
-            <w:r>
-              <w:rPr>
-                <w:b w:val="0"/>
-                <w:i w:val="0"/>
-                <w:sz w:val="20"/>
-              </w:rPr>
-              <w:t>Độ trễ &lt; 1 s, tương tác hai chiều</w:t>
-            </w:r>
-          </w:p>
-        </w:tc>
-        <w:tc>
-          <w:tcPr>
-            <w:tcW w:type="dxa" w:w="2835"/>
-          </w:tcPr>
-          <w:p>
-            <w:pPr>
-              <w:spacing w:after="20"/>
-            </w:pPr>
-            <w:r/>
-            <w:r>
-              <w:rPr>
-                <w:b w:val="0"/>
-                <w:i w:val="0"/>
-                <w:sz w:val="20"/>
-              </w:rPr>
-              <w:t>Mỗi SFU chỉ phục vụ vài trăm–vài nghìn người; cần cụm SFU, TURN</w:t>
-            </w:r>
-          </w:p>
-        </w:tc>
-        <w:tc>
-          <w:tcPr>
-            <w:tcW w:type="dxa" w:w="1701"/>
-          </w:tcPr>
-          <w:p>
-            <w:pPr>
-              <w:spacing w:after="20"/>
-            </w:pPr>
-            <w:r/>
-            <w:r>
-              <w:rPr>
-                <w:b w:val="0"/>
-                <w:i w:val="0"/>
-                <w:sz w:val="20"/>
-              </w:rPr>
-              <w:t>Ít (thêm máy chủ)</w:t>
-            </w:r>
-          </w:p>
-        </w:tc>
-      </w:tr>
-      <w:tr>
-        <w:tc>
-          <w:tcPr>
-            <w:tcW w:type="dxa" w:w="2041"/>
-          </w:tcPr>
-          <w:p>
-            <w:pPr>
-              <w:spacing w:after="20"/>
-            </w:pPr>
-            <w:r/>
-            <w:r>
-              <w:rPr>
-                <w:b w:val="0"/>
-                <w:i w:val="0"/>
-                <w:sz w:val="20"/>
-              </w:rPr>
-              <w:t>P2P / Application-layer multicast (WebRTC DataChannel, P2P-CDN)</w:t>
-            </w:r>
-          </w:p>
-        </w:tc>
-        <w:tc>
-          <w:tcPr>
-            <w:tcW w:type="dxa" w:w="2608"/>
-          </w:tcPr>
-          <w:p>
-            <w:pPr>
-              <w:spacing w:after="20"/>
-            </w:pPr>
-            <w:r/>
-            <w:r>
-              <w:rPr>
-                <w:b w:val="0"/>
-                <w:i w:val="0"/>
-                <w:sz w:val="20"/>
-              </w:rPr>
-              <w:t>Người xem chia sẻ lại dữ liệu → giảm tải nguồn</w:t>
-            </w:r>
-          </w:p>
-        </w:tc>
-        <w:tc>
-          <w:tcPr>
-            <w:tcW w:type="dxa" w:w="2835"/>
-          </w:tcPr>
-          <w:p>
-            <w:pPr>
-              <w:spacing w:after="20"/>
-            </w:pPr>
-            <w:r/>
-            <w:r>
-              <w:rPr>
-                <w:b w:val="0"/>
-                <w:i w:val="0"/>
-                <w:sz w:val="20"/>
-              </w:rPr>
-              <w:t>Phụ thuộc chất lượng upload của người dùng, NAT, khó kiểm soát chất lượng</w:t>
-            </w:r>
-          </w:p>
-        </w:tc>
-        <w:tc>
-          <w:tcPr>
-            <w:tcW w:type="dxa" w:w="1701"/>
-          </w:tcPr>
-          <w:p>
-            <w:pPr>
-              <w:spacing w:after="20"/>
-            </w:pPr>
-            <w:r/>
-            <w:r>
-              <w:rPr>
-                <w:b w:val="0"/>
-                <w:i w:val="0"/>
-                <w:sz w:val="20"/>
-              </w:rPr>
-              <w:t>Không</w:t>
-            </w:r>
-          </w:p>
-        </w:tc>
-      </w:tr>
-    </w:tbl>
-    <w:p>
-      <w:pPr>
-        <w:spacing w:after="40"/>
-      </w:pPr>
-    </w:p>
-    <w:p>
-      <w:pPr>
-        <w:spacing w:after="40" w:before="120"/>
-      </w:pPr>
-      <w:r>
-        <w:rPr>
-          <w:b/>
-          <w:i w:val="0"/>
-        </w:rPr>
-        <w:t>Giải pháp đề xuất</w:t>
-      </w:r>
-    </w:p>
-    <w:p>
-      <w:r>
-        <w:rPr>
-          <w:b w:val="0"/>
-          <w:i w:val="0"/>
-        </w:rPr>
-        <w:t xml:space="preserve">Chọn </w:t>
-      </w:r>
-      <w:r>
-        <w:rPr>
-          <w:b/>
-          <w:i w:val="0"/>
-        </w:rPr>
-        <w:t>HTTP Adaptive Streaming (HLS hoặc MPEG-DASH) phân phối qua CDN</w:t>
-      </w:r>
-      <w:r>
-        <w:rPr>
-          <w:b w:val="0"/>
-          <w:i w:val="0"/>
-        </w:rPr>
-        <w:t>, có thể bổ sung P2P hỗ trợ (hybrid CDN-P2P):</w:t>
-      </w:r>
-    </w:p>
-    <w:p>
-      <w:pPr>
-        <w:tabs>
-          <w:tab w:pos="454" w:val="left"/>
-        </w:tabs>
-        <w:spacing w:after="40"/>
-        <w:ind w:left="454" w:hanging="283"/>
-      </w:pPr>
-      <w:r>
-        <w:rPr>
-          <w:b w:val="0"/>
-          <w:i w:val="0"/>
-        </w:rPr>
-        <w:t>•</w:t>
-        <w:tab/>
-      </w:r>
-      <w:r>
-        <w:rPr>
-          <w:b/>
-          <w:i w:val="0"/>
-        </w:rPr>
-        <w:t>Máy chủ gốc (origin):</w:t>
-      </w:r>
-      <w:r>
-        <w:rPr>
-          <w:b w:val="0"/>
-          <w:i w:val="0"/>
-        </w:rPr>
-        <w:t xml:space="preserve"> nhận luồng từ encoder (RTMP/SRT), dùng FFmpeg chuyển mã thành nhiều mức chất lượng (1080p/720p/480p/360p) và cắt thành các đoạn 2–6 giây kèm playlist (.m3u8 hoặc .mpd).</w:t>
-      </w:r>
-    </w:p>
-    <w:p>
-      <w:pPr>
-        <w:tabs>
-          <w:tab w:pos="454" w:val="left"/>
-        </w:tabs>
-        <w:spacing w:after="40"/>
-        <w:ind w:left="454" w:hanging="283"/>
-      </w:pPr>
-      <w:r>
-        <w:rPr>
-          <w:b w:val="0"/>
-          <w:i w:val="0"/>
-        </w:rPr>
-        <w:t>•</w:t>
-        <w:tab/>
-      </w:r>
-      <w:r>
-        <w:rPr>
-          <w:b/>
-          <w:i w:val="0"/>
-        </w:rPr>
-        <w:t>CDN:</w:t>
-      </w:r>
-      <w:r>
-        <w:rPr>
-          <w:b w:val="0"/>
-          <w:i w:val="0"/>
-        </w:rPr>
-        <w:t xml:space="preserve"> các máy chủ biên (edge) cache các đoạn video; người dùng tải từ edge gần nhất → nguồn chỉ phải phục vụ vài edge, giống “nhân bản trong mạng” của multicast nhưng thực hiện ở tầng ứng dụng trên hạ tầng Internet hiện có.</w:t>
-      </w:r>
-    </w:p>
-    <w:p>
-      <w:pPr>
-        <w:tabs>
-          <w:tab w:pos="454" w:val="left"/>
-        </w:tabs>
-        <w:spacing w:after="40"/>
-        <w:ind w:left="454" w:hanging="283"/>
-      </w:pPr>
-      <w:r>
-        <w:rPr>
-          <w:b w:val="0"/>
-          <w:i w:val="0"/>
-        </w:rPr>
-        <w:t>•</w:t>
-        <w:tab/>
-      </w:r>
-      <w:r>
-        <w:rPr>
-          <w:b/>
-          <w:i w:val="0"/>
-        </w:rPr>
-        <w:t>Trình phát (hls.js, dash.js, ExoPlayer, AVPlayer):</w:t>
-      </w:r>
-      <w:r>
-        <w:rPr>
-          <w:b w:val="0"/>
-          <w:i w:val="0"/>
-        </w:rPr>
-        <w:t xml:space="preserve"> tự chọn bitrate theo băng thông thực tế (ABR), có bộ đệm nên chịu được dao động mạng; mất gói đã được TCP/QUIC xử lý.</w:t>
-      </w:r>
-    </w:p>
-    <w:p>
-      <w:pPr>
-        <w:tabs>
-          <w:tab w:pos="454" w:val="left"/>
-        </w:tabs>
-        <w:spacing w:after="40"/>
-        <w:ind w:left="454" w:hanging="283"/>
-      </w:pPr>
-      <w:r>
-        <w:rPr>
-          <w:b w:val="0"/>
-          <w:i w:val="0"/>
-        </w:rPr>
-        <w:t>•</w:t>
-        <w:tab/>
-      </w:r>
-      <w:r>
-        <w:rPr>
-          <w:b/>
-          <w:i w:val="0"/>
-        </w:rPr>
-        <w:t>Tuỳ chọn:</w:t>
-      </w:r>
-      <w:r>
-        <w:rPr>
-          <w:b w:val="0"/>
-          <w:i w:val="0"/>
-        </w:rPr>
-        <w:t xml:space="preserve"> cần độ trễ thấp thì dùng LL-HLS/CMAF; cần tương tác thời gian thực (hỏi đáp) thì kết hợp WebRTC qua SFU cho nhóm nhỏ; muốn giảm chi phí CDN thì thêm lớp P2P giữa các người xem. Trong mạng nội bộ có hỗ trợ (ví dụ mạng trường, khách sạn) vẫn có thể dùng IP multicast cho chặng cuối.</w:t>
-      </w:r>
-    </w:p>
-    <w:p>
-      <w:r>
-        <w:rPr>
-          <w:b/>
-          <w:i w:val="0"/>
-        </w:rPr>
         <w:t>Lý do chọn:</w:t>
       </w:r>
       <w:r>
@@ -3633,7 +886,7 @@
           <w:b w:val="0"/>
           <w:i w:val="0"/>
         </w:rPr>
-        <w:t xml:space="preserve"> không cần thay đổi router, switch hay thiết bị người dùng (chỉ cần trình duyệt), vượt được NAT/tường lửa vì dùng cổng 80/443, mở rộng gần như vô hạn bằng cách thuê thêm năng lực CDN, chi phí triển khai thấp và là chuẩn mà YouTube, Netflix, Twitch đang dùng. Đây là giải pháp tối ưu với ít can thiệp nhất vào hạ tầng hiện có.</w:t>
+        <w:t xml:space="preserve"> chạy trên hạ tầng Internet sẵn có, không phải sửa router hay thiết bị người dùng, xem được ngay trên trình duyệt và dễ mở rộng (YouTube, Netflix đều dùng cách này).</w:t>
       </w:r>
     </w:p>
     <w:p>
@@ -3647,16 +900,6 @@
           <w:highlight w:val="yellow"/>
         </w:rPr>
         <w:t>PHẦN 2: BÀI TẬP</w:t>
-      </w:r>
-    </w:p>
-    <w:p>
-      <w:r>
-        <w:rPr>
-          <w:b w:val="0"/>
-          <w:i/>
-          <w:sz w:val="22"/>
-        </w:rPr>
-        <w:t>Mã nguồn: thư mục BaiTap/Bai08_Multicast/src/bai08 (bt01, bt02, bt03). Tất cả dùng nhóm multicast 224.1.1.1, cổng 4444. Biên dịch: javac -encoding UTF-8 -d out $(find src -name "*.java"); chạy: java -cp out &lt;tên lớp&gt;.</w:t>
       </w:r>
     </w:p>
     <w:p>
@@ -3675,41 +918,9 @@
       <w:r>
         <w:rPr>
           <w:b w:val="0"/>
-          <w:i/>
-        </w:rPr>
-        <w:t>Xây dựng chương trình Multicast để gửi và nhận thông điệp trong mạng nội bộ.</w:t>
-      </w:r>
-    </w:p>
-    <w:p>
-      <w:r>
-        <w:rPr>
-          <w:b/>
           <w:i w:val="0"/>
         </w:rPr>
-        <w:t>Cách hoạt động:</w:t>
-      </w:r>
-      <w:r>
-        <w:rPr>
-          <w:b w:val="0"/>
-          <w:i w:val="0"/>
-        </w:rPr>
-        <w:t xml:space="preserve"> MulticastReceiver tạo MulticastSocket(4444), gọi joinGroup(224.1.1.1) rồi chờ receive(). MulticastSender tạo MulticastSocket, đặt TTL = 1 (chỉ trong LAN), gửi chuỗi UTF-8 tới 224.1.1.1:4444. Khi nhận chuỗi “exit”, máy nhận gọi leaveGroup() và đóng socket.</w:t>
-      </w:r>
-    </w:p>
-    <w:p>
-      <w:r>
-        <w:rPr>
-          <w:b/>
-          <w:i w:val="0"/>
-        </w:rPr>
-        <w:t>Thử nghiệm:</w:t>
-      </w:r>
-      <w:r>
-        <w:rPr>
-          <w:b w:val="0"/>
-          <w:i w:val="0"/>
-        </w:rPr>
-        <w:t xml:space="preserve"> mở 3 cửa sổ MulticastReceiver trước, sau đó chạy MulticastSender 3 lần.</w:t>
+        <w:t>Chạy 3 MulticastReceiver trước, sau đó chạy MulticastSender gửi tin vào nhóm 224.1.1.1:4444.</w:t>
       </w:r>
     </w:p>
     <w:p>
@@ -3763,7 +974,7 @@
           <w:i/>
           <w:sz w:val="22"/>
         </w:rPr>
-        <w:t>Hình 1. BT01 – Bước 1: ba máy nhận tham gia nhóm và chờ thông điệp</w:t>
+        <w:t>Hình 1. Ba máy nhận vào nhóm và chờ tin</w:t>
       </w:r>
     </w:p>
     <w:p>
@@ -3781,25 +992,7 @@
         </w:rPr>
         <w:t>•</w:t>
         <w:tab/>
-        <w:t>Cả 3 MulticastReceiver cùng bind cổng 4444 trên một máy mà không báo lỗi “Address already in use”, vì MulticastSocket bật SO_REUSEADDR mặc định.</w:t>
-      </w:r>
-    </w:p>
-    <w:p>
-      <w:pPr>
-        <w:tabs>
-          <w:tab w:pos="454" w:val="left"/>
-        </w:tabs>
-        <w:spacing w:after="40"/>
-        <w:ind w:left="454" w:hanging="283"/>
-      </w:pPr>
-      <w:r>
-        <w:rPr>
-          <w:b w:val="0"/>
-          <w:i w:val="0"/>
-        </w:rPr>
-        <w:t>•</w:t>
-        <w:tab/>
-        <w:t>Dòng “Da tham gia nhom 224.1.1.1:4444” cho biết joinGroup() đã thành công; chương trình dừng ở receive() để chờ gói tin.</w:t>
+        <w:t>Ba máy nhận đã tham gia nhóm và đang chờ tin.</w:t>
       </w:r>
     </w:p>
     <w:p>
@@ -3858,7 +1051,7 @@
           <w:i/>
           <w:sz w:val="22"/>
         </w:rPr>
-        <w:t>Hình 2. BT01 – Bước 2: máy gửi phát 3 thông điệp vào nhóm</w:t>
+        <w:t>Hình 2. Máy gửi gửi 3 tin</w:t>
       </w:r>
     </w:p>
     <w:p>
@@ -3876,75 +1069,7 @@
         </w:rPr>
         <w:t>•</w:t>
         <w:tab/>
-        <w:t>Lần 1 không truyền tham số nên gửi nội dung mặc định “Xin chào!”.</w:t>
-      </w:r>
-    </w:p>
-    <w:p>
-      <w:pPr>
-        <w:tabs>
-          <w:tab w:pos="454" w:val="left"/>
-        </w:tabs>
-        <w:spacing w:after="40"/>
-        <w:ind w:left="454" w:hanging="283"/>
-      </w:pPr>
-      <w:r>
-        <w:rPr>
-          <w:b w:val="0"/>
-          <w:i w:val="0"/>
-        </w:rPr>
-        <w:t>•</w:t>
-        <w:tab/>
-        <w:t>Lần 2 gửi chuỗi tiếng Việt có dấu “Lập trình mạng - Bài 08” để kiểm tra mã hoá UTF-8.</w:t>
-      </w:r>
-    </w:p>
-    <w:p>
-      <w:pPr>
-        <w:tabs>
-          <w:tab w:pos="454" w:val="left"/>
-        </w:tabs>
-        <w:spacing w:after="40"/>
-        <w:ind w:left="454" w:hanging="283"/>
-      </w:pPr>
-      <w:r>
-        <w:rPr>
-          <w:b w:val="0"/>
-          <w:i w:val="0"/>
-        </w:rPr>
-        <w:t>•</w:t>
-        <w:tab/>
-        <w:t>Lần 3 gửi “exit” để yêu cầu các máy nhận rời nhóm.</w:t>
-      </w:r>
-    </w:p>
-    <w:p>
-      <w:pPr>
-        <w:tabs>
-          <w:tab w:pos="454" w:val="left"/>
-        </w:tabs>
-        <w:spacing w:after="40"/>
-        <w:ind w:left="454" w:hanging="283"/>
-      </w:pPr>
-      <w:r>
-        <w:rPr>
-          <w:b w:val="0"/>
-          <w:i w:val="0"/>
-        </w:rPr>
-        <w:t>•</w:t>
-        <w:tab/>
-        <w:t xml:space="preserve">Máy gửi chỉ gửi </w:t>
-      </w:r>
-      <w:r>
-        <w:rPr>
-          <w:b/>
-          <w:i w:val="0"/>
-        </w:rPr>
-        <w:t>một</w:t>
-      </w:r>
-      <w:r>
-        <w:rPr>
-          <w:b w:val="0"/>
-          <w:i w:val="0"/>
-        </w:rPr>
-        <w:t xml:space="preserve"> gói cho mỗi thông điệp, không cần biết có bao nhiêu máy nhận.</w:t>
+        <w:t>Máy gửi gửi lần lượt “Xin chào!”, một câu tiếng Việt và “exit”.</w:t>
       </w:r>
     </w:p>
     <w:p>
@@ -4003,7 +1128,7 @@
           <w:i/>
           <w:sz w:val="22"/>
         </w:rPr>
-        <w:t>Hình 3. BT01 – Bước 3: cả ba máy nhận đều nhận đủ thông điệp rồi rời nhóm</w:t>
+        <w:t>Hình 3. Ba máy nhận đều nhận được tin</w:t>
       </w:r>
     </w:p>
     <w:p>
@@ -4021,74 +1146,7 @@
         </w:rPr>
         <w:t>•</w:t>
         <w:tab/>
-        <w:t>Mỗi máy nhận in đủ 3 thông điệp, đúng nội dung và thứ tự. Tiếng Việt hiển thị đúng vì cả hai bên dùng UTF-8.</w:t>
-      </w:r>
-    </w:p>
-    <w:p>
-      <w:pPr>
-        <w:tabs>
-          <w:tab w:pos="454" w:val="left"/>
-        </w:tabs>
-        <w:spacing w:after="40"/>
-        <w:ind w:left="454" w:hanging="283"/>
-      </w:pPr>
-      <w:r>
-        <w:rPr>
-          <w:b w:val="0"/>
-          <w:i w:val="0"/>
-        </w:rPr>
-        <w:t>•</w:t>
-        <w:tab/>
-        <w:t>Địa chỉ 192.0.2.2 và cổng nguồn (60285, 53829, 54026) lấy từ packet.getAddress()/getPort(). Mỗi lần chạy, Sender dùng một cổng nguồn ngẫu nhiên khác nhau.</w:t>
-      </w:r>
-    </w:p>
-    <w:p>
-      <w:pPr>
-        <w:tabs>
-          <w:tab w:pos="454" w:val="left"/>
-        </w:tabs>
-        <w:spacing w:after="40"/>
-        <w:ind w:left="454" w:hanging="283"/>
-      </w:pPr>
-      <w:r>
-        <w:rPr>
-          <w:b w:val="0"/>
-          <w:i w:val="0"/>
-        </w:rPr>
-        <w:t>•</w:t>
-        <w:tab/>
-        <w:t>Khi nhận “exit”, chương trình gọi leaveGroup() và in “Da roi nhom 224.1.1.1. Ket thuc.”.</w:t>
-      </w:r>
-    </w:p>
-    <w:p>
-      <w:pPr>
-        <w:tabs>
-          <w:tab w:pos="454" w:val="left"/>
-        </w:tabs>
-        <w:spacing w:after="40"/>
-        <w:ind w:left="454" w:hanging="283"/>
-      </w:pPr>
-      <w:r>
-        <w:rPr>
-          <w:b w:val="0"/>
-          <w:i w:val="0"/>
-        </w:rPr>
-        <w:t>•</w:t>
-        <w:tab/>
-      </w:r>
-      <w:r>
-        <w:rPr>
-          <w:b/>
-          <w:i w:val="0"/>
-        </w:rPr>
-        <w:t>Kết luận:</w:t>
-      </w:r>
-      <w:r>
-        <w:rPr>
-          <w:b w:val="0"/>
-          <w:i w:val="0"/>
-        </w:rPr>
-        <w:t xml:space="preserve"> một lần gửi, nhiều máy cùng nhận; đáp ứng đủ yêu cầu của bài.</w:t>
+        <w:t>Cả 3 máy đều nhận đủ 3 tin. Khi nhận “exit” thì rời nhóm và thoát.</w:t>
       </w:r>
     </w:p>
     <w:p>
@@ -4112,41 +1170,9 @@
       <w:r>
         <w:rPr>
           <w:b w:val="0"/>
-          <w:i/>
-        </w:rPr>
-        <w:t>Xây dựng ứng dụng Chat nhóm bằng Multicast.</w:t>
-      </w:r>
-    </w:p>
-    <w:p>
-      <w:r>
-        <w:rPr>
-          <w:b/>
           <w:i w:val="0"/>
         </w:rPr>
-        <w:t>Cách hoạt động:</w:t>
-      </w:r>
-      <w:r>
-        <w:rPr>
-          <w:b w:val="0"/>
-          <w:i w:val="0"/>
-        </w:rPr>
-        <w:t xml:space="preserve"> mỗi cửa sổ chat là một thành viên. Mỗi cửa sổ dùng một MulticastSocket đã joinGroup() để vừa gửi vừa nhận. Một luồng riêng lặp receive() để nhận tin, một luồng riêng khác thực hiện send() để giao diện không bị treo. Giao diện được cập nhật qua SwingUtilities.invokeLater(). Mỗi tin nhắn có dạng LOẠI|mãClient|tên|nộiDung (LOẠI là JOIN, MSG hoặc LEAVE).</w:t>
-      </w:r>
-    </w:p>
-    <w:p>
-      <w:r>
-        <w:rPr>
-          <w:b/>
-          <w:i w:val="0"/>
-        </w:rPr>
-        <w:t>Thử nghiệm:</w:t>
-      </w:r>
-      <w:r>
-        <w:rPr>
-          <w:b w:val="0"/>
-          <w:i w:val="0"/>
-        </w:rPr>
-        <w:t xml:space="preserve"> mở 3 cửa sổ với tên Duy, Hùng, Đức trên cùng một máy.</w:t>
+        <w:t>Mở 3 cửa sổ chat (Duy, Hùng, Đức), cùng nhóm 224.1.1.1:4444.</w:t>
       </w:r>
     </w:p>
     <w:p>
@@ -4200,7 +1226,7 @@
           <w:i/>
           <w:sz w:val="22"/>
         </w:rPr>
-        <w:t>Hình 4. BT02 – Bước 1: giao diện khi khởi động</w:t>
+        <w:t>Hình 4. Giao diện chat</w:t>
       </w:r>
     </w:p>
     <w:p>
@@ -4218,39 +1244,7 @@
         </w:rPr>
         <w:t>•</w:t>
         <w:tab/>
-        <w:t>Giao diện theo mẫu đề bài: Group ID (224.1.1.1), Port (4444), Username, nút Send bên trái ô nhập tin, vùng hiển thị nội dung nhóm chat bên dưới.</w:t>
-      </w:r>
-    </w:p>
-    <w:p>
-      <w:pPr>
-        <w:tabs>
-          <w:tab w:pos="454" w:val="left"/>
-        </w:tabs>
-        <w:spacing w:after="40"/>
-        <w:ind w:left="454" w:hanging="283"/>
-      </w:pPr>
-      <w:r>
-        <w:rPr>
-          <w:b w:val="0"/>
-          <w:i w:val="0"/>
-        </w:rPr>
-        <w:t>•</w:t>
-        <w:tab/>
-        <w:t xml:space="preserve">Có thêm nút </w:t>
-      </w:r>
-      <w:r>
-        <w:rPr>
-          <w:b/>
-          <w:i w:val="0"/>
-        </w:rPr>
-        <w:t>Tham gia</w:t>
-      </w:r>
-      <w:r>
-        <w:rPr>
-          <w:b w:val="0"/>
-          <w:i w:val="0"/>
-        </w:rPr>
-        <w:t xml:space="preserve"> để chọn nhóm và cổng trước khi chat. Nút Send bị khoá cho đến khi tham gia nhóm.</w:t>
+        <w:t>Nhập Group ID, Port, Username rồi bấm “Tham gia” để vào nhóm.</w:t>
       </w:r>
     </w:p>
     <w:p>
@@ -4309,7 +1303,7 @@
           <w:i/>
           <w:sz w:val="22"/>
         </w:rPr>
-        <w:t>Hình 5. BT02 – Bước 2: ba thành viên lần lượt tham gia nhóm</w:t>
+        <w:t>Hình 5. Ba người vào nhóm</w:t>
       </w:r>
     </w:p>
     <w:p>
@@ -4327,43 +1321,7 @@
         </w:rPr>
         <w:t>•</w:t>
         <w:tab/>
-        <w:t>Khi bấm Tham gia, chương trình gọi joinGroup() và gửi gói JOIN vào nhóm. Các ô Group ID, Port, Username bị khoá, nút đổi thành “Rời nhóm”.</w:t>
-      </w:r>
-    </w:p>
-    <w:p>
-      <w:pPr>
-        <w:tabs>
-          <w:tab w:pos="454" w:val="left"/>
-        </w:tabs>
-        <w:spacing w:after="40"/>
-        <w:ind w:left="454" w:hanging="283"/>
-      </w:pPr>
-      <w:r>
-        <w:rPr>
-          <w:b w:val="0"/>
-          <w:i w:val="0"/>
-        </w:rPr>
-        <w:t>•</w:t>
-        <w:tab/>
-        <w:t>Cửa sổ của Duy (vào đầu tiên) thấy thông báo Hùng và Đức tham gia. Cửa sổ của Đức (vào cuối) chỉ thấy tin từ lúc mình tham gia: multicast không lưu tin cũ, đúng với lý thuyết.</w:t>
-      </w:r>
-    </w:p>
-    <w:p>
-      <w:pPr>
-        <w:tabs>
-          <w:tab w:pos="454" w:val="left"/>
-        </w:tabs>
-        <w:spacing w:after="40"/>
-        <w:ind w:left="454" w:hanging="283"/>
-      </w:pPr>
-      <w:r>
-        <w:rPr>
-          <w:b w:val="0"/>
-          <w:i w:val="0"/>
-        </w:rPr>
-        <w:t>•</w:t>
-        <w:tab/>
-        <w:t>Dòng có chữ “(bạn)” là tin của chính mình, nhận lại nhờ bật IP_MULTICAST_LOOP. Mã client ngẫu nhiên giúp phân biệt 3 cửa sổ dù cùng một máy.</w:t>
+        <w:t>Khi có người vào nhóm, các cửa sổ khác đều nhận được thông báo.</w:t>
       </w:r>
     </w:p>
     <w:p>
@@ -4422,7 +1380,7 @@
           <w:i/>
           <w:sz w:val="22"/>
         </w:rPr>
-        <w:t>Hình 6. BT02 – Bước 3: các thành viên chat với nhau</w:t>
+        <w:t>Hình 6. Chat nhóm</w:t>
       </w:r>
     </w:p>
     <w:p>
@@ -4440,57 +1398,7 @@
         </w:rPr>
         <w:t>•</w:t>
         <w:tab/>
-        <w:t xml:space="preserve">Tin nhắn của Duy, Hùng, Đức hiển thị ở </w:t>
-      </w:r>
-      <w:r>
-        <w:rPr>
-          <w:b/>
-          <w:i w:val="0"/>
-        </w:rPr>
-        <w:t>cả 3 cửa sổ</w:t>
-      </w:r>
-      <w:r>
-        <w:rPr>
-          <w:b w:val="0"/>
-          <w:i w:val="0"/>
-        </w:rPr>
-        <w:t>, kèm giờ nhận và tên người gửi.</w:t>
-      </w:r>
-    </w:p>
-    <w:p>
-      <w:pPr>
-        <w:tabs>
-          <w:tab w:pos="454" w:val="left"/>
-        </w:tabs>
-        <w:spacing w:after="40"/>
-        <w:ind w:left="454" w:hanging="283"/>
-      </w:pPr>
-      <w:r>
-        <w:rPr>
-          <w:b w:val="0"/>
-          <w:i w:val="0"/>
-        </w:rPr>
-        <w:t>•</w:t>
-        <w:tab/>
-        <w:t>Tin cuối chứa ký tự “|” (trùng ký tự phân tách của giao thức) vẫn hiển thị đúng, vì chương trình chỉ tách 4 phần đầu (split("\\|", 4)).</w:t>
-      </w:r>
-    </w:p>
-    <w:p>
-      <w:pPr>
-        <w:tabs>
-          <w:tab w:pos="454" w:val="left"/>
-        </w:tabs>
-        <w:spacing w:after="40"/>
-        <w:ind w:left="454" w:hanging="283"/>
-      </w:pPr>
-      <w:r>
-        <w:rPr>
-          <w:b w:val="0"/>
-          <w:i w:val="0"/>
-        </w:rPr>
-        <w:t>•</w:t>
-        <w:tab/>
-        <w:t>Cửa sổ của Đức đang soạn “Đang soạn tin...” mà vẫn nhận tin mới: gửi và nhận chạy song song, không chặn nhau.</w:t>
+        <w:t>Tin nhắn của một người hiện ở cả 3 cửa sổ.</w:t>
       </w:r>
     </w:p>
     <w:p>
@@ -4549,7 +1457,7 @@
           <w:i/>
           <w:sz w:val="22"/>
         </w:rPr>
-        <w:t>Hình 7. BT02 – Bước 4: một thành viên rời nhóm</w:t>
+        <w:t>Hình 7. Một người rời nhóm</w:t>
       </w:r>
     </w:p>
     <w:p>
@@ -4567,74 +1475,7 @@
         </w:rPr>
         <w:t>•</w:t>
         <w:tab/>
-        <w:t>Đức bấm “Rời nhóm”: chương trình gửi gói LEAVE, gọi leaveGroup() rồi close(). Duy và Hùng nhận thông báo “Đức đã rời nhóm”.</w:t>
-      </w:r>
-    </w:p>
-    <w:p>
-      <w:pPr>
-        <w:tabs>
-          <w:tab w:pos="454" w:val="left"/>
-        </w:tabs>
-        <w:spacing w:after="40"/>
-        <w:ind w:left="454" w:hanging="283"/>
-      </w:pPr>
-      <w:r>
-        <w:rPr>
-          <w:b w:val="0"/>
-          <w:i w:val="0"/>
-        </w:rPr>
-        <w:t>•</w:t>
-        <w:tab/>
-        <w:t>Tin Duy gửi sau đó (“Đức vừa rời nhóm…”) chỉ xuất hiện ở cửa sổ Duy và Hùng; cửa sổ của Đức không nhận được nữa.</w:t>
-      </w:r>
-    </w:p>
-    <w:p>
-      <w:pPr>
-        <w:tabs>
-          <w:tab w:pos="454" w:val="left"/>
-        </w:tabs>
-        <w:spacing w:after="40"/>
-        <w:ind w:left="454" w:hanging="283"/>
-      </w:pPr>
-      <w:r>
-        <w:rPr>
-          <w:b w:val="0"/>
-          <w:i w:val="0"/>
-        </w:rPr>
-        <w:t>•</w:t>
-        <w:tab/>
-        <w:t>Cửa sổ của Đức mở lại các ô nhập và nút “Tham gia”, có thể tham gia lại nhóm khác.</w:t>
-      </w:r>
-    </w:p>
-    <w:p>
-      <w:pPr>
-        <w:tabs>
-          <w:tab w:pos="454" w:val="left"/>
-        </w:tabs>
-        <w:spacing w:after="40"/>
-        <w:ind w:left="454" w:hanging="283"/>
-      </w:pPr>
-      <w:r>
-        <w:rPr>
-          <w:b w:val="0"/>
-          <w:i w:val="0"/>
-        </w:rPr>
-        <w:t>•</w:t>
-        <w:tab/>
-      </w:r>
-      <w:r>
-        <w:rPr>
-          <w:b/>
-          <w:i w:val="0"/>
-        </w:rPr>
-        <w:t>Kết luận:</w:t>
-      </w:r>
-      <w:r>
-        <w:rPr>
-          <w:b w:val="0"/>
-          <w:i w:val="0"/>
-        </w:rPr>
-        <w:t xml:space="preserve"> nhiều máy gửi và nhận đồng thời trong cùng một nhóm; tham gia và rời nhóm đều hoạt động đúng.</w:t>
+        <w:t>Đức rời nhóm nên không nhận được tin gửi sau đó nữa.</w:t>
       </w:r>
     </w:p>
     <w:p>
@@ -4658,155 +1499,9 @@
       <w:r>
         <w:rPr>
           <w:b w:val="0"/>
-          <w:i/>
-        </w:rPr>
-        <w:t>Phân phối file đồng thời qua Multicast.</w:t>
-      </w:r>
-    </w:p>
-    <w:p>
-      <w:r>
-        <w:rPr>
-          <w:b/>
           <w:i w:val="0"/>
         </w:rPr>
-        <w:t>Cách hoạt động:</w:t>
-      </w:r>
-    </w:p>
-    <w:p>
-      <w:pPr>
-        <w:tabs>
-          <w:tab w:pos="454" w:val="left"/>
-        </w:tabs>
-        <w:spacing w:after="40"/>
-        <w:ind w:left="454" w:hanging="283"/>
-      </w:pPr>
-      <w:r>
-        <w:rPr>
-          <w:b w:val="0"/>
-          <w:i w:val="0"/>
-        </w:rPr>
-        <w:t>•</w:t>
-        <w:tab/>
-      </w:r>
-      <w:r>
-        <w:rPr>
-          <w:b/>
-          <w:i w:val="0"/>
-        </w:rPr>
-        <w:t>Chia file:</w:t>
-      </w:r>
-      <w:r>
-        <w:rPr>
-          <w:b w:val="0"/>
-          <w:i w:val="0"/>
-        </w:rPr>
-        <w:t xml:space="preserve"> FileSender chia file thành các gói 1024 byte và đánh số thứ tự (seq) từ 0. Mỗi gói DATA mang seq, offset, CRC32 và dữ liệu. Trước đó gửi gói META chứa tên file, kích thước, số gói và mã SHA-256 của file; gửi xong thì phát gói END.</w:t>
-      </w:r>
-    </w:p>
-    <w:p>
-      <w:pPr>
-        <w:tabs>
-          <w:tab w:pos="454" w:val="left"/>
-        </w:tabs>
-        <w:spacing w:after="40"/>
-        <w:ind w:left="454" w:hanging="283"/>
-      </w:pPr>
-      <w:r>
-        <w:rPr>
-          <w:b w:val="0"/>
-          <w:i w:val="0"/>
-        </w:rPr>
-        <w:t>•</w:t>
-        <w:tab/>
-      </w:r>
-      <w:r>
-        <w:rPr>
-          <w:b/>
-          <w:i w:val="0"/>
-        </w:rPr>
-        <w:t>Kiểm soát thứ tự và tái cấu trúc:</w:t>
-      </w:r>
-      <w:r>
-        <w:rPr>
-          <w:b w:val="0"/>
-          <w:i w:val="0"/>
-        </w:rPr>
-        <w:t xml:space="preserve"> FileReceiver ghi mỗi gói vào đúng vị trí offset bằng RandomAccessFile, nên gói đến lộn xộn vẫn vào đúng chỗ. Một BitSet đánh dấu gói đã nhận để bỏ gói trùng. Đủ gói thì kiểm tra SHA-256 rồi lưu file với tên gốc.</w:t>
-      </w:r>
-    </w:p>
-    <w:p>
-      <w:pPr>
-        <w:tabs>
-          <w:tab w:pos="454" w:val="left"/>
-        </w:tabs>
-        <w:spacing w:after="40"/>
-        <w:ind w:left="454" w:hanging="283"/>
-      </w:pPr>
-      <w:r>
-        <w:rPr>
-          <w:b w:val="0"/>
-          <w:i w:val="0"/>
-        </w:rPr>
-        <w:t>•</w:t>
-        <w:tab/>
-      </w:r>
-      <w:r>
-        <w:rPr>
-          <w:b/>
-          <w:i w:val="0"/>
-        </w:rPr>
-        <w:t>Xử lý mất gói:</w:t>
-      </w:r>
-      <w:r>
-        <w:rPr>
-          <w:b w:val="0"/>
-          <w:i w:val="0"/>
-        </w:rPr>
-        <w:t xml:space="preserve"> khi nhận END mà còn thiếu gói, máy nhận gửi </w:t>
-      </w:r>
-      <w:r>
-        <w:rPr>
-          <w:b/>
-          <w:i w:val="0"/>
-        </w:rPr>
-        <w:t>NACK</w:t>
-      </w:r>
-      <w:r>
-        <w:rPr>
-          <w:b w:val="0"/>
-          <w:i w:val="0"/>
-        </w:rPr>
-        <w:t xml:space="preserve"> (danh sách số thứ tự còn thiếu) về cổng 4445 của máy gửi. Máy gửi phát lại các gói đó qua multicast. Lặp lại cho đến khi đủ; máy nhận xong thì gửi </w:t>
-      </w:r>
-      <w:r>
-        <w:rPr>
-          <w:b/>
-          <w:i w:val="0"/>
-        </w:rPr>
-        <w:t>DONE</w:t>
-      </w:r>
-      <w:r>
-        <w:rPr>
-          <w:b w:val="0"/>
-          <w:i w:val="0"/>
-        </w:rPr>
-        <w:t>.</w:t>
-      </w:r>
-    </w:p>
-    <w:p>
-      <w:r>
-        <w:rPr>
-          <w:b/>
-          <w:i w:val="0"/>
-        </w:rPr>
-        <w:t>Thử nghiệm:</w:t>
-      </w:r>
-      <w:r>
-        <w:rPr>
-          <w:b w:val="0"/>
-          <w:i w:val="0"/>
-        </w:rPr>
-        <w:t xml:space="preserve"> gửi file baocao_demo.pdf (3.000.000 byte, 2930 gói) cùng lúc cho 3 máy nhận. Để kiểm tra cơ chế xử lý mất gói, máy nhan2 được cho bỏ ngẫu nhiên 10% gói và máy nhan3 bỏ 30%. Lệnh chạy: java bai08.bt03.FileReceiver nhan1 0 (tương tự nhan2 0.1, nhan3 0.3), sau đó java bai08.bt03.FileSender baocao_demo.pdf 3.</w:t>
+        <w:t>Máy gửi chia file thành các gói nhỏ có đánh số thứ tự và gửi vào nhóm. Máy nhận ghép các gói lại theo số thứ tự; gói nào bị mất thì xin máy gửi gửi lại. Thử nghiệm: gửi 1 file 3MB cho 3 máy nhận, trong đó 2 máy được cố ý cho mất 10% và 30% số gói.</w:t>
       </w:r>
     </w:p>
     <w:p>
@@ -4860,7 +1555,7 @@
           <w:i/>
           <w:sz w:val="22"/>
         </w:rPr>
-        <w:t>Hình 8. BT03 – Máy gửi</w:t>
+        <w:t>Hình 8. Máy gửi</w:t>
       </w:r>
     </w:p>
     <w:p>
@@ -4878,79 +1573,7 @@
         </w:rPr>
         <w:t>•</w:t>
         <w:tab/>
-        <w:t>Dòng đầu: file được chia thành 2930 gói × 1024 byte; mã SHA-256 này được gửi kèm trong META để máy nhận kiểm tra.</w:t>
-      </w:r>
-    </w:p>
-    <w:p>
-      <w:pPr>
-        <w:tabs>
-          <w:tab w:pos="454" w:val="left"/>
-        </w:tabs>
-        <w:spacing w:after="40"/>
-        <w:ind w:left="454" w:hanging="283"/>
-      </w:pPr>
-      <w:r>
-        <w:rPr>
-          <w:b w:val="0"/>
-          <w:i w:val="0"/>
-        </w:rPr>
-        <w:t>•</w:t>
-        <w:tab/>
-        <w:t>Lượt gửi đầu hết 537 ms, sau đó chuyển sang giai đoạn xử lý mất gói.</w:t>
-      </w:r>
-    </w:p>
-    <w:p>
-      <w:pPr>
-        <w:tabs>
-          <w:tab w:pos="454" w:val="left"/>
-        </w:tabs>
-        <w:spacing w:after="40"/>
-        <w:ind w:left="454" w:hanging="283"/>
-      </w:pPr>
-      <w:r>
-        <w:rPr>
-          <w:b w:val="0"/>
-          <w:i w:val="0"/>
-        </w:rPr>
-        <w:t>•</w:t>
-        <w:tab/>
-        <w:t>Các dòng NACK màu cam: máy nhận #1643017811 (nhan2) và #791661001 (nhan3) xin gửi lại các gói bị mất. Số gói xin giảm dần qua từng vòng (256 → 52 → 3 → 1).</w:t>
-      </w:r>
-    </w:p>
-    <w:p>
-      <w:pPr>
-        <w:tabs>
-          <w:tab w:pos="454" w:val="left"/>
-        </w:tabs>
-        <w:spacing w:after="40"/>
-        <w:ind w:left="454" w:hanging="283"/>
-      </w:pPr>
-      <w:r>
-        <w:rPr>
-          <w:b w:val="0"/>
-          <w:i w:val="0"/>
-        </w:rPr>
-        <w:t>•</w:t>
-        <w:tab/>
-        <w:t>“xin 30 goi, gui lai 0 goi”: các gói này vừa được gửi lại trong vòng 100 ms trước nên không gửi trùng lần nữa.</w:t>
-      </w:r>
-    </w:p>
-    <w:p>
-      <w:pPr>
-        <w:tabs>
-          <w:tab w:pos="454" w:val="left"/>
-        </w:tabs>
-        <w:spacing w:after="40"/>
-        <w:ind w:left="454" w:hanging="283"/>
-      </w:pPr>
-      <w:r>
-        <w:rPr>
-          <w:b w:val="0"/>
-          <w:i w:val="0"/>
-        </w:rPr>
-        <w:t>•</w:t>
-        <w:tab/>
-        <w:t>Cả 3 máy lần lượt báo DONE (1/3, 2/3, 3/3). Tổng cộng gửi lại 1456 gói; máy gửi kết thúc khi đủ 3 máy nhận.</w:t>
+        <w:t>Máy gửi chia file thành 2930 gói và gửi đi, sau đó gửi lại các gói mà máy nhận báo bị mất. Kết thúc khi cả 3 máy nhận đủ.</w:t>
       </w:r>
     </w:p>
     <w:p>
@@ -5009,7 +1632,7 @@
           <w:i/>
           <w:sz w:val="22"/>
         </w:rPr>
-        <w:t>Hình 9. BT03 – Máy nhận nhan1 (không mất gói)</w:t>
+        <w:t>Hình 9. Máy nhận 1 (không mất gói)</w:t>
       </w:r>
     </w:p>
     <w:p>
@@ -5027,25 +1650,7 @@
         </w:rPr>
         <w:t>•</w:t>
         <w:tab/>
-        <w:t>Máy nhận nhận META (tên file, kích thước, số gói, SHA-256), rồi hiển thị tiến độ từ 0% đến 100%.</w:t>
-      </w:r>
-    </w:p>
-    <w:p>
-      <w:pPr>
-        <w:tabs>
-          <w:tab w:pos="454" w:val="left"/>
-        </w:tabs>
-        <w:spacing w:after="40"/>
-        <w:ind w:left="454" w:hanging="283"/>
-      </w:pPr>
-      <w:r>
-        <w:rPr>
-          <w:b w:val="0"/>
-          <w:i w:val="0"/>
-        </w:rPr>
-        <w:t>•</w:t>
-        <w:tab/>
-        <w:t>Nhận đủ 2930 gói ngay trong lượt gửi đầu (585 ms), không phải gửi NACK nào. SHA-256 khớp, file được lưu tại nhan1/baocao_demo.pdf.</w:t>
+        <w:t>Nhận đủ file ngay lần gửi đầu.</w:t>
       </w:r>
     </w:p>
     <w:p>
@@ -5104,7 +1709,7 @@
           <w:i/>
           <w:sz w:val="22"/>
         </w:rPr>
-        <w:t>Hình 10. BT03 – Máy nhận nhan2 (giả lập mất 10% gói)</w:t>
+        <w:t>Hình 10. Máy nhận 2 (mất 10% gói)</w:t>
       </w:r>
     </w:p>
     <w:p>
@@ -5122,25 +1727,7 @@
         </w:rPr>
         <w:t>•</w:t>
         <w:tab/>
-        <w:t>Khi nhận END mới có 2644/2930 gói, còn thiếu 286 gói. Máy nhận gửi NACK và số gói thiếu giảm dần: 286 → 52 → 3 → 1 → đủ.</w:t>
-      </w:r>
-    </w:p>
-    <w:p>
-      <w:pPr>
-        <w:tabs>
-          <w:tab w:pos="454" w:val="left"/>
-        </w:tabs>
-        <w:spacing w:after="40"/>
-        <w:ind w:left="454" w:hanging="283"/>
-      </w:pPr>
-      <w:r>
-        <w:rPr>
-          <w:b w:val="0"/>
-          <w:i w:val="0"/>
-        </w:rPr>
-        <w:t>•</w:t>
-        <w:tab/>
-        <w:t>Thống kê: bỏ 323 gói (giả lập mất), 1127 gói trùng (gói gửi lại cho máy khác mà mình đã có) đã bị bỏ qua. Hoàn tất sau 2,3 giây, SHA-256 khớp.</w:t>
+        <w:t>Thiếu 286 gói, xin gửi lại vài lần thì nhận đủ.</w:t>
       </w:r>
     </w:p>
     <w:p>
@@ -5199,7 +1786,7 @@
           <w:i/>
           <w:sz w:val="22"/>
         </w:rPr>
-        <w:t>Hình 11. BT03 – Máy nhận nhan3 (giả lập mất 30% gói)</w:t>
+        <w:t>Hình 11. Máy nhận 3 (mất 30% gói)</w:t>
       </w:r>
     </w:p>
     <w:p>
@@ -5217,43 +1804,7 @@
         </w:rPr>
         <w:t>•</w:t>
         <w:tab/>
-        <w:t>Khi nhận END chỉ có 2063/2930 gói, thiếu 867 gói. Sau 6 vòng NACK (867 → 252 → 67 → 19 → 4 → 2) thì nhận đủ.</w:t>
-      </w:r>
-    </w:p>
-    <w:p>
-      <w:pPr>
-        <w:tabs>
-          <w:tab w:pos="454" w:val="left"/>
-        </w:tabs>
-        <w:spacing w:after="40"/>
-        <w:ind w:left="454" w:hanging="283"/>
-      </w:pPr>
-      <w:r>
-        <w:rPr>
-          <w:b w:val="0"/>
-          <w:i w:val="0"/>
-        </w:rPr>
-        <w:t>•</w:t>
-        <w:tab/>
-        <w:t>Dù mất 1216 gói, file vẫn được tái tạo hoàn chỉnh trong 3,5 giây và SHA-256 khớp.</w:t>
-      </w:r>
-    </w:p>
-    <w:p>
-      <w:pPr>
-        <w:tabs>
-          <w:tab w:pos="454" w:val="left"/>
-        </w:tabs>
-        <w:spacing w:after="40"/>
-        <w:ind w:left="454" w:hanging="283"/>
-      </w:pPr>
-      <w:r>
-        <w:rPr>
-          <w:b w:val="0"/>
-          <w:i w:val="0"/>
-        </w:rPr>
-        <w:t>•</w:t>
-        <w:tab/>
-        <w:t>Gói gửi lại đến sau, không theo thứ tự, nhưng vẫn được ghi đúng vị trí nhờ offset, nên file không bị sai lệch.</w:t>
+        <w:t>Thiếu 867 gói, xin gửi lại nhiều lần hơn nhưng vẫn nhận đủ file.</w:t>
       </w:r>
     </w:p>
     <w:p>
@@ -5312,7 +1863,7 @@
           <w:i/>
           <w:sz w:val="22"/>
         </w:rPr>
-        <w:t>Hình 12. BT03 – Kiểm tra file nhận được</w:t>
+        <w:t>Hình 12. Kiểm tra file</w:t>
       </w:r>
     </w:p>
     <w:p>
@@ -5330,38 +1881,7 @@
         </w:rPr>
         <w:t>•</w:t>
         <w:tab/>
-        <w:t>Dùng lệnh sha256sum để so file gốc với 3 file nhận được: cả 4 mã băm giống hệt nhau, tức 3 máy nhận được file chính xác từng byte.</w:t>
-      </w:r>
-    </w:p>
-    <w:p>
-      <w:pPr>
-        <w:tabs>
-          <w:tab w:pos="454" w:val="left"/>
-        </w:tabs>
-        <w:spacing w:after="40"/>
-        <w:ind w:left="454" w:hanging="283"/>
-      </w:pPr>
-      <w:r>
-        <w:rPr>
-          <w:b w:val="0"/>
-          <w:i w:val="0"/>
-        </w:rPr>
-        <w:t>•</w:t>
-        <w:tab/>
-      </w:r>
-      <w:r>
-        <w:rPr>
-          <w:b/>
-          <w:i w:val="0"/>
-        </w:rPr>
-        <w:t>Kết luận:</w:t>
-      </w:r>
-      <w:r>
-        <w:rPr>
-          <w:b w:val="0"/>
-          <w:i w:val="0"/>
-        </w:rPr>
-        <w:t xml:space="preserve"> một máy gửi phân phối file cho nhiều máy cùng lúc. Gói tin được chia nhỏ, đánh số thứ tự, ghép lại đúng và bù đủ khi bị mất. Đã thử thêm file 0 byte và file 5 MB, đều nhận đúng.</w:t>
+        <w:t>Mã SHA-256 của 3 file nhận được giống file gốc, nghĩa là file nhận đúng.</w:t>
       </w:r>
     </w:p>
     <w:p>

</xml_diff>